<commit_message>
actualiza ERS con login registro y carrito
</commit_message>
<xml_diff>
--- a/ERS.docx
+++ b/ERS.docx
@@ -3,321 +3,1650 @@
 <w:document xmlns:wpc="http://schemas.microsoft.com/office/word/2010/wordprocessingCanvas" xmlns:cx="http://schemas.microsoft.com/office/drawing/2014/chartex" xmlns:cx1="http://schemas.microsoft.com/office/drawing/2015/9/8/chartex" xmlns:cx2="http://schemas.microsoft.com/office/drawing/2015/10/21/chartex" xmlns:cx3="http://schemas.microsoft.com/office/drawing/2016/5/9/chartex" xmlns:cx4="http://schemas.microsoft.com/office/drawing/2016/5/10/chartex" xmlns:cx5="http://schemas.microsoft.com/office/drawing/2016/5/11/chartex" xmlns:cx6="http://schemas.microsoft.com/office/drawing/2016/5/12/chartex" xmlns:cx7="http://schemas.microsoft.com/office/drawing/2016/5/13/chartex" xmlns:cx8="http://schemas.microsoft.com/office/drawing/2016/5/14/chartex" xmlns:mc="http://schemas.openxmlformats.org/markup-compatibility/2006" xmlns:aink="http://schemas.microsoft.com/office/drawing/2016/ink" xmlns:am3d="http://schemas.microsoft.com/office/drawing/2017/model3d" xmlns:o="urn:schemas-microsoft-com:office:office" xmlns:oel="http://schemas.microsoft.com/office/2019/extlst" xmlns:r="http://schemas.openxmlformats.org/officeDocument/2006/relationships" xmlns:m="http://schemas.openxmlformats.org/officeDocument/2006/math" xmlns:v="urn:schemas-microsoft-com:vml" xmlns:wp14="http://schemas.microsoft.com/office/word/2010/wordprocessingDrawing" xmlns:wp="http://schemas.openxmlformats.org/drawingml/2006/wordprocessingDrawing" xmlns:w10="urn:schemas-microsoft-com:office:word" xmlns:w="http://schemas.openxmlformats.org/wordprocessingml/2006/main" xmlns:w14="http://schemas.microsoft.com/office/word/2010/wordml" xmlns:w15="http://schemas.microsoft.com/office/word/2012/wordml" xmlns:w16cex="http://schemas.microsoft.com/office/word/2018/wordml/cex" xmlns:w16cid="http://schemas.microsoft.com/office/word/2016/wordml/cid" xmlns:w16="http://schemas.microsoft.com/office/word/2018/wordml" xmlns:w16du="http://schemas.microsoft.com/office/word/2023/wordml/word16du" xmlns:w16sdtdh="http://schemas.microsoft.com/office/word/2020/wordml/sdtdatahash" xmlns:w16sdtfl="http://schemas.microsoft.com/office/word/2024/wordml/sdtformatlock" xmlns:w16se="http://schemas.microsoft.com/office/word/2015/wordml/symex" xmlns:wpg="http://schemas.microsoft.com/office/word/2010/wordprocessingGroup" xmlns:wpi="http://schemas.microsoft.com/office/word/2010/wordprocessingInk" xmlns:wne="http://schemas.microsoft.com/office/word/2006/wordml" xmlns:wps="http://schemas.microsoft.com/office/word/2010/wordprocessingShape" mc:Ignorable="w14 w15 w16se w16cid w16 w16cex w16sdtdh w16sdtfl w16du wp14">
   <w:body>
     <w:p>
+      <w:pPr>
+        <w:pStyle w:val="Ttulo"/>
+        <w:spacing w:after="80"/>
+        <w:jc w:val="center"/>
+      </w:pPr>
+      <w:r>
+        <w:t>ERS Clínica Aura</w:t>
+      </w:r>
+    </w:p>
+    <w:p>
+      <w:pPr>
+        <w:spacing w:after="80"/>
+        <w:jc w:val="center"/>
+      </w:pPr>
       <w:r>
         <w:rPr>
           <w:b/>
-          <w:bCs/>
         </w:rPr>
-        <w:t># ERS - Clínica Aura</w:t>
-      </w:r>
-    </w:p>
-    <w:p/>
-    <w:p>
-      <w:r>
-        <w:rPr>
-          <w:b/>
-          <w:bCs/>
-        </w:rPr>
-        <w:t>## 1. Introducción</w:t>
-      </w:r>
-    </w:p>
-    <w:p/>
-    <w:p>
-      <w:r>
-        <w:rPr>
-          <w:b/>
-          <w:bCs/>
-        </w:rPr>
-        <w:t>### 1.1 Propósito</w:t>
-      </w:r>
-    </w:p>
-    <w:p/>
-    <w:p>
-      <w:r>
-        <w:t>Este documento describe la primera versión del sitio web de Clínica Aura, una clínica ficticia dedicada a la salud dental y la armonización facial.</w:t>
-      </w:r>
-    </w:p>
-    <w:p/>
-    <w:p>
-      <w:r>
-        <w:rPr>
-          <w:b/>
-          <w:bCs/>
-        </w:rPr>
-        <w:t>### 1.2 Alcance</w:t>
-      </w:r>
-    </w:p>
-    <w:p/>
-    <w:p>
-      <w:r>
-        <w:t>El sitio permite conocer la clínica, revisar tratamientos y enviar una solicitud de reserva. En esta versión los datos no se guardan en una base de datos.</w:t>
-      </w:r>
-    </w:p>
-    <w:p/>
-    <w:p>
-      <w:r>
-        <w:rPr>
-          <w:b/>
-          <w:bCs/>
-        </w:rPr>
-        <w:t>### 1.3 Público objetivo</w:t>
-      </w:r>
-    </w:p>
-    <w:p/>
-    <w:p>
-      <w:r>
-        <w:t>Personas mayores de edad que buscan información básica sobre servicios dentales o faciales y desean solicitar una evaluación.</w:t>
-      </w:r>
-    </w:p>
-    <w:p/>
-    <w:p>
-      <w:r>
-        <w:rPr>
-          <w:b/>
-          <w:bCs/>
-        </w:rPr>
-        <w:t>## 2. Requerimientos funcionales</w:t>
-      </w:r>
-    </w:p>
-    <w:p/>
-    <w:p>
-      <w:r>
-        <w:t>|---|---|</w:t>
-      </w:r>
-    </w:p>
-    <w:p>
-      <w:r>
-        <w:t>| RF-01 | El usuario podrá navegar entre Inicio, Servicios y Reserva. |</w:t>
-      </w:r>
-    </w:p>
-    <w:p>
-      <w:r>
-        <w:t>| RF-02 | El usuario podrá revisar tratamientos dentales, estéticos y faciales. |</w:t>
-      </w:r>
-    </w:p>
-    <w:p>
-      <w:r>
-        <w:t>| RF-03 | El usuario podrá ver imágenes relacionadas con los servicios. |</w:t>
-      </w:r>
-    </w:p>
-    <w:p>
-      <w:r>
-        <w:t>| RF-04 | El usuario podrá reproducir un video educativo desde la página de inicio. |</w:t>
-      </w:r>
-    </w:p>
-    <w:p>
-      <w:r>
-        <w:t>| RF-05 | El usuario podrá completar un formulario de reserva. |</w:t>
-      </w:r>
-    </w:p>
-    <w:p>
-      <w:r>
-        <w:lastRenderedPageBreak/>
-        <w:t>| RF-06 | JavaScript validará nombre, RUT, correo y servicio. |</w:t>
-      </w:r>
-    </w:p>
-    <w:p>
-      <w:r>
-        <w:t>| RF-07 | El sistema mostrará mensajes específicos junto a cada campo incorrecto. |</w:t>
-      </w:r>
-    </w:p>
-    <w:p>
-      <w:r>
-        <w:t>| RF-08 | El botón Limpiar eliminará los datos y mensajes del formulario. |</w:t>
-      </w:r>
-    </w:p>
-    <w:p/>
-    <w:p>
-      <w:r>
-        <w:rPr>
-          <w:b/>
-          <w:bCs/>
-        </w:rPr>
-        <w:t>## 3. Requerimientos no funcionales</w:t>
-      </w:r>
-    </w:p>
-    <w:p/>
-    <w:p>
-      <w:r>
-        <w:t>|---|---|</w:t>
-      </w:r>
-    </w:p>
-    <w:p>
-      <w:r>
-        <w:t>| RNF-01 | El sitio utilizará HTML5 semántico. |</w:t>
-      </w:r>
-    </w:p>
-    <w:p>
-      <w:r>
-        <w:t>| RNF-02 | Los estilos estarán en una hoja CSS externa. |</w:t>
-      </w:r>
-    </w:p>
-    <w:p>
-      <w:r>
-        <w:t>| RNF-03 | La programación estará en un archivo JavaScript externo. |</w:t>
-      </w:r>
-    </w:p>
-    <w:p>
-      <w:r>
-        <w:t xml:space="preserve">| RNF-04 | El diseño se adaptará a computadores, </w:t>
-      </w:r>
-      <w:proofErr w:type="spellStart"/>
-      <w:r>
-        <w:t>tablets</w:t>
-      </w:r>
-      <w:proofErr w:type="spellEnd"/>
-      <w:r>
-        <w:t xml:space="preserve"> y celulares. |</w:t>
-      </w:r>
-    </w:p>
-    <w:p>
-      <w:r>
-        <w:t>| RNF-05 | Las imágenes tendrán texto alternativo y el formulario tendrá etiquetas asociadas. |</w:t>
-      </w:r>
-    </w:p>
-    <w:p>
-      <w:r>
-        <w:t>| RNF-06 | El proyecto podrá ejecutarse localmente mediante Apache en XAMPP. |</w:t>
-      </w:r>
-    </w:p>
-    <w:p/>
-    <w:p>
-      <w:r>
-        <w:rPr>
-          <w:b/>
-          <w:bCs/>
-        </w:rPr>
-        <w:t>## 4. Herramientas y tecnologías</w:t>
-      </w:r>
-    </w:p>
-    <w:p/>
-    <w:p>
-      <w:r>
-        <w:t>- Visual Studio Code para editar el proyecto.</w:t>
-      </w:r>
-    </w:p>
-    <w:p>
-      <w:r>
-        <w:t>- HTML5 para la estructura y el contenido.</w:t>
-      </w:r>
-    </w:p>
-    <w:p>
-      <w:r>
-        <w:t>- CSS3 externo para personalizar los colores del sitio.</w:t>
-      </w:r>
-    </w:p>
-    <w:p>
-      <w:r>
-        <w:t>- JavaScript para interacción y validación.</w:t>
-      </w:r>
-    </w:p>
-    <w:p>
-      <w:r>
-        <w:t>- XAMPP/Apache para ejecutar el sitio en `localhost`.</w:t>
-      </w:r>
-    </w:p>
-    <w:p>
-      <w:r>
-        <w:t>- Git y GitHub para control de versiones y trabajo colaborativo.</w:t>
-      </w:r>
-    </w:p>
-    <w:p/>
-    <w:p>
-      <w:r>
-        <w:rPr>
-          <w:b/>
-          <w:bCs/>
-        </w:rPr>
-        <w:t>## 5. Propuesta de solución</w:t>
-      </w:r>
-    </w:p>
-    <w:p/>
-    <w:p>
-      <w:r>
-        <w:lastRenderedPageBreak/>
-        <w:t xml:space="preserve">Se propone una interfaz limpia en tonos azul y turquesa, asociados a salud y confianza. La información se divide en tres páginas para facilitar la navegación y mantener el código ordenado. La reserva funciona como demostración </w:t>
-      </w:r>
-      <w:proofErr w:type="spellStart"/>
-      <w:r>
-        <w:t>frontend</w:t>
-      </w:r>
-      <w:proofErr w:type="spellEnd"/>
-      <w:r>
-        <w:t xml:space="preserve"> y confirma los datos solamente cuando superan todas las validaciones.</w:t>
-      </w:r>
-    </w:p>
-    <w:p/>
-    <w:p>
-      <w:r>
-        <w:rPr>
-          <w:b/>
-          <w:bCs/>
-        </w:rPr>
-        <w:t>## 6. Restricciones</w:t>
-      </w:r>
-    </w:p>
-    <w:p/>
-    <w:p>
-      <w:r>
-        <w:t>- El sitio no almacena datos.</w:t>
-      </w:r>
-    </w:p>
-    <w:p>
-      <w:r>
-        <w:t>- El formulario no envía correos ni confirma horas reales.</w:t>
-      </w:r>
-    </w:p>
-    <w:p>
-      <w:r>
-        <w:t>- Los precios mostrados son referenciales y corresponden a una clínica ficticia.</w:t>
-      </w:r>
-    </w:p>
-    <w:p>
-      <w:r>
-        <w:t>- El video requiere conexión a Internet para reproducirse.</w:t>
-      </w:r>
-    </w:p>
-    <w:p/>
-    <w:p>
-      <w:r>
-        <w:rPr>
-          <w:b/>
-          <w:bCs/>
-        </w:rPr>
-        <w:t>## 7. Mejoras futuras</w:t>
-      </w:r>
-    </w:p>
-    <w:p/>
-    <w:p>
-      <w:r>
-        <w:t>- Agregar una base de datos para almacenar reservas.</w:t>
-      </w:r>
-    </w:p>
-    <w:p>
-      <w:r>
-        <w:t>- Permitir inicio de sesión de pacientes.</w:t>
-      </w:r>
-    </w:p>
-    <w:p>
-      <w:r>
-        <w:t>- Mostrar horas disponibles en tiempo real.</w:t>
-      </w:r>
-    </w:p>
-    <w:p>
-      <w:r>
-        <w:t>- Enviar confirmaciones por correo.</w:t>
-      </w:r>
-    </w:p>
-    <w:p>
-      <w:r>
-        <w:t>- Incorporar un panel de administración.</w:t>
-      </w:r>
-    </w:p>
-    <w:p/>
-    <w:p/>
+        <w:t>Especificación de Requisitos del Software - Versión 1 actualizada</w:t>
+      </w:r>
+    </w:p>
+    <w:p>
+      <w:pPr>
+        <w:spacing w:after="80"/>
+      </w:pPr>
+      <w:r>
+        <w:t>Este documento describe el alcance actual del sitio web frontend de Clínica Aura e incorpora las funciones de catálogo, carrito, registro de usuarios e inicio de sesión implementadas en el proyecto.</w:t>
+      </w:r>
+    </w:p>
+    <w:p>
+      <w:pPr>
+        <w:pStyle w:val="Ttulo1"/>
+        <w:spacing w:after="80"/>
+      </w:pPr>
+      <w:r>
+        <w:t>1 Introducción</w:t>
+      </w:r>
+    </w:p>
+    <w:p>
+      <w:pPr>
+        <w:pStyle w:val="Ttulo2"/>
+        <w:spacing w:after="80"/>
+      </w:pPr>
+      <w:r>
+        <w:t>1.1 Propósito</w:t>
+      </w:r>
+    </w:p>
+    <w:p>
+      <w:pPr>
+        <w:spacing w:after="80"/>
+      </w:pPr>
+      <w:r>
+        <w:t>Definir los requisitos de la primera versión del sitio web de Clínica Aura, una clínica ficticia dedicada a la salud dental y la armonización facial. El documento está dirigido al equipo de desarrollo y al docente evaluador.</w:t>
+      </w:r>
+    </w:p>
+    <w:p>
+      <w:pPr>
+        <w:pStyle w:val="Ttulo2"/>
+        <w:spacing w:after="80"/>
+      </w:pPr>
+      <w:r>
+        <w:t>1.2 Alcance</w:t>
+      </w:r>
+    </w:p>
+    <w:p>
+      <w:pPr>
+        <w:spacing w:after="80"/>
+      </w:pPr>
+      <w:r>
+        <w:t>El sitio permite conocer la clínica, revisar tratamientos, consultar precios referenciales, preparar un pedido, registrar usuarios, iniciar sesión y enviar una solicitud de reserva. Los datos se almacenan solamente en el navegador.</w:t>
+      </w:r>
+    </w:p>
+    <w:p>
+      <w:pPr>
+        <w:pStyle w:val="Ttulo2"/>
+        <w:spacing w:after="80"/>
+      </w:pPr>
+      <w:r>
+        <w:t>1.3 Público objetivo</w:t>
+      </w:r>
+    </w:p>
+    <w:p>
+      <w:pPr>
+        <w:spacing w:after="80"/>
+      </w:pPr>
+      <w:r>
+        <w:t>Personas mayores de edad interesadas en servicios dentales o faciales que desean informarse, estimar tratamientos o solicitar una evaluación.</w:t>
+      </w:r>
+    </w:p>
+    <w:p>
+      <w:pPr>
+        <w:pStyle w:val="Ttulo1"/>
+        <w:spacing w:after="80"/>
+      </w:pPr>
+      <w:r>
+        <w:t>2 Requerimientos funcionales</w:t>
+      </w:r>
+    </w:p>
+    <w:tbl>
+      <w:tblPr>
+        <w:tblW w:type="auto" w:w="0"/>
+        <w:tblLayout w:type="fixed"/>
+        <w:tblLook w:firstColumn="1" w:firstRow="1" w:lastColumn="0" w:lastRow="0" w:noHBand="0" w:noVBand="1" w:val="04A0"/>
+      </w:tblPr>
+      <w:tblGrid>
+        <w:gridCol w:w="1224"/>
+        <w:gridCol w:w="8640"/>
+      </w:tblGrid>
+      <w:tr>
+        <w:tc>
+          <w:tcPr>
+            <w:tcW w:type="dxa" w:w="1224"/>
+            <w:shd w:fill="007C83"/>
+            <w:tcBorders>
+              <w:top w:val="single" w:sz="6" w:color="D9D9D9"/>
+              <w:left w:val="single" w:sz="6" w:color="D9D9D9"/>
+              <w:bottom w:val="single" w:sz="6" w:color="D9D9D9"/>
+              <w:right w:val="single" w:sz="6" w:color="D9D9D9"/>
+              <w:insideH w:val="single" w:sz="6" w:color="D9D9D9"/>
+              <w:insideV w:val="single" w:sz="6" w:color="D9D9D9"/>
+            </w:tcBorders>
+            <w:vAlign w:val="center"/>
+          </w:tcPr>
+          <w:p>
+            <w:r>
+              <w:rPr>
+                <w:b/>
+                <w:color w:val="FFFFFF"/>
+              </w:rPr>
+              <w:t>Código</w:t>
+            </w:r>
+          </w:p>
+        </w:tc>
+        <w:tc>
+          <w:tcPr>
+            <w:tcW w:type="dxa" w:w="8640"/>
+            <w:shd w:fill="007C83"/>
+            <w:tcBorders>
+              <w:top w:val="single" w:sz="6" w:color="D9D9D9"/>
+              <w:left w:val="single" w:sz="6" w:color="D9D9D9"/>
+              <w:bottom w:val="single" w:sz="6" w:color="D9D9D9"/>
+              <w:right w:val="single" w:sz="6" w:color="D9D9D9"/>
+              <w:insideH w:val="single" w:sz="6" w:color="D9D9D9"/>
+              <w:insideV w:val="single" w:sz="6" w:color="D9D9D9"/>
+            </w:tcBorders>
+            <w:vAlign w:val="center"/>
+          </w:tcPr>
+          <w:p>
+            <w:r>
+              <w:rPr>
+                <w:b/>
+                <w:color w:val="FFFFFF"/>
+              </w:rPr>
+              <w:t>Requerimiento</w:t>
+            </w:r>
+          </w:p>
+        </w:tc>
+      </w:tr>
+      <w:tr>
+        <w:tc>
+          <w:tcPr>
+            <w:tcW w:type="dxa" w:w="1224"/>
+            <w:tcBorders>
+              <w:top w:val="single" w:sz="6" w:color="D9D9D9"/>
+              <w:left w:val="single" w:sz="6" w:color="D9D9D9"/>
+              <w:bottom w:val="single" w:sz="6" w:color="D9D9D9"/>
+              <w:right w:val="single" w:sz="6" w:color="D9D9D9"/>
+              <w:insideH w:val="single" w:sz="6" w:color="D9D9D9"/>
+              <w:insideV w:val="single" w:sz="6" w:color="D9D9D9"/>
+            </w:tcBorders>
+            <w:vAlign w:val="center"/>
+          </w:tcPr>
+          <w:p>
+            <w:pPr>
+              <w:spacing w:after="60"/>
+            </w:pPr>
+            <w:r>
+              <w:rPr>
+                <w:sz w:val="17"/>
+              </w:rPr>
+              <w:t>RF-01</w:t>
+            </w:r>
+          </w:p>
+        </w:tc>
+        <w:tc>
+          <w:tcPr>
+            <w:tcW w:type="dxa" w:w="8640"/>
+            <w:tcBorders>
+              <w:top w:val="single" w:sz="6" w:color="D9D9D9"/>
+              <w:left w:val="single" w:sz="6" w:color="D9D9D9"/>
+              <w:bottom w:val="single" w:sz="6" w:color="D9D9D9"/>
+              <w:right w:val="single" w:sz="6" w:color="D9D9D9"/>
+              <w:insideH w:val="single" w:sz="6" w:color="D9D9D9"/>
+              <w:insideV w:val="single" w:sz="6" w:color="D9D9D9"/>
+            </w:tcBorders>
+            <w:vAlign w:val="center"/>
+          </w:tcPr>
+          <w:p>
+            <w:pPr>
+              <w:spacing w:after="60"/>
+            </w:pPr>
+            <w:r>
+              <w:rPr>
+                <w:sz w:val="17"/>
+              </w:rPr>
+              <w:t>El usuario podrá navegar entre Inicio, Nosotros, Tratamientos, Mi pedido, Reserva, Ingresar y Registro.</w:t>
+            </w:r>
+          </w:p>
+        </w:tc>
+      </w:tr>
+      <w:tr>
+        <w:tc>
+          <w:tcPr>
+            <w:tcW w:type="dxa" w:w="1224"/>
+            <w:shd w:fill="EAF6F6"/>
+            <w:tcBorders>
+              <w:top w:val="single" w:sz="6" w:color="D9D9D9"/>
+              <w:left w:val="single" w:sz="6" w:color="D9D9D9"/>
+              <w:bottom w:val="single" w:sz="6" w:color="D9D9D9"/>
+              <w:right w:val="single" w:sz="6" w:color="D9D9D9"/>
+              <w:insideH w:val="single" w:sz="6" w:color="D9D9D9"/>
+              <w:insideV w:val="single" w:sz="6" w:color="D9D9D9"/>
+            </w:tcBorders>
+            <w:vAlign w:val="center"/>
+          </w:tcPr>
+          <w:p>
+            <w:pPr>
+              <w:spacing w:after="60"/>
+            </w:pPr>
+            <w:r>
+              <w:rPr>
+                <w:sz w:val="17"/>
+              </w:rPr>
+              <w:t>RF-02</w:t>
+            </w:r>
+          </w:p>
+        </w:tc>
+        <w:tc>
+          <w:tcPr>
+            <w:tcW w:type="dxa" w:w="8640"/>
+            <w:shd w:fill="EAF6F6"/>
+            <w:tcBorders>
+              <w:top w:val="single" w:sz="6" w:color="D9D9D9"/>
+              <w:left w:val="single" w:sz="6" w:color="D9D9D9"/>
+              <w:bottom w:val="single" w:sz="6" w:color="D9D9D9"/>
+              <w:right w:val="single" w:sz="6" w:color="D9D9D9"/>
+              <w:insideH w:val="single" w:sz="6" w:color="D9D9D9"/>
+              <w:insideV w:val="single" w:sz="6" w:color="D9D9D9"/>
+            </w:tcBorders>
+            <w:vAlign w:val="center"/>
+          </w:tcPr>
+          <w:p>
+            <w:pPr>
+              <w:spacing w:after="60"/>
+            </w:pPr>
+            <w:r>
+              <w:rPr>
+                <w:sz w:val="17"/>
+              </w:rPr>
+              <w:t>El usuario podrá revisar tratamientos dentales, estéticos y faciales.</w:t>
+            </w:r>
+          </w:p>
+        </w:tc>
+      </w:tr>
+      <w:tr>
+        <w:tc>
+          <w:tcPr>
+            <w:tcW w:type="dxa" w:w="1224"/>
+            <w:tcBorders>
+              <w:top w:val="single" w:sz="6" w:color="D9D9D9"/>
+              <w:left w:val="single" w:sz="6" w:color="D9D9D9"/>
+              <w:bottom w:val="single" w:sz="6" w:color="D9D9D9"/>
+              <w:right w:val="single" w:sz="6" w:color="D9D9D9"/>
+              <w:insideH w:val="single" w:sz="6" w:color="D9D9D9"/>
+              <w:insideV w:val="single" w:sz="6" w:color="D9D9D9"/>
+            </w:tcBorders>
+            <w:vAlign w:val="center"/>
+          </w:tcPr>
+          <w:p>
+            <w:pPr>
+              <w:spacing w:after="60"/>
+            </w:pPr>
+            <w:r>
+              <w:rPr>
+                <w:sz w:val="17"/>
+              </w:rPr>
+              <w:t>RF-03</w:t>
+            </w:r>
+          </w:p>
+        </w:tc>
+        <w:tc>
+          <w:tcPr>
+            <w:tcW w:type="dxa" w:w="8640"/>
+            <w:tcBorders>
+              <w:top w:val="single" w:sz="6" w:color="D9D9D9"/>
+              <w:left w:val="single" w:sz="6" w:color="D9D9D9"/>
+              <w:bottom w:val="single" w:sz="6" w:color="D9D9D9"/>
+              <w:right w:val="single" w:sz="6" w:color="D9D9D9"/>
+              <w:insideH w:val="single" w:sz="6" w:color="D9D9D9"/>
+              <w:insideV w:val="single" w:sz="6" w:color="D9D9D9"/>
+            </w:tcBorders>
+            <w:vAlign w:val="center"/>
+          </w:tcPr>
+          <w:p>
+            <w:pPr>
+              <w:spacing w:after="60"/>
+            </w:pPr>
+            <w:r>
+              <w:rPr>
+                <w:sz w:val="17"/>
+              </w:rPr>
+              <w:t>El sitio mostrará imágenes, descripciones y precios referenciales de los tratamientos.</w:t>
+            </w:r>
+          </w:p>
+        </w:tc>
+      </w:tr>
+      <w:tr>
+        <w:tc>
+          <w:tcPr>
+            <w:tcW w:type="dxa" w:w="1224"/>
+            <w:shd w:fill="EAF6F6"/>
+            <w:tcBorders>
+              <w:top w:val="single" w:sz="6" w:color="D9D9D9"/>
+              <w:left w:val="single" w:sz="6" w:color="D9D9D9"/>
+              <w:bottom w:val="single" w:sz="6" w:color="D9D9D9"/>
+              <w:right w:val="single" w:sz="6" w:color="D9D9D9"/>
+              <w:insideH w:val="single" w:sz="6" w:color="D9D9D9"/>
+              <w:insideV w:val="single" w:sz="6" w:color="D9D9D9"/>
+            </w:tcBorders>
+            <w:vAlign w:val="center"/>
+          </w:tcPr>
+          <w:p>
+            <w:pPr>
+              <w:spacing w:after="60"/>
+            </w:pPr>
+            <w:r>
+              <w:rPr>
+                <w:sz w:val="17"/>
+              </w:rPr>
+              <w:t>RF-04</w:t>
+            </w:r>
+          </w:p>
+        </w:tc>
+        <w:tc>
+          <w:tcPr>
+            <w:tcW w:type="dxa" w:w="8640"/>
+            <w:shd w:fill="EAF6F6"/>
+            <w:tcBorders>
+              <w:top w:val="single" w:sz="6" w:color="D9D9D9"/>
+              <w:left w:val="single" w:sz="6" w:color="D9D9D9"/>
+              <w:bottom w:val="single" w:sz="6" w:color="D9D9D9"/>
+              <w:right w:val="single" w:sz="6" w:color="D9D9D9"/>
+              <w:insideH w:val="single" w:sz="6" w:color="D9D9D9"/>
+              <w:insideV w:val="single" w:sz="6" w:color="D9D9D9"/>
+            </w:tcBorders>
+            <w:vAlign w:val="center"/>
+          </w:tcPr>
+          <w:p>
+            <w:pPr>
+              <w:spacing w:after="60"/>
+            </w:pPr>
+            <w:r>
+              <w:rPr>
+                <w:sz w:val="17"/>
+              </w:rPr>
+              <w:t>El usuario podrá reproducir un video educativo desde la página de inicio.</w:t>
+            </w:r>
+          </w:p>
+        </w:tc>
+      </w:tr>
+      <w:tr>
+        <w:tc>
+          <w:tcPr>
+            <w:tcW w:type="dxa" w:w="1224"/>
+            <w:tcBorders>
+              <w:top w:val="single" w:sz="6" w:color="D9D9D9"/>
+              <w:left w:val="single" w:sz="6" w:color="D9D9D9"/>
+              <w:bottom w:val="single" w:sz="6" w:color="D9D9D9"/>
+              <w:right w:val="single" w:sz="6" w:color="D9D9D9"/>
+              <w:insideH w:val="single" w:sz="6" w:color="D9D9D9"/>
+              <w:insideV w:val="single" w:sz="6" w:color="D9D9D9"/>
+            </w:tcBorders>
+            <w:vAlign w:val="center"/>
+          </w:tcPr>
+          <w:p>
+            <w:pPr>
+              <w:spacing w:after="60"/>
+            </w:pPr>
+            <w:r>
+              <w:rPr>
+                <w:sz w:val="17"/>
+              </w:rPr>
+              <w:t>RF-05</w:t>
+            </w:r>
+          </w:p>
+        </w:tc>
+        <w:tc>
+          <w:tcPr>
+            <w:tcW w:type="dxa" w:w="8640"/>
+            <w:tcBorders>
+              <w:top w:val="single" w:sz="6" w:color="D9D9D9"/>
+              <w:left w:val="single" w:sz="6" w:color="D9D9D9"/>
+              <w:bottom w:val="single" w:sz="6" w:color="D9D9D9"/>
+              <w:right w:val="single" w:sz="6" w:color="D9D9D9"/>
+              <w:insideH w:val="single" w:sz="6" w:color="D9D9D9"/>
+              <w:insideV w:val="single" w:sz="6" w:color="D9D9D9"/>
+            </w:tcBorders>
+            <w:vAlign w:val="center"/>
+          </w:tcPr>
+          <w:p>
+            <w:pPr>
+              <w:spacing w:after="60"/>
+            </w:pPr>
+            <w:r>
+              <w:rPr>
+                <w:sz w:val="17"/>
+              </w:rPr>
+              <w:t>El usuario podrá completar un formulario para solicitar una reserva.</w:t>
+            </w:r>
+          </w:p>
+        </w:tc>
+      </w:tr>
+      <w:tr>
+        <w:tc>
+          <w:tcPr>
+            <w:tcW w:type="dxa" w:w="1224"/>
+            <w:shd w:fill="EAF6F6"/>
+            <w:tcBorders>
+              <w:top w:val="single" w:sz="6" w:color="D9D9D9"/>
+              <w:left w:val="single" w:sz="6" w:color="D9D9D9"/>
+              <w:bottom w:val="single" w:sz="6" w:color="D9D9D9"/>
+              <w:right w:val="single" w:sz="6" w:color="D9D9D9"/>
+              <w:insideH w:val="single" w:sz="6" w:color="D9D9D9"/>
+              <w:insideV w:val="single" w:sz="6" w:color="D9D9D9"/>
+            </w:tcBorders>
+            <w:vAlign w:val="center"/>
+          </w:tcPr>
+          <w:p>
+            <w:pPr>
+              <w:spacing w:after="60"/>
+            </w:pPr>
+            <w:r>
+              <w:rPr>
+                <w:sz w:val="17"/>
+              </w:rPr>
+              <w:t>RF-06</w:t>
+            </w:r>
+          </w:p>
+        </w:tc>
+        <w:tc>
+          <w:tcPr>
+            <w:tcW w:type="dxa" w:w="8640"/>
+            <w:shd w:fill="EAF6F6"/>
+            <w:tcBorders>
+              <w:top w:val="single" w:sz="6" w:color="D9D9D9"/>
+              <w:left w:val="single" w:sz="6" w:color="D9D9D9"/>
+              <w:bottom w:val="single" w:sz="6" w:color="D9D9D9"/>
+              <w:right w:val="single" w:sz="6" w:color="D9D9D9"/>
+              <w:insideH w:val="single" w:sz="6" w:color="D9D9D9"/>
+              <w:insideV w:val="single" w:sz="6" w:color="D9D9D9"/>
+            </w:tcBorders>
+            <w:vAlign w:val="center"/>
+          </w:tcPr>
+          <w:p>
+            <w:pPr>
+              <w:spacing w:after="60"/>
+            </w:pPr>
+            <w:r>
+              <w:rPr>
+                <w:sz w:val="17"/>
+              </w:rPr>
+              <w:t>JavaScript validará nombre, RUT, correo y servicio en el formulario de reserva.</w:t>
+            </w:r>
+          </w:p>
+        </w:tc>
+      </w:tr>
+      <w:tr>
+        <w:tc>
+          <w:tcPr>
+            <w:tcW w:type="dxa" w:w="1224"/>
+            <w:tcBorders>
+              <w:top w:val="single" w:sz="6" w:color="D9D9D9"/>
+              <w:left w:val="single" w:sz="6" w:color="D9D9D9"/>
+              <w:bottom w:val="single" w:sz="6" w:color="D9D9D9"/>
+              <w:right w:val="single" w:sz="6" w:color="D9D9D9"/>
+              <w:insideH w:val="single" w:sz="6" w:color="D9D9D9"/>
+              <w:insideV w:val="single" w:sz="6" w:color="D9D9D9"/>
+            </w:tcBorders>
+            <w:vAlign w:val="center"/>
+          </w:tcPr>
+          <w:p>
+            <w:pPr>
+              <w:spacing w:after="60"/>
+            </w:pPr>
+            <w:r>
+              <w:rPr>
+                <w:sz w:val="17"/>
+              </w:rPr>
+              <w:t>RF-07</w:t>
+            </w:r>
+          </w:p>
+        </w:tc>
+        <w:tc>
+          <w:tcPr>
+            <w:tcW w:type="dxa" w:w="8640"/>
+            <w:tcBorders>
+              <w:top w:val="single" w:sz="6" w:color="D9D9D9"/>
+              <w:left w:val="single" w:sz="6" w:color="D9D9D9"/>
+              <w:bottom w:val="single" w:sz="6" w:color="D9D9D9"/>
+              <w:right w:val="single" w:sz="6" w:color="D9D9D9"/>
+              <w:insideH w:val="single" w:sz="6" w:color="D9D9D9"/>
+              <w:insideV w:val="single" w:sz="6" w:color="D9D9D9"/>
+            </w:tcBorders>
+            <w:vAlign w:val="center"/>
+          </w:tcPr>
+          <w:p>
+            <w:pPr>
+              <w:spacing w:after="60"/>
+            </w:pPr>
+            <w:r>
+              <w:rPr>
+                <w:sz w:val="17"/>
+              </w:rPr>
+              <w:t>El sistema mostrará mensajes específicos junto a los campos incorrectos y confirmará los datos válidos.</w:t>
+            </w:r>
+          </w:p>
+        </w:tc>
+      </w:tr>
+      <w:tr>
+        <w:tc>
+          <w:tcPr>
+            <w:tcW w:type="dxa" w:w="1224"/>
+            <w:shd w:fill="EAF6F6"/>
+            <w:tcBorders>
+              <w:top w:val="single" w:sz="6" w:color="D9D9D9"/>
+              <w:left w:val="single" w:sz="6" w:color="D9D9D9"/>
+              <w:bottom w:val="single" w:sz="6" w:color="D9D9D9"/>
+              <w:right w:val="single" w:sz="6" w:color="D9D9D9"/>
+              <w:insideH w:val="single" w:sz="6" w:color="D9D9D9"/>
+              <w:insideV w:val="single" w:sz="6" w:color="D9D9D9"/>
+            </w:tcBorders>
+            <w:vAlign w:val="center"/>
+          </w:tcPr>
+          <w:p>
+            <w:pPr>
+              <w:spacing w:after="60"/>
+            </w:pPr>
+            <w:r>
+              <w:rPr>
+                <w:sz w:val="17"/>
+              </w:rPr>
+              <w:t>RF-08</w:t>
+            </w:r>
+          </w:p>
+        </w:tc>
+        <w:tc>
+          <w:tcPr>
+            <w:tcW w:type="dxa" w:w="8640"/>
+            <w:shd w:fill="EAF6F6"/>
+            <w:tcBorders>
+              <w:top w:val="single" w:sz="6" w:color="D9D9D9"/>
+              <w:left w:val="single" w:sz="6" w:color="D9D9D9"/>
+              <w:bottom w:val="single" w:sz="6" w:color="D9D9D9"/>
+              <w:right w:val="single" w:sz="6" w:color="D9D9D9"/>
+              <w:insideH w:val="single" w:sz="6" w:color="D9D9D9"/>
+              <w:insideV w:val="single" w:sz="6" w:color="D9D9D9"/>
+            </w:tcBorders>
+            <w:vAlign w:val="center"/>
+          </w:tcPr>
+          <w:p>
+            <w:pPr>
+              <w:spacing w:after="60"/>
+            </w:pPr>
+            <w:r>
+              <w:rPr>
+                <w:sz w:val="17"/>
+              </w:rPr>
+              <w:t>El botón Limpiar eliminará los datos, mensajes e indicadores visuales del formulario.</w:t>
+            </w:r>
+          </w:p>
+        </w:tc>
+      </w:tr>
+      <w:tr>
+        <w:tc>
+          <w:tcPr>
+            <w:tcW w:type="dxa" w:w="1224"/>
+            <w:tcBorders>
+              <w:top w:val="single" w:sz="6" w:color="D9D9D9"/>
+              <w:left w:val="single" w:sz="6" w:color="D9D9D9"/>
+              <w:bottom w:val="single" w:sz="6" w:color="D9D9D9"/>
+              <w:right w:val="single" w:sz="6" w:color="D9D9D9"/>
+              <w:insideH w:val="single" w:sz="6" w:color="D9D9D9"/>
+              <w:insideV w:val="single" w:sz="6" w:color="D9D9D9"/>
+            </w:tcBorders>
+            <w:vAlign w:val="center"/>
+          </w:tcPr>
+          <w:p>
+            <w:pPr>
+              <w:spacing w:after="60"/>
+            </w:pPr>
+            <w:r>
+              <w:rPr>
+                <w:sz w:val="17"/>
+              </w:rPr>
+              <w:t>RF-09</w:t>
+            </w:r>
+          </w:p>
+        </w:tc>
+        <w:tc>
+          <w:tcPr>
+            <w:tcW w:type="dxa" w:w="8640"/>
+            <w:tcBorders>
+              <w:top w:val="single" w:sz="6" w:color="D9D9D9"/>
+              <w:left w:val="single" w:sz="6" w:color="D9D9D9"/>
+              <w:bottom w:val="single" w:sz="6" w:color="D9D9D9"/>
+              <w:right w:val="single" w:sz="6" w:color="D9D9D9"/>
+              <w:insideH w:val="single" w:sz="6" w:color="D9D9D9"/>
+              <w:insideV w:val="single" w:sz="6" w:color="D9D9D9"/>
+            </w:tcBorders>
+            <w:vAlign w:val="center"/>
+          </w:tcPr>
+          <w:p>
+            <w:pPr>
+              <w:spacing w:after="60"/>
+            </w:pPr>
+            <w:r>
+              <w:rPr>
+                <w:sz w:val="17"/>
+              </w:rPr>
+              <w:t>JavaScript generará el catálogo desde un arreglo de tratamientos.</w:t>
+            </w:r>
+          </w:p>
+        </w:tc>
+      </w:tr>
+      <w:tr>
+        <w:tc>
+          <w:tcPr>
+            <w:tcW w:type="dxa" w:w="1224"/>
+            <w:shd w:fill="EAF6F6"/>
+            <w:tcBorders>
+              <w:top w:val="single" w:sz="6" w:color="D9D9D9"/>
+              <w:left w:val="single" w:sz="6" w:color="D9D9D9"/>
+              <w:bottom w:val="single" w:sz="6" w:color="D9D9D9"/>
+              <w:right w:val="single" w:sz="6" w:color="D9D9D9"/>
+              <w:insideH w:val="single" w:sz="6" w:color="D9D9D9"/>
+              <w:insideV w:val="single" w:sz="6" w:color="D9D9D9"/>
+            </w:tcBorders>
+            <w:vAlign w:val="center"/>
+          </w:tcPr>
+          <w:p>
+            <w:pPr>
+              <w:spacing w:after="60"/>
+            </w:pPr>
+            <w:r>
+              <w:rPr>
+                <w:sz w:val="17"/>
+              </w:rPr>
+              <w:t>RF-10</w:t>
+            </w:r>
+          </w:p>
+        </w:tc>
+        <w:tc>
+          <w:tcPr>
+            <w:tcW w:type="dxa" w:w="8640"/>
+            <w:shd w:fill="EAF6F6"/>
+            <w:tcBorders>
+              <w:top w:val="single" w:sz="6" w:color="D9D9D9"/>
+              <w:left w:val="single" w:sz="6" w:color="D9D9D9"/>
+              <w:bottom w:val="single" w:sz="6" w:color="D9D9D9"/>
+              <w:right w:val="single" w:sz="6" w:color="D9D9D9"/>
+              <w:insideH w:val="single" w:sz="6" w:color="D9D9D9"/>
+              <w:insideV w:val="single" w:sz="6" w:color="D9D9D9"/>
+            </w:tcBorders>
+            <w:vAlign w:val="center"/>
+          </w:tcPr>
+          <w:p>
+            <w:pPr>
+              <w:spacing w:after="60"/>
+            </w:pPr>
+            <w:r>
+              <w:rPr>
+                <w:sz w:val="17"/>
+              </w:rPr>
+              <w:t>El usuario podrá agregar tratamientos al carrito, revisar cantidades, subtotales y total, y eliminar elementos.</w:t>
+            </w:r>
+          </w:p>
+        </w:tc>
+      </w:tr>
+      <w:tr>
+        <w:tc>
+          <w:tcPr>
+            <w:tcW w:type="dxa" w:w="1224"/>
+            <w:tcBorders>
+              <w:top w:val="single" w:sz="6" w:color="D9D9D9"/>
+              <w:left w:val="single" w:sz="6" w:color="D9D9D9"/>
+              <w:bottom w:val="single" w:sz="6" w:color="D9D9D9"/>
+              <w:right w:val="single" w:sz="6" w:color="D9D9D9"/>
+              <w:insideH w:val="single" w:sz="6" w:color="D9D9D9"/>
+              <w:insideV w:val="single" w:sz="6" w:color="D9D9D9"/>
+            </w:tcBorders>
+            <w:vAlign w:val="center"/>
+          </w:tcPr>
+          <w:p>
+            <w:pPr>
+              <w:spacing w:after="60"/>
+            </w:pPr>
+            <w:r>
+              <w:rPr>
+                <w:sz w:val="17"/>
+              </w:rPr>
+              <w:t>RF-11</w:t>
+            </w:r>
+          </w:p>
+        </w:tc>
+        <w:tc>
+          <w:tcPr>
+            <w:tcW w:type="dxa" w:w="8640"/>
+            <w:tcBorders>
+              <w:top w:val="single" w:sz="6" w:color="D9D9D9"/>
+              <w:left w:val="single" w:sz="6" w:color="D9D9D9"/>
+              <w:bottom w:val="single" w:sz="6" w:color="D9D9D9"/>
+              <w:right w:val="single" w:sz="6" w:color="D9D9D9"/>
+              <w:insideH w:val="single" w:sz="6" w:color="D9D9D9"/>
+              <w:insideV w:val="single" w:sz="6" w:color="D9D9D9"/>
+            </w:tcBorders>
+            <w:vAlign w:val="center"/>
+          </w:tcPr>
+          <w:p>
+            <w:pPr>
+              <w:spacing w:after="60"/>
+            </w:pPr>
+            <w:r>
+              <w:rPr>
+                <w:sz w:val="17"/>
+              </w:rPr>
+              <w:t>El carrito se conservará en el navegador mediante localStorage.</w:t>
+            </w:r>
+          </w:p>
+        </w:tc>
+      </w:tr>
+      <w:tr>
+        <w:tc>
+          <w:tcPr>
+            <w:tcW w:type="dxa" w:w="1224"/>
+            <w:shd w:fill="EAF6F6"/>
+            <w:tcBorders>
+              <w:top w:val="single" w:sz="6" w:color="D9D9D9"/>
+              <w:left w:val="single" w:sz="6" w:color="D9D9D9"/>
+              <w:bottom w:val="single" w:sz="6" w:color="D9D9D9"/>
+              <w:right w:val="single" w:sz="6" w:color="D9D9D9"/>
+              <w:insideH w:val="single" w:sz="6" w:color="D9D9D9"/>
+              <w:insideV w:val="single" w:sz="6" w:color="D9D9D9"/>
+            </w:tcBorders>
+            <w:vAlign w:val="center"/>
+          </w:tcPr>
+          <w:p>
+            <w:pPr>
+              <w:spacing w:after="60"/>
+            </w:pPr>
+            <w:r>
+              <w:rPr>
+                <w:sz w:val="17"/>
+              </w:rPr>
+              <w:t>RF-12</w:t>
+            </w:r>
+          </w:p>
+        </w:tc>
+        <w:tc>
+          <w:tcPr>
+            <w:tcW w:type="dxa" w:w="8640"/>
+            <w:shd w:fill="EAF6F6"/>
+            <w:tcBorders>
+              <w:top w:val="single" w:sz="6" w:color="D9D9D9"/>
+              <w:left w:val="single" w:sz="6" w:color="D9D9D9"/>
+              <w:bottom w:val="single" w:sz="6" w:color="D9D9D9"/>
+              <w:right w:val="single" w:sz="6" w:color="D9D9D9"/>
+              <w:insideH w:val="single" w:sz="6" w:color="D9D9D9"/>
+              <w:insideV w:val="single" w:sz="6" w:color="D9D9D9"/>
+            </w:tcBorders>
+            <w:vAlign w:val="center"/>
+          </w:tcPr>
+          <w:p>
+            <w:pPr>
+              <w:spacing w:after="60"/>
+            </w:pPr>
+            <w:r>
+              <w:rPr>
+                <w:sz w:val="17"/>
+              </w:rPr>
+              <w:t>El usuario podrá registrarse con RUN válido sin puntos ni guion, nombre, apellidos, correo, contraseña, región, comuna y dirección.</w:t>
+            </w:r>
+          </w:p>
+        </w:tc>
+      </w:tr>
+      <w:tr>
+        <w:tc>
+          <w:tcPr>
+            <w:tcW w:type="dxa" w:w="1224"/>
+            <w:tcBorders>
+              <w:top w:val="single" w:sz="6" w:color="D9D9D9"/>
+              <w:left w:val="single" w:sz="6" w:color="D9D9D9"/>
+              <w:bottom w:val="single" w:sz="6" w:color="D9D9D9"/>
+              <w:right w:val="single" w:sz="6" w:color="D9D9D9"/>
+              <w:insideH w:val="single" w:sz="6" w:color="D9D9D9"/>
+              <w:insideV w:val="single" w:sz="6" w:color="D9D9D9"/>
+            </w:tcBorders>
+            <w:vAlign w:val="center"/>
+          </w:tcPr>
+          <w:p>
+            <w:pPr>
+              <w:spacing w:after="60"/>
+            </w:pPr>
+            <w:r>
+              <w:rPr>
+                <w:sz w:val="17"/>
+              </w:rPr>
+              <w:t>RF-13</w:t>
+            </w:r>
+          </w:p>
+        </w:tc>
+        <w:tc>
+          <w:tcPr>
+            <w:tcW w:type="dxa" w:w="8640"/>
+            <w:tcBorders>
+              <w:top w:val="single" w:sz="6" w:color="D9D9D9"/>
+              <w:left w:val="single" w:sz="6" w:color="D9D9D9"/>
+              <w:bottom w:val="single" w:sz="6" w:color="D9D9D9"/>
+              <w:right w:val="single" w:sz="6" w:color="D9D9D9"/>
+              <w:insideH w:val="single" w:sz="6" w:color="D9D9D9"/>
+              <w:insideV w:val="single" w:sz="6" w:color="D9D9D9"/>
+            </w:tcBorders>
+            <w:vAlign w:val="center"/>
+          </w:tcPr>
+          <w:p>
+            <w:pPr>
+              <w:spacing w:after="60"/>
+            </w:pPr>
+            <w:r>
+              <w:rPr>
+                <w:sz w:val="17"/>
+              </w:rPr>
+              <w:t>El registro aceptará solamente correos @duoc.cl, @profesor.duoc.cl y @gmail.com, y contraseñas de 4 a 10 caracteres.</w:t>
+            </w:r>
+          </w:p>
+        </w:tc>
+      </w:tr>
+      <w:tr>
+        <w:tc>
+          <w:tcPr>
+            <w:tcW w:type="dxa" w:w="1224"/>
+            <w:shd w:fill="EAF6F6"/>
+            <w:tcBorders>
+              <w:top w:val="single" w:sz="6" w:color="D9D9D9"/>
+              <w:left w:val="single" w:sz="6" w:color="D9D9D9"/>
+              <w:bottom w:val="single" w:sz="6" w:color="D9D9D9"/>
+              <w:right w:val="single" w:sz="6" w:color="D9D9D9"/>
+              <w:insideH w:val="single" w:sz="6" w:color="D9D9D9"/>
+              <w:insideV w:val="single" w:sz="6" w:color="D9D9D9"/>
+            </w:tcBorders>
+            <w:vAlign w:val="center"/>
+          </w:tcPr>
+          <w:p>
+            <w:pPr>
+              <w:spacing w:after="60"/>
+            </w:pPr>
+            <w:r>
+              <w:rPr>
+                <w:sz w:val="17"/>
+              </w:rPr>
+              <w:t>RF-14</w:t>
+            </w:r>
+          </w:p>
+        </w:tc>
+        <w:tc>
+          <w:tcPr>
+            <w:tcW w:type="dxa" w:w="8640"/>
+            <w:shd w:fill="EAF6F6"/>
+            <w:tcBorders>
+              <w:top w:val="single" w:sz="6" w:color="D9D9D9"/>
+              <w:left w:val="single" w:sz="6" w:color="D9D9D9"/>
+              <w:bottom w:val="single" w:sz="6" w:color="D9D9D9"/>
+              <w:right w:val="single" w:sz="6" w:color="D9D9D9"/>
+              <w:insideH w:val="single" w:sz="6" w:color="D9D9D9"/>
+              <w:insideV w:val="single" w:sz="6" w:color="D9D9D9"/>
+            </w:tcBorders>
+            <w:vAlign w:val="center"/>
+          </w:tcPr>
+          <w:p>
+            <w:pPr>
+              <w:spacing w:after="60"/>
+            </w:pPr>
+            <w:r>
+              <w:rPr>
+                <w:sz w:val="17"/>
+              </w:rPr>
+              <w:t>El usuario registrado podrá iniciar sesión con su correo y contraseña; la sesión se guardará en localStorage.</w:t>
+            </w:r>
+          </w:p>
+        </w:tc>
+      </w:tr>
+    </w:tbl>
+    <w:p>
+      <w:pPr>
+        <w:spacing w:after="80"/>
+      </w:pPr>
+    </w:p>
+    <w:p>
+      <w:pPr>
+        <w:pStyle w:val="Ttulo1"/>
+        <w:spacing w:after="80"/>
+      </w:pPr>
+      <w:r>
+        <w:t>3 Requerimientos no funcionales</w:t>
+      </w:r>
+    </w:p>
+    <w:tbl>
+      <w:tblPr>
+        <w:tblW w:type="auto" w:w="0"/>
+        <w:tblLayout w:type="fixed"/>
+        <w:tblLook w:firstColumn="1" w:firstRow="1" w:lastColumn="0" w:lastRow="0" w:noHBand="0" w:noVBand="1" w:val="04A0"/>
+      </w:tblPr>
+      <w:tblGrid>
+        <w:gridCol w:w="1224"/>
+        <w:gridCol w:w="8640"/>
+      </w:tblGrid>
+      <w:tr>
+        <w:tc>
+          <w:tcPr>
+            <w:tcW w:type="dxa" w:w="1224"/>
+            <w:shd w:fill="007C83"/>
+            <w:tcBorders>
+              <w:top w:val="single" w:sz="6" w:color="D9D9D9"/>
+              <w:left w:val="single" w:sz="6" w:color="D9D9D9"/>
+              <w:bottom w:val="single" w:sz="6" w:color="D9D9D9"/>
+              <w:right w:val="single" w:sz="6" w:color="D9D9D9"/>
+              <w:insideH w:val="single" w:sz="6" w:color="D9D9D9"/>
+              <w:insideV w:val="single" w:sz="6" w:color="D9D9D9"/>
+            </w:tcBorders>
+            <w:vAlign w:val="center"/>
+          </w:tcPr>
+          <w:p>
+            <w:r>
+              <w:rPr>
+                <w:b/>
+                <w:color w:val="FFFFFF"/>
+              </w:rPr>
+              <w:t>Código</w:t>
+            </w:r>
+          </w:p>
+        </w:tc>
+        <w:tc>
+          <w:tcPr>
+            <w:tcW w:type="dxa" w:w="8640"/>
+            <w:shd w:fill="007C83"/>
+            <w:tcBorders>
+              <w:top w:val="single" w:sz="6" w:color="D9D9D9"/>
+              <w:left w:val="single" w:sz="6" w:color="D9D9D9"/>
+              <w:bottom w:val="single" w:sz="6" w:color="D9D9D9"/>
+              <w:right w:val="single" w:sz="6" w:color="D9D9D9"/>
+              <w:insideH w:val="single" w:sz="6" w:color="D9D9D9"/>
+              <w:insideV w:val="single" w:sz="6" w:color="D9D9D9"/>
+            </w:tcBorders>
+            <w:vAlign w:val="center"/>
+          </w:tcPr>
+          <w:p>
+            <w:r>
+              <w:rPr>
+                <w:b/>
+                <w:color w:val="FFFFFF"/>
+              </w:rPr>
+              <w:t>Requerimiento</w:t>
+            </w:r>
+          </w:p>
+        </w:tc>
+      </w:tr>
+      <w:tr>
+        <w:tc>
+          <w:tcPr>
+            <w:tcW w:type="dxa" w:w="1224"/>
+            <w:tcBorders>
+              <w:top w:val="single" w:sz="6" w:color="D9D9D9"/>
+              <w:left w:val="single" w:sz="6" w:color="D9D9D9"/>
+              <w:bottom w:val="single" w:sz="6" w:color="D9D9D9"/>
+              <w:right w:val="single" w:sz="6" w:color="D9D9D9"/>
+              <w:insideH w:val="single" w:sz="6" w:color="D9D9D9"/>
+              <w:insideV w:val="single" w:sz="6" w:color="D9D9D9"/>
+            </w:tcBorders>
+            <w:vAlign w:val="center"/>
+          </w:tcPr>
+          <w:p>
+            <w:pPr>
+              <w:spacing w:after="60"/>
+            </w:pPr>
+            <w:r>
+              <w:rPr>
+                <w:sz w:val="17"/>
+              </w:rPr>
+              <w:t>RNF-01</w:t>
+            </w:r>
+          </w:p>
+        </w:tc>
+        <w:tc>
+          <w:tcPr>
+            <w:tcW w:type="dxa" w:w="8640"/>
+            <w:tcBorders>
+              <w:top w:val="single" w:sz="6" w:color="D9D9D9"/>
+              <w:left w:val="single" w:sz="6" w:color="D9D9D9"/>
+              <w:bottom w:val="single" w:sz="6" w:color="D9D9D9"/>
+              <w:right w:val="single" w:sz="6" w:color="D9D9D9"/>
+              <w:insideH w:val="single" w:sz="6" w:color="D9D9D9"/>
+              <w:insideV w:val="single" w:sz="6" w:color="D9D9D9"/>
+            </w:tcBorders>
+            <w:vAlign w:val="center"/>
+          </w:tcPr>
+          <w:p>
+            <w:pPr>
+              <w:spacing w:after="60"/>
+            </w:pPr>
+            <w:r>
+              <w:rPr>
+                <w:sz w:val="17"/>
+              </w:rPr>
+              <w:t>El sitio utilizará estructura semántica HTML5.</w:t>
+            </w:r>
+          </w:p>
+        </w:tc>
+      </w:tr>
+      <w:tr>
+        <w:tc>
+          <w:tcPr>
+            <w:tcW w:type="dxa" w:w="1224"/>
+            <w:shd w:fill="EAF6F6"/>
+            <w:tcBorders>
+              <w:top w:val="single" w:sz="6" w:color="D9D9D9"/>
+              <w:left w:val="single" w:sz="6" w:color="D9D9D9"/>
+              <w:bottom w:val="single" w:sz="6" w:color="D9D9D9"/>
+              <w:right w:val="single" w:sz="6" w:color="D9D9D9"/>
+              <w:insideH w:val="single" w:sz="6" w:color="D9D9D9"/>
+              <w:insideV w:val="single" w:sz="6" w:color="D9D9D9"/>
+            </w:tcBorders>
+            <w:vAlign w:val="center"/>
+          </w:tcPr>
+          <w:p>
+            <w:pPr>
+              <w:spacing w:after="60"/>
+            </w:pPr>
+            <w:r>
+              <w:rPr>
+                <w:sz w:val="17"/>
+              </w:rPr>
+              <w:t>RNF-02</w:t>
+            </w:r>
+          </w:p>
+        </w:tc>
+        <w:tc>
+          <w:tcPr>
+            <w:tcW w:type="dxa" w:w="8640"/>
+            <w:shd w:fill="EAF6F6"/>
+            <w:tcBorders>
+              <w:top w:val="single" w:sz="6" w:color="D9D9D9"/>
+              <w:left w:val="single" w:sz="6" w:color="D9D9D9"/>
+              <w:bottom w:val="single" w:sz="6" w:color="D9D9D9"/>
+              <w:right w:val="single" w:sz="6" w:color="D9D9D9"/>
+              <w:insideH w:val="single" w:sz="6" w:color="D9D9D9"/>
+              <w:insideV w:val="single" w:sz="6" w:color="D9D9D9"/>
+            </w:tcBorders>
+            <w:vAlign w:val="center"/>
+          </w:tcPr>
+          <w:p>
+            <w:pPr>
+              <w:spacing w:after="60"/>
+            </w:pPr>
+            <w:r>
+              <w:rPr>
+                <w:sz w:val="17"/>
+              </w:rPr>
+              <w:t>Los estilos estarán centralizados en una hoja CSS externa.</w:t>
+            </w:r>
+          </w:p>
+        </w:tc>
+      </w:tr>
+      <w:tr>
+        <w:tc>
+          <w:tcPr>
+            <w:tcW w:type="dxa" w:w="1224"/>
+            <w:tcBorders>
+              <w:top w:val="single" w:sz="6" w:color="D9D9D9"/>
+              <w:left w:val="single" w:sz="6" w:color="D9D9D9"/>
+              <w:bottom w:val="single" w:sz="6" w:color="D9D9D9"/>
+              <w:right w:val="single" w:sz="6" w:color="D9D9D9"/>
+              <w:insideH w:val="single" w:sz="6" w:color="D9D9D9"/>
+              <w:insideV w:val="single" w:sz="6" w:color="D9D9D9"/>
+            </w:tcBorders>
+            <w:vAlign w:val="center"/>
+          </w:tcPr>
+          <w:p>
+            <w:pPr>
+              <w:spacing w:after="60"/>
+            </w:pPr>
+            <w:r>
+              <w:rPr>
+                <w:sz w:val="17"/>
+              </w:rPr>
+              <w:t>RNF-03</w:t>
+            </w:r>
+          </w:p>
+        </w:tc>
+        <w:tc>
+          <w:tcPr>
+            <w:tcW w:type="dxa" w:w="8640"/>
+            <w:tcBorders>
+              <w:top w:val="single" w:sz="6" w:color="D9D9D9"/>
+              <w:left w:val="single" w:sz="6" w:color="D9D9D9"/>
+              <w:bottom w:val="single" w:sz="6" w:color="D9D9D9"/>
+              <w:right w:val="single" w:sz="6" w:color="D9D9D9"/>
+              <w:insideH w:val="single" w:sz="6" w:color="D9D9D9"/>
+              <w:insideV w:val="single" w:sz="6" w:color="D9D9D9"/>
+            </w:tcBorders>
+            <w:vAlign w:val="center"/>
+          </w:tcPr>
+          <w:p>
+            <w:pPr>
+              <w:spacing w:after="60"/>
+            </w:pPr>
+            <w:r>
+              <w:rPr>
+                <w:sz w:val="17"/>
+              </w:rPr>
+              <w:t>La interacción y las validaciones estarán en archivos JavaScript externos.</w:t>
+            </w:r>
+          </w:p>
+        </w:tc>
+      </w:tr>
+      <w:tr>
+        <w:tc>
+          <w:tcPr>
+            <w:tcW w:type="dxa" w:w="1224"/>
+            <w:shd w:fill="EAF6F6"/>
+            <w:tcBorders>
+              <w:top w:val="single" w:sz="6" w:color="D9D9D9"/>
+              <w:left w:val="single" w:sz="6" w:color="D9D9D9"/>
+              <w:bottom w:val="single" w:sz="6" w:color="D9D9D9"/>
+              <w:right w:val="single" w:sz="6" w:color="D9D9D9"/>
+              <w:insideH w:val="single" w:sz="6" w:color="D9D9D9"/>
+              <w:insideV w:val="single" w:sz="6" w:color="D9D9D9"/>
+            </w:tcBorders>
+            <w:vAlign w:val="center"/>
+          </w:tcPr>
+          <w:p>
+            <w:pPr>
+              <w:spacing w:after="60"/>
+            </w:pPr>
+            <w:r>
+              <w:rPr>
+                <w:sz w:val="17"/>
+              </w:rPr>
+              <w:t>RNF-04</w:t>
+            </w:r>
+          </w:p>
+        </w:tc>
+        <w:tc>
+          <w:tcPr>
+            <w:tcW w:type="dxa" w:w="8640"/>
+            <w:shd w:fill="EAF6F6"/>
+            <w:tcBorders>
+              <w:top w:val="single" w:sz="6" w:color="D9D9D9"/>
+              <w:left w:val="single" w:sz="6" w:color="D9D9D9"/>
+              <w:bottom w:val="single" w:sz="6" w:color="D9D9D9"/>
+              <w:right w:val="single" w:sz="6" w:color="D9D9D9"/>
+              <w:insideH w:val="single" w:sz="6" w:color="D9D9D9"/>
+              <w:insideV w:val="single" w:sz="6" w:color="D9D9D9"/>
+            </w:tcBorders>
+            <w:vAlign w:val="center"/>
+          </w:tcPr>
+          <w:p>
+            <w:pPr>
+              <w:spacing w:after="60"/>
+            </w:pPr>
+            <w:r>
+              <w:rPr>
+                <w:sz w:val="17"/>
+              </w:rPr>
+              <w:t>El diseño se adaptará a computadores, tablets y teléfonos mediante reglas responsivas.</w:t>
+            </w:r>
+          </w:p>
+        </w:tc>
+      </w:tr>
+      <w:tr>
+        <w:tc>
+          <w:tcPr>
+            <w:tcW w:type="dxa" w:w="1224"/>
+            <w:tcBorders>
+              <w:top w:val="single" w:sz="6" w:color="D9D9D9"/>
+              <w:left w:val="single" w:sz="6" w:color="D9D9D9"/>
+              <w:bottom w:val="single" w:sz="6" w:color="D9D9D9"/>
+              <w:right w:val="single" w:sz="6" w:color="D9D9D9"/>
+              <w:insideH w:val="single" w:sz="6" w:color="D9D9D9"/>
+              <w:insideV w:val="single" w:sz="6" w:color="D9D9D9"/>
+            </w:tcBorders>
+            <w:vAlign w:val="center"/>
+          </w:tcPr>
+          <w:p>
+            <w:pPr>
+              <w:spacing w:after="60"/>
+            </w:pPr>
+            <w:r>
+              <w:rPr>
+                <w:sz w:val="17"/>
+              </w:rPr>
+              <w:t>RNF-05</w:t>
+            </w:r>
+          </w:p>
+        </w:tc>
+        <w:tc>
+          <w:tcPr>
+            <w:tcW w:type="dxa" w:w="8640"/>
+            <w:tcBorders>
+              <w:top w:val="single" w:sz="6" w:color="D9D9D9"/>
+              <w:left w:val="single" w:sz="6" w:color="D9D9D9"/>
+              <w:bottom w:val="single" w:sz="6" w:color="D9D9D9"/>
+              <w:right w:val="single" w:sz="6" w:color="D9D9D9"/>
+              <w:insideH w:val="single" w:sz="6" w:color="D9D9D9"/>
+              <w:insideV w:val="single" w:sz="6" w:color="D9D9D9"/>
+            </w:tcBorders>
+            <w:vAlign w:val="center"/>
+          </w:tcPr>
+          <w:p>
+            <w:pPr>
+              <w:spacing w:after="60"/>
+            </w:pPr>
+            <w:r>
+              <w:rPr>
+                <w:sz w:val="17"/>
+              </w:rPr>
+              <w:t>Las imágenes tendrán texto alternativo y los formularios utilizarán etiquetas asociadas.</w:t>
+            </w:r>
+          </w:p>
+        </w:tc>
+      </w:tr>
+      <w:tr>
+        <w:tc>
+          <w:tcPr>
+            <w:tcW w:type="dxa" w:w="1224"/>
+            <w:shd w:fill="EAF6F6"/>
+            <w:tcBorders>
+              <w:top w:val="single" w:sz="6" w:color="D9D9D9"/>
+              <w:left w:val="single" w:sz="6" w:color="D9D9D9"/>
+              <w:bottom w:val="single" w:sz="6" w:color="D9D9D9"/>
+              <w:right w:val="single" w:sz="6" w:color="D9D9D9"/>
+              <w:insideH w:val="single" w:sz="6" w:color="D9D9D9"/>
+              <w:insideV w:val="single" w:sz="6" w:color="D9D9D9"/>
+            </w:tcBorders>
+            <w:vAlign w:val="center"/>
+          </w:tcPr>
+          <w:p>
+            <w:pPr>
+              <w:spacing w:after="60"/>
+            </w:pPr>
+            <w:r>
+              <w:rPr>
+                <w:sz w:val="17"/>
+              </w:rPr>
+              <w:t>RNF-06</w:t>
+            </w:r>
+          </w:p>
+        </w:tc>
+        <w:tc>
+          <w:tcPr>
+            <w:tcW w:type="dxa" w:w="8640"/>
+            <w:shd w:fill="EAF6F6"/>
+            <w:tcBorders>
+              <w:top w:val="single" w:sz="6" w:color="D9D9D9"/>
+              <w:left w:val="single" w:sz="6" w:color="D9D9D9"/>
+              <w:bottom w:val="single" w:sz="6" w:color="D9D9D9"/>
+              <w:right w:val="single" w:sz="6" w:color="D9D9D9"/>
+              <w:insideH w:val="single" w:sz="6" w:color="D9D9D9"/>
+              <w:insideV w:val="single" w:sz="6" w:color="D9D9D9"/>
+            </w:tcBorders>
+            <w:vAlign w:val="center"/>
+          </w:tcPr>
+          <w:p>
+            <w:pPr>
+              <w:spacing w:after="60"/>
+            </w:pPr>
+            <w:r>
+              <w:rPr>
+                <w:sz w:val="17"/>
+              </w:rPr>
+              <w:t>El proyecto podrá ejecutarse localmente mediante Apache en XAMPP.</w:t>
+            </w:r>
+          </w:p>
+        </w:tc>
+      </w:tr>
+      <w:tr>
+        <w:tc>
+          <w:tcPr>
+            <w:tcW w:type="dxa" w:w="1224"/>
+            <w:tcBorders>
+              <w:top w:val="single" w:sz="6" w:color="D9D9D9"/>
+              <w:left w:val="single" w:sz="6" w:color="D9D9D9"/>
+              <w:bottom w:val="single" w:sz="6" w:color="D9D9D9"/>
+              <w:right w:val="single" w:sz="6" w:color="D9D9D9"/>
+              <w:insideH w:val="single" w:sz="6" w:color="D9D9D9"/>
+              <w:insideV w:val="single" w:sz="6" w:color="D9D9D9"/>
+            </w:tcBorders>
+            <w:vAlign w:val="center"/>
+          </w:tcPr>
+          <w:p>
+            <w:pPr>
+              <w:spacing w:after="60"/>
+            </w:pPr>
+            <w:r>
+              <w:rPr>
+                <w:sz w:val="17"/>
+              </w:rPr>
+              <w:t>RNF-07</w:t>
+            </w:r>
+          </w:p>
+        </w:tc>
+        <w:tc>
+          <w:tcPr>
+            <w:tcW w:type="dxa" w:w="8640"/>
+            <w:tcBorders>
+              <w:top w:val="single" w:sz="6" w:color="D9D9D9"/>
+              <w:left w:val="single" w:sz="6" w:color="D9D9D9"/>
+              <w:bottom w:val="single" w:sz="6" w:color="D9D9D9"/>
+              <w:right w:val="single" w:sz="6" w:color="D9D9D9"/>
+              <w:insideH w:val="single" w:sz="6" w:color="D9D9D9"/>
+              <w:insideV w:val="single" w:sz="6" w:color="D9D9D9"/>
+            </w:tcBorders>
+            <w:vAlign w:val="center"/>
+          </w:tcPr>
+          <w:p>
+            <w:pPr>
+              <w:spacing w:after="60"/>
+            </w:pPr>
+            <w:r>
+              <w:rPr>
+                <w:sz w:val="17"/>
+              </w:rPr>
+              <w:t>La navegación y los mensajes deberán ser claros y consistentes en todas las páginas.</w:t>
+            </w:r>
+          </w:p>
+        </w:tc>
+      </w:tr>
+      <w:tr>
+        <w:tc>
+          <w:tcPr>
+            <w:tcW w:type="dxa" w:w="1224"/>
+            <w:shd w:fill="EAF6F6"/>
+            <w:tcBorders>
+              <w:top w:val="single" w:sz="6" w:color="D9D9D9"/>
+              <w:left w:val="single" w:sz="6" w:color="D9D9D9"/>
+              <w:bottom w:val="single" w:sz="6" w:color="D9D9D9"/>
+              <w:right w:val="single" w:sz="6" w:color="D9D9D9"/>
+              <w:insideH w:val="single" w:sz="6" w:color="D9D9D9"/>
+              <w:insideV w:val="single" w:sz="6" w:color="D9D9D9"/>
+            </w:tcBorders>
+            <w:vAlign w:val="center"/>
+          </w:tcPr>
+          <w:p>
+            <w:pPr>
+              <w:spacing w:after="60"/>
+            </w:pPr>
+            <w:r>
+              <w:rPr>
+                <w:sz w:val="17"/>
+              </w:rPr>
+              <w:t>RNF-08</w:t>
+            </w:r>
+          </w:p>
+        </w:tc>
+        <w:tc>
+          <w:tcPr>
+            <w:tcW w:type="dxa" w:w="8640"/>
+            <w:shd w:fill="EAF6F6"/>
+            <w:tcBorders>
+              <w:top w:val="single" w:sz="6" w:color="D9D9D9"/>
+              <w:left w:val="single" w:sz="6" w:color="D9D9D9"/>
+              <w:bottom w:val="single" w:sz="6" w:color="D9D9D9"/>
+              <w:right w:val="single" w:sz="6" w:color="D9D9D9"/>
+              <w:insideH w:val="single" w:sz="6" w:color="D9D9D9"/>
+              <w:insideV w:val="single" w:sz="6" w:color="D9D9D9"/>
+            </w:tcBorders>
+            <w:vAlign w:val="center"/>
+          </w:tcPr>
+          <w:p>
+            <w:pPr>
+              <w:spacing w:after="60"/>
+            </w:pPr>
+            <w:r>
+              <w:rPr>
+                <w:sz w:val="17"/>
+              </w:rPr>
+              <w:t>El proyecto utilizará HTML, CSS y JavaScript sin requerir una base de datos en esta versión.</w:t>
+            </w:r>
+          </w:p>
+        </w:tc>
+      </w:tr>
+    </w:tbl>
+    <w:p>
+      <w:pPr>
+        <w:spacing w:after="80"/>
+      </w:pPr>
+    </w:p>
+    <w:p>
+      <w:pPr>
+        <w:pStyle w:val="Ttulo1"/>
+        <w:spacing w:after="80"/>
+      </w:pPr>
+      <w:r>
+        <w:t>4 Herramientas y tecnologías</w:t>
+      </w:r>
+    </w:p>
+    <w:p>
+      <w:pPr>
+        <w:spacing w:after="80"/>
+        <w:ind w:left="360" w:hanging="259"/>
+      </w:pPr>
+      <w:r>
+        <w:t xml:space="preserve">• </w:t>
+      </w:r>
+      <w:r>
+        <w:t>Visual Studio Code para edición del proyecto.</w:t>
+      </w:r>
+    </w:p>
+    <w:p>
+      <w:pPr>
+        <w:spacing w:after="80"/>
+        <w:ind w:left="360" w:hanging="259"/>
+      </w:pPr>
+      <w:r>
+        <w:t xml:space="preserve">• </w:t>
+      </w:r>
+      <w:r>
+        <w:t>HTML5 para estructura y contenido.</w:t>
+      </w:r>
+    </w:p>
+    <w:p>
+      <w:pPr>
+        <w:spacing w:after="80"/>
+        <w:ind w:left="360" w:hanging="259"/>
+      </w:pPr>
+      <w:r>
+        <w:t xml:space="preserve">• </w:t>
+      </w:r>
+      <w:r>
+        <w:t>CSS3 externo para diseño y adaptación a diferentes pantallas.</w:t>
+      </w:r>
+    </w:p>
+    <w:p>
+      <w:pPr>
+        <w:spacing w:after="80"/>
+        <w:ind w:left="360" w:hanging="259"/>
+      </w:pPr>
+      <w:r>
+        <w:t xml:space="preserve">• </w:t>
+      </w:r>
+      <w:r>
+        <w:t>JavaScript para validaciones, catálogo, carrito, registro e inicio de sesión.</w:t>
+      </w:r>
+    </w:p>
+    <w:p>
+      <w:pPr>
+        <w:spacing w:after="80"/>
+        <w:ind w:left="360" w:hanging="259"/>
+      </w:pPr>
+      <w:r>
+        <w:t xml:space="preserve">• </w:t>
+      </w:r>
+      <w:r>
+        <w:t>localStorage para conservar temporalmente carrito, usuarios y sesión en el navegador.</w:t>
+      </w:r>
+    </w:p>
+    <w:p>
+      <w:pPr>
+        <w:spacing w:after="80"/>
+        <w:ind w:left="360" w:hanging="259"/>
+      </w:pPr>
+      <w:r>
+        <w:t xml:space="preserve">• </w:t>
+      </w:r>
+      <w:r>
+        <w:t>XAMPP y Apache para ejecutar el sitio en localhost.</w:t>
+      </w:r>
+    </w:p>
+    <w:p>
+      <w:pPr>
+        <w:spacing w:after="80"/>
+        <w:ind w:left="360" w:hanging="259"/>
+      </w:pPr>
+      <w:r>
+        <w:t xml:space="preserve">• </w:t>
+      </w:r>
+      <w:r>
+        <w:t>Git y GitHub para control de versiones y trabajo colaborativo.</w:t>
+      </w:r>
+    </w:p>
+    <w:p>
+      <w:pPr>
+        <w:pStyle w:val="Ttulo1"/>
+        <w:spacing w:after="80"/>
+      </w:pPr>
+      <w:r>
+        <w:t>5 Propuesta de solución</w:t>
+      </w:r>
+    </w:p>
+    <w:p>
+      <w:pPr>
+        <w:spacing w:after="80"/>
+      </w:pPr>
+      <w:r>
+        <w:t>Se propone una interfaz en tonos turquesa asociada a salud y confianza. La información se distribuye en páginas interconectadas. El catálogo permite seleccionar tratamientos y calcular un total referencial. El registro y el inicio de sesión funcionan como una demostración frontend. Los formularios entregan mensajes claros antes de aceptar los datos.</w:t>
+      </w:r>
+    </w:p>
+    <w:p>
+      <w:pPr>
+        <w:pStyle w:val="Ttulo1"/>
+        <w:spacing w:after="80"/>
+      </w:pPr>
+      <w:r>
+        <w:t>6 Restricciones</w:t>
+      </w:r>
+    </w:p>
+    <w:p>
+      <w:pPr>
+        <w:spacing w:after="80"/>
+        <w:ind w:left="360" w:hanging="259"/>
+      </w:pPr>
+      <w:r>
+        <w:t xml:space="preserve">• </w:t>
+      </w:r>
+      <w:r>
+        <w:t>El sitio no utiliza una base de datos ni un servidor de autenticación.</w:t>
+      </w:r>
+    </w:p>
+    <w:p>
+      <w:pPr>
+        <w:spacing w:after="80"/>
+        <w:ind w:left="360" w:hanging="259"/>
+      </w:pPr>
+      <w:r>
+        <w:t xml:space="preserve">• </w:t>
+      </w:r>
+      <w:r>
+        <w:t>Los usuarios, contraseñas, sesión y carrito se almacenan únicamente en localStorage con fines académicos.</w:t>
+      </w:r>
+    </w:p>
+    <w:p>
+      <w:pPr>
+        <w:spacing w:after="80"/>
+        <w:ind w:left="360" w:hanging="259"/>
+      </w:pPr>
+      <w:r>
+        <w:t xml:space="preserve">• </w:t>
+      </w:r>
+      <w:r>
+        <w:t>El inicio de sesión no representa un mecanismo seguro para un sistema real.</w:t>
+      </w:r>
+    </w:p>
+    <w:p>
+      <w:pPr>
+        <w:spacing w:after="80"/>
+        <w:ind w:left="360" w:hanging="259"/>
+      </w:pPr>
+      <w:r>
+        <w:t xml:space="preserve">• </w:t>
+      </w:r>
+      <w:r>
+        <w:t>El formulario no envía correos ni confirma horas reales.</w:t>
+      </w:r>
+    </w:p>
+    <w:p>
+      <w:pPr>
+        <w:spacing w:after="80"/>
+        <w:ind w:left="360" w:hanging="259"/>
+      </w:pPr>
+      <w:r>
+        <w:t xml:space="preserve">• </w:t>
+      </w:r>
+      <w:r>
+        <w:t>Los precios son referenciales y pertenecen a una clínica ficticia.</w:t>
+      </w:r>
+    </w:p>
+    <w:p>
+      <w:pPr>
+        <w:spacing w:after="80"/>
+        <w:ind w:left="360" w:hanging="259"/>
+      </w:pPr>
+      <w:r>
+        <w:t xml:space="preserve">• </w:t>
+      </w:r>
+      <w:r>
+        <w:t>El video requiere conexión a Internet para reproducirse.</w:t>
+      </w:r>
+    </w:p>
+    <w:p>
+      <w:pPr>
+        <w:pStyle w:val="Ttulo1"/>
+        <w:spacing w:after="80"/>
+      </w:pPr>
+      <w:r>
+        <w:t>7 Mejoras futuras</w:t>
+      </w:r>
+    </w:p>
+    <w:p>
+      <w:pPr>
+        <w:spacing w:after="80"/>
+        <w:ind w:left="360" w:hanging="259"/>
+      </w:pPr>
+      <w:r>
+        <w:t xml:space="preserve">• </w:t>
+      </w:r>
+      <w:r>
+        <w:t>Agregar una base de datos para usuarios, reservas y tratamientos.</w:t>
+      </w:r>
+    </w:p>
+    <w:p>
+      <w:pPr>
+        <w:spacing w:after="80"/>
+        <w:ind w:left="360" w:hanging="259"/>
+      </w:pPr>
+      <w:r>
+        <w:t xml:space="preserve">• </w:t>
+      </w:r>
+      <w:r>
+        <w:t>Implementar autenticación segura, recuperación de contraseña, perfiles de usuario y una vista administrativa.</w:t>
+      </w:r>
+    </w:p>
+    <w:p>
+      <w:pPr>
+        <w:spacing w:after="80"/>
+        <w:ind w:left="360" w:hanging="259"/>
+      </w:pPr>
+      <w:r>
+        <w:t xml:space="preserve">• </w:t>
+      </w:r>
+      <w:r>
+        <w:t>Mostrar horas disponibles en tiempo real y enviar confirmaciones por correo.</w:t>
+      </w:r>
+    </w:p>
     <w:sectPr>
       <w:pgSz w:w="12240" w:h="15840"/>
-      <w:pgMar w:top="1417" w:right="1701" w:bottom="1417" w:left="1701" w:header="708" w:footer="708" w:gutter="0"/>
+      <w:pgMar w:top="792" w:right="1008" w:bottom="792" w:left="1008" w:header="708" w:footer="708" w:gutter="0"/>
       <w:cols w:space="708"/>
       <w:docGrid w:linePitch="360"/>
     </w:sectPr>
@@ -725,6 +2054,10 @@
   <w:style w:type="paragraph" w:default="1" w:styleId="Normal">
     <w:name w:val="Normal"/>
     <w:qFormat/>
+    <w:rPr>
+      <w:rFonts w:ascii="Arial" w:hAnsi="Arial"/>
+      <w:sz w:val="20"/>
+    </w:rPr>
   </w:style>
   <w:style w:type="paragraph" w:styleId="Ttulo1">
     <w:name w:val="heading 1"/>
@@ -741,8 +2074,8 @@
       <w:outlineLvl w:val="0"/>
     </w:pPr>
     <w:rPr>
-      <w:rFonts w:asciiTheme="majorHAnsi" w:eastAsiaTheme="majorEastAsia" w:hAnsiTheme="majorHAnsi" w:cstheme="majorBidi"/>
-      <w:color w:val="0F4761" w:themeColor="accent1" w:themeShade="BF"/>
+      <w:rFonts w:asciiTheme="majorHAnsi" w:eastAsiaTheme="majorEastAsia" w:hAnsiTheme="majorHAnsi" w:cstheme="majorBidi" w:ascii="Arial" w:hAnsi="Arial"/>
+      <w:color w:val="000000"/>
       <w:sz w:val="40"/>
       <w:szCs w:val="40"/>
     </w:rPr>
@@ -764,8 +2097,8 @@
       <w:outlineLvl w:val="1"/>
     </w:pPr>
     <w:rPr>
-      <w:rFonts w:asciiTheme="majorHAnsi" w:eastAsiaTheme="majorEastAsia" w:hAnsiTheme="majorHAnsi" w:cstheme="majorBidi"/>
-      <w:color w:val="0F4761" w:themeColor="accent1" w:themeShade="BF"/>
+      <w:rFonts w:asciiTheme="majorHAnsi" w:eastAsiaTheme="majorEastAsia" w:hAnsiTheme="majorHAnsi" w:cstheme="majorBidi" w:ascii="Arial" w:hAnsi="Arial"/>
+      <w:color w:val="000000"/>
       <w:sz w:val="32"/>
       <w:szCs w:val="32"/>
     </w:rPr>
@@ -1083,7 +2416,8 @@
       <w:contextualSpacing/>
     </w:pPr>
     <w:rPr>
-      <w:rFonts w:asciiTheme="majorHAnsi" w:eastAsiaTheme="majorEastAsia" w:hAnsiTheme="majorHAnsi" w:cstheme="majorBidi"/>
+      <w:rFonts w:asciiTheme="majorHAnsi" w:eastAsiaTheme="majorEastAsia" w:hAnsiTheme="majorHAnsi" w:cstheme="majorBidi" w:ascii="Arial" w:hAnsi="Arial"/>
+      <w:color w:val="000000"/>
       <w:spacing w:val="-10"/>
       <w:kern w:val="28"/>
       <w:sz w:val="56"/>

</xml_diff>

<commit_message>
ajusta proyecto a la pauta de evaluacion
</commit_message>
<xml_diff>
--- a/ERS.docx
+++ b/ERS.docx
@@ -29,7 +29,7 @@
         <w:spacing w:after="80"/>
       </w:pPr>
       <w:r>
-        <w:t>Este documento describe el alcance actual del sitio web frontend de Clínica Aura e incorpora las funciones de catálogo, carrito, registro de usuarios e inicio de sesión implementadas en el proyecto.</w:t>
+        <w:t>Este documento describe el alcance del sitio web frontend de Clínica Aura de acuerdo con los requerimientos de la Evaluación Parcial 1.</w:t>
       </w:r>
     </w:p>
     <w:p>
@@ -72,7 +72,7 @@
         <w:spacing w:after="80"/>
       </w:pPr>
       <w:r>
-        <w:t>El sitio permite conocer la clínica, revisar tratamientos, consultar precios referenciales, preparar un pedido, registrar usuarios, iniciar sesión y enviar una solicitud de reserva. Los datos se almacenan solamente en el navegador.</w:t>
+        <w:t>El sitio permite conocer la clínica, revisar tratamientos y precios referenciales, reproducir un video educativo y completar un formulario para solicitar una reserva.</w:t>
       </w:r>
     </w:p>
     <w:p>
@@ -89,7 +89,7 @@
         <w:spacing w:after="80"/>
       </w:pPr>
       <w:r>
-        <w:t>Personas mayores de edad interesadas en servicios dentales o faciales que desean informarse, estimar tratamientos o solicitar una evaluación.</w:t>
+        <w:t>Personas interesadas en servicios dentales o faciales que desean informarse o solicitar una evaluación.</w:t>
       </w:r>
     </w:p>
     <w:p>
@@ -208,7 +208,7 @@
               <w:rPr>
                 <w:sz w:val="17"/>
               </w:rPr>
-              <w:t>El usuario podrá navegar entre Inicio, Nosotros, Tratamientos, Mi pedido, Reserva, Ingresar y Registro.</w:t>
+              <w:t>El usuario podrá navegar entre Inicio, Nosotros, Tratamientos y Reserva.</w:t>
             </w:r>
           </w:p>
         </w:tc>
@@ -581,324 +581,6 @@
                 <w:sz w:val="17"/>
               </w:rPr>
               <w:t>El botón Limpiar eliminará los datos, mensajes e indicadores visuales del formulario.</w:t>
-            </w:r>
-          </w:p>
-        </w:tc>
-      </w:tr>
-      <w:tr>
-        <w:tc>
-          <w:tcPr>
-            <w:tcW w:type="dxa" w:w="1224"/>
-            <w:tcBorders>
-              <w:top w:val="single" w:sz="6" w:color="D9D9D9"/>
-              <w:left w:val="single" w:sz="6" w:color="D9D9D9"/>
-              <w:bottom w:val="single" w:sz="6" w:color="D9D9D9"/>
-              <w:right w:val="single" w:sz="6" w:color="D9D9D9"/>
-              <w:insideH w:val="single" w:sz="6" w:color="D9D9D9"/>
-              <w:insideV w:val="single" w:sz="6" w:color="D9D9D9"/>
-            </w:tcBorders>
-            <w:vAlign w:val="center"/>
-          </w:tcPr>
-          <w:p>
-            <w:pPr>
-              <w:spacing w:after="60"/>
-            </w:pPr>
-            <w:r>
-              <w:rPr>
-                <w:sz w:val="17"/>
-              </w:rPr>
-              <w:t>RF-09</w:t>
-            </w:r>
-          </w:p>
-        </w:tc>
-        <w:tc>
-          <w:tcPr>
-            <w:tcW w:type="dxa" w:w="8640"/>
-            <w:tcBorders>
-              <w:top w:val="single" w:sz="6" w:color="D9D9D9"/>
-              <w:left w:val="single" w:sz="6" w:color="D9D9D9"/>
-              <w:bottom w:val="single" w:sz="6" w:color="D9D9D9"/>
-              <w:right w:val="single" w:sz="6" w:color="D9D9D9"/>
-              <w:insideH w:val="single" w:sz="6" w:color="D9D9D9"/>
-              <w:insideV w:val="single" w:sz="6" w:color="D9D9D9"/>
-            </w:tcBorders>
-            <w:vAlign w:val="center"/>
-          </w:tcPr>
-          <w:p>
-            <w:pPr>
-              <w:spacing w:after="60"/>
-            </w:pPr>
-            <w:r>
-              <w:rPr>
-                <w:sz w:val="17"/>
-              </w:rPr>
-              <w:t>JavaScript generará el catálogo desde un arreglo de tratamientos.</w:t>
-            </w:r>
-          </w:p>
-        </w:tc>
-      </w:tr>
-      <w:tr>
-        <w:tc>
-          <w:tcPr>
-            <w:tcW w:type="dxa" w:w="1224"/>
-            <w:shd w:fill="EAF6F6"/>
-            <w:tcBorders>
-              <w:top w:val="single" w:sz="6" w:color="D9D9D9"/>
-              <w:left w:val="single" w:sz="6" w:color="D9D9D9"/>
-              <w:bottom w:val="single" w:sz="6" w:color="D9D9D9"/>
-              <w:right w:val="single" w:sz="6" w:color="D9D9D9"/>
-              <w:insideH w:val="single" w:sz="6" w:color="D9D9D9"/>
-              <w:insideV w:val="single" w:sz="6" w:color="D9D9D9"/>
-            </w:tcBorders>
-            <w:vAlign w:val="center"/>
-          </w:tcPr>
-          <w:p>
-            <w:pPr>
-              <w:spacing w:after="60"/>
-            </w:pPr>
-            <w:r>
-              <w:rPr>
-                <w:sz w:val="17"/>
-              </w:rPr>
-              <w:t>RF-10</w:t>
-            </w:r>
-          </w:p>
-        </w:tc>
-        <w:tc>
-          <w:tcPr>
-            <w:tcW w:type="dxa" w:w="8640"/>
-            <w:shd w:fill="EAF6F6"/>
-            <w:tcBorders>
-              <w:top w:val="single" w:sz="6" w:color="D9D9D9"/>
-              <w:left w:val="single" w:sz="6" w:color="D9D9D9"/>
-              <w:bottom w:val="single" w:sz="6" w:color="D9D9D9"/>
-              <w:right w:val="single" w:sz="6" w:color="D9D9D9"/>
-              <w:insideH w:val="single" w:sz="6" w:color="D9D9D9"/>
-              <w:insideV w:val="single" w:sz="6" w:color="D9D9D9"/>
-            </w:tcBorders>
-            <w:vAlign w:val="center"/>
-          </w:tcPr>
-          <w:p>
-            <w:pPr>
-              <w:spacing w:after="60"/>
-            </w:pPr>
-            <w:r>
-              <w:rPr>
-                <w:sz w:val="17"/>
-              </w:rPr>
-              <w:t>El usuario podrá agregar tratamientos al carrito, revisar cantidades, subtotales y total, y eliminar elementos.</w:t>
-            </w:r>
-          </w:p>
-        </w:tc>
-      </w:tr>
-      <w:tr>
-        <w:tc>
-          <w:tcPr>
-            <w:tcW w:type="dxa" w:w="1224"/>
-            <w:tcBorders>
-              <w:top w:val="single" w:sz="6" w:color="D9D9D9"/>
-              <w:left w:val="single" w:sz="6" w:color="D9D9D9"/>
-              <w:bottom w:val="single" w:sz="6" w:color="D9D9D9"/>
-              <w:right w:val="single" w:sz="6" w:color="D9D9D9"/>
-              <w:insideH w:val="single" w:sz="6" w:color="D9D9D9"/>
-              <w:insideV w:val="single" w:sz="6" w:color="D9D9D9"/>
-            </w:tcBorders>
-            <w:vAlign w:val="center"/>
-          </w:tcPr>
-          <w:p>
-            <w:pPr>
-              <w:spacing w:after="60"/>
-            </w:pPr>
-            <w:r>
-              <w:rPr>
-                <w:sz w:val="17"/>
-              </w:rPr>
-              <w:t>RF-11</w:t>
-            </w:r>
-          </w:p>
-        </w:tc>
-        <w:tc>
-          <w:tcPr>
-            <w:tcW w:type="dxa" w:w="8640"/>
-            <w:tcBorders>
-              <w:top w:val="single" w:sz="6" w:color="D9D9D9"/>
-              <w:left w:val="single" w:sz="6" w:color="D9D9D9"/>
-              <w:bottom w:val="single" w:sz="6" w:color="D9D9D9"/>
-              <w:right w:val="single" w:sz="6" w:color="D9D9D9"/>
-              <w:insideH w:val="single" w:sz="6" w:color="D9D9D9"/>
-              <w:insideV w:val="single" w:sz="6" w:color="D9D9D9"/>
-            </w:tcBorders>
-            <w:vAlign w:val="center"/>
-          </w:tcPr>
-          <w:p>
-            <w:pPr>
-              <w:spacing w:after="60"/>
-            </w:pPr>
-            <w:r>
-              <w:rPr>
-                <w:sz w:val="17"/>
-              </w:rPr>
-              <w:t>El carrito se conservará en el navegador mediante localStorage.</w:t>
-            </w:r>
-          </w:p>
-        </w:tc>
-      </w:tr>
-      <w:tr>
-        <w:tc>
-          <w:tcPr>
-            <w:tcW w:type="dxa" w:w="1224"/>
-            <w:shd w:fill="EAF6F6"/>
-            <w:tcBorders>
-              <w:top w:val="single" w:sz="6" w:color="D9D9D9"/>
-              <w:left w:val="single" w:sz="6" w:color="D9D9D9"/>
-              <w:bottom w:val="single" w:sz="6" w:color="D9D9D9"/>
-              <w:right w:val="single" w:sz="6" w:color="D9D9D9"/>
-              <w:insideH w:val="single" w:sz="6" w:color="D9D9D9"/>
-              <w:insideV w:val="single" w:sz="6" w:color="D9D9D9"/>
-            </w:tcBorders>
-            <w:vAlign w:val="center"/>
-          </w:tcPr>
-          <w:p>
-            <w:pPr>
-              <w:spacing w:after="60"/>
-            </w:pPr>
-            <w:r>
-              <w:rPr>
-                <w:sz w:val="17"/>
-              </w:rPr>
-              <w:t>RF-12</w:t>
-            </w:r>
-          </w:p>
-        </w:tc>
-        <w:tc>
-          <w:tcPr>
-            <w:tcW w:type="dxa" w:w="8640"/>
-            <w:shd w:fill="EAF6F6"/>
-            <w:tcBorders>
-              <w:top w:val="single" w:sz="6" w:color="D9D9D9"/>
-              <w:left w:val="single" w:sz="6" w:color="D9D9D9"/>
-              <w:bottom w:val="single" w:sz="6" w:color="D9D9D9"/>
-              <w:right w:val="single" w:sz="6" w:color="D9D9D9"/>
-              <w:insideH w:val="single" w:sz="6" w:color="D9D9D9"/>
-              <w:insideV w:val="single" w:sz="6" w:color="D9D9D9"/>
-            </w:tcBorders>
-            <w:vAlign w:val="center"/>
-          </w:tcPr>
-          <w:p>
-            <w:pPr>
-              <w:spacing w:after="60"/>
-            </w:pPr>
-            <w:r>
-              <w:rPr>
-                <w:sz w:val="17"/>
-              </w:rPr>
-              <w:t>El usuario podrá registrarse con RUN válido sin puntos ni guion, nombre, apellidos, correo, contraseña, región, comuna y dirección.</w:t>
-            </w:r>
-          </w:p>
-        </w:tc>
-      </w:tr>
-      <w:tr>
-        <w:tc>
-          <w:tcPr>
-            <w:tcW w:type="dxa" w:w="1224"/>
-            <w:tcBorders>
-              <w:top w:val="single" w:sz="6" w:color="D9D9D9"/>
-              <w:left w:val="single" w:sz="6" w:color="D9D9D9"/>
-              <w:bottom w:val="single" w:sz="6" w:color="D9D9D9"/>
-              <w:right w:val="single" w:sz="6" w:color="D9D9D9"/>
-              <w:insideH w:val="single" w:sz="6" w:color="D9D9D9"/>
-              <w:insideV w:val="single" w:sz="6" w:color="D9D9D9"/>
-            </w:tcBorders>
-            <w:vAlign w:val="center"/>
-          </w:tcPr>
-          <w:p>
-            <w:pPr>
-              <w:spacing w:after="60"/>
-            </w:pPr>
-            <w:r>
-              <w:rPr>
-                <w:sz w:val="17"/>
-              </w:rPr>
-              <w:t>RF-13</w:t>
-            </w:r>
-          </w:p>
-        </w:tc>
-        <w:tc>
-          <w:tcPr>
-            <w:tcW w:type="dxa" w:w="8640"/>
-            <w:tcBorders>
-              <w:top w:val="single" w:sz="6" w:color="D9D9D9"/>
-              <w:left w:val="single" w:sz="6" w:color="D9D9D9"/>
-              <w:bottom w:val="single" w:sz="6" w:color="D9D9D9"/>
-              <w:right w:val="single" w:sz="6" w:color="D9D9D9"/>
-              <w:insideH w:val="single" w:sz="6" w:color="D9D9D9"/>
-              <w:insideV w:val="single" w:sz="6" w:color="D9D9D9"/>
-            </w:tcBorders>
-            <w:vAlign w:val="center"/>
-          </w:tcPr>
-          <w:p>
-            <w:pPr>
-              <w:spacing w:after="60"/>
-            </w:pPr>
-            <w:r>
-              <w:rPr>
-                <w:sz w:val="17"/>
-              </w:rPr>
-              <w:t>El registro aceptará solamente correos @duoc.cl, @profesor.duoc.cl y @gmail.com, y contraseñas de 4 a 10 caracteres.</w:t>
-            </w:r>
-          </w:p>
-        </w:tc>
-      </w:tr>
-      <w:tr>
-        <w:tc>
-          <w:tcPr>
-            <w:tcW w:type="dxa" w:w="1224"/>
-            <w:shd w:fill="EAF6F6"/>
-            <w:tcBorders>
-              <w:top w:val="single" w:sz="6" w:color="D9D9D9"/>
-              <w:left w:val="single" w:sz="6" w:color="D9D9D9"/>
-              <w:bottom w:val="single" w:sz="6" w:color="D9D9D9"/>
-              <w:right w:val="single" w:sz="6" w:color="D9D9D9"/>
-              <w:insideH w:val="single" w:sz="6" w:color="D9D9D9"/>
-              <w:insideV w:val="single" w:sz="6" w:color="D9D9D9"/>
-            </w:tcBorders>
-            <w:vAlign w:val="center"/>
-          </w:tcPr>
-          <w:p>
-            <w:pPr>
-              <w:spacing w:after="60"/>
-            </w:pPr>
-            <w:r>
-              <w:rPr>
-                <w:sz w:val="17"/>
-              </w:rPr>
-              <w:t>RF-14</w:t>
-            </w:r>
-          </w:p>
-        </w:tc>
-        <w:tc>
-          <w:tcPr>
-            <w:tcW w:type="dxa" w:w="8640"/>
-            <w:shd w:fill="EAF6F6"/>
-            <w:tcBorders>
-              <w:top w:val="single" w:sz="6" w:color="D9D9D9"/>
-              <w:left w:val="single" w:sz="6" w:color="D9D9D9"/>
-              <w:bottom w:val="single" w:sz="6" w:color="D9D9D9"/>
-              <w:right w:val="single" w:sz="6" w:color="D9D9D9"/>
-              <w:insideH w:val="single" w:sz="6" w:color="D9D9D9"/>
-              <w:insideV w:val="single" w:sz="6" w:color="D9D9D9"/>
-            </w:tcBorders>
-            <w:vAlign w:val="center"/>
-          </w:tcPr>
-          <w:p>
-            <w:pPr>
-              <w:spacing w:after="60"/>
-            </w:pPr>
-            <w:r>
-              <w:rPr>
-                <w:sz w:val="17"/>
-              </w:rPr>
-              <w:t>El usuario registrado podrá iniciar sesión con su correo y contraseña; la sesión se guardará en localStorage.</w:t>
             </w:r>
           </w:p>
         </w:tc>
@@ -1462,7 +1144,7 @@
         <w:t xml:space="preserve">• </w:t>
       </w:r>
       <w:r>
-        <w:t>JavaScript para validaciones, catálogo, carrito, registro e inicio de sesión.</w:t>
+        <w:t>JavaScript externo para validar el formulario de reserva.</w:t>
       </w:r>
     </w:p>
     <w:p>
@@ -1474,7 +1156,7 @@
         <w:t xml:space="preserve">• </w:t>
       </w:r>
       <w:r>
-        <w:t>localStorage para conservar temporalmente carrito, usuarios y sesión en el navegador.</w:t>
+        <w:t>XAMPP y Apache para ejecutar el sitio en localhost.</w:t>
       </w:r>
     </w:p>
     <w:p>
@@ -1486,7 +1168,33 @@
         <w:t xml:space="preserve">• </w:t>
       </w:r>
       <w:r>
-        <w:t>XAMPP y Apache para ejecutar el sitio en localhost.</w:t>
+        <w:t>Git y GitHub para control de versiones y trabajo colaborativo.</w:t>
+      </w:r>
+    </w:p>
+    <w:p>
+      <w:pPr>
+        <w:pStyle w:val="Ttulo1"/>
+        <w:spacing w:after="80"/>
+      </w:pPr>
+      <w:r>
+        <w:t>5 Propuesta de solución</w:t>
+      </w:r>
+    </w:p>
+    <w:p>
+      <w:pPr>
+        <w:spacing w:after="80"/>
+      </w:pPr>
+      <w:r>
+        <w:t>Se propone una interfaz en tonos turquesa asociada a salud y confianza. La información se distribuye en páginas interconectadas con estructura semántica HTML5. La hoja CSS externa mantiene un diseño uniforme y responsivo, mientras que JavaScript valida el formulario de reserva y entrega mensajes claros antes de aceptar los datos.</w:t>
+      </w:r>
+    </w:p>
+    <w:p>
+      <w:pPr>
+        <w:pStyle w:val="Ttulo1"/>
+        <w:spacing w:after="80"/>
+      </w:pPr>
+      <w:r>
+        <w:t>6 Restricciones</w:t>
       </w:r>
     </w:p>
     <w:p>
@@ -1498,7 +1206,19 @@
         <w:t xml:space="preserve">• </w:t>
       </w:r>
       <w:r>
-        <w:t>Git y GitHub para control de versiones y trabajo colaborativo.</w:t>
+        <w:t>El formulario no envía correos ni confirma horas reales.</w:t>
+      </w:r>
+    </w:p>
+    <w:p>
+      <w:pPr>
+        <w:spacing w:after="80"/>
+        <w:ind w:left="360" w:hanging="259"/>
+      </w:pPr>
+      <w:r>
+        <w:t xml:space="preserve">• </w:t>
+      </w:r>
+      <w:r>
+        <w:t>Los precios son referenciales y el video requiere conexión a Internet para reproducirse.</w:t>
       </w:r>
     </w:p>
     <w:p>
@@ -1507,24 +1227,7 @@
         <w:spacing w:after="80"/>
       </w:pPr>
       <w:r>
-        <w:t>5 Propuesta de solución</w:t>
-      </w:r>
-    </w:p>
-    <w:p>
-      <w:pPr>
-        <w:spacing w:after="80"/>
-      </w:pPr>
-      <w:r>
-        <w:t>Se propone una interfaz en tonos turquesa asociada a salud y confianza. La información se distribuye en páginas interconectadas. El catálogo permite seleccionar tratamientos y calcular un total referencial. El registro y el inicio de sesión funcionan como una demostración frontend. Los formularios entregan mensajes claros antes de aceptar los datos.</w:t>
-      </w:r>
-    </w:p>
-    <w:p>
-      <w:pPr>
-        <w:pStyle w:val="Ttulo1"/>
-        <w:spacing w:after="80"/>
-      </w:pPr>
-      <w:r>
-        <w:t>6 Restricciones</w:t>
+        <w:t>7 Mejoras futuras</w:t>
       </w:r>
     </w:p>
     <w:p>
@@ -1536,100 +1239,7 @@
         <w:t xml:space="preserve">• </w:t>
       </w:r>
       <w:r>
-        <w:t>El sitio no utiliza una base de datos ni un servidor de autenticación.</w:t>
-      </w:r>
-    </w:p>
-    <w:p>
-      <w:pPr>
-        <w:spacing w:after="80"/>
-        <w:ind w:left="360" w:hanging="259"/>
-      </w:pPr>
-      <w:r>
-        <w:t xml:space="preserve">• </w:t>
-      </w:r>
-      <w:r>
-        <w:t>Los usuarios, contraseñas, sesión y carrito se almacenan únicamente en localStorage con fines académicos.</w:t>
-      </w:r>
-    </w:p>
-    <w:p>
-      <w:pPr>
-        <w:spacing w:after="80"/>
-        <w:ind w:left="360" w:hanging="259"/>
-      </w:pPr>
-      <w:r>
-        <w:t xml:space="preserve">• </w:t>
-      </w:r>
-      <w:r>
-        <w:t>El inicio de sesión no representa un mecanismo seguro para un sistema real.</w:t>
-      </w:r>
-    </w:p>
-    <w:p>
-      <w:pPr>
-        <w:spacing w:after="80"/>
-        <w:ind w:left="360" w:hanging="259"/>
-      </w:pPr>
-      <w:r>
-        <w:t xml:space="preserve">• </w:t>
-      </w:r>
-      <w:r>
-        <w:t>El formulario no envía correos ni confirma horas reales.</w:t>
-      </w:r>
-    </w:p>
-    <w:p>
-      <w:pPr>
-        <w:spacing w:after="80"/>
-        <w:ind w:left="360" w:hanging="259"/>
-      </w:pPr>
-      <w:r>
-        <w:t xml:space="preserve">• </w:t>
-      </w:r>
-      <w:r>
-        <w:t>Los precios son referenciales y pertenecen a una clínica ficticia.</w:t>
-      </w:r>
-    </w:p>
-    <w:p>
-      <w:pPr>
-        <w:spacing w:after="80"/>
-        <w:ind w:left="360" w:hanging="259"/>
-      </w:pPr>
-      <w:r>
-        <w:t xml:space="preserve">• </w:t>
-      </w:r>
-      <w:r>
-        <w:t>El video requiere conexión a Internet para reproducirse.</w:t>
-      </w:r>
-    </w:p>
-    <w:p>
-      <w:pPr>
-        <w:pStyle w:val="Ttulo1"/>
-        <w:spacing w:after="80"/>
-      </w:pPr>
-      <w:r>
-        <w:t>7 Mejoras futuras</w:t>
-      </w:r>
-    </w:p>
-    <w:p>
-      <w:pPr>
-        <w:spacing w:after="80"/>
-        <w:ind w:left="360" w:hanging="259"/>
-      </w:pPr>
-      <w:r>
-        <w:t xml:space="preserve">• </w:t>
-      </w:r>
-      <w:r>
-        <w:t>Agregar una base de datos para usuarios, reservas y tratamientos.</w:t>
-      </w:r>
-    </w:p>
-    <w:p>
-      <w:pPr>
-        <w:spacing w:after="80"/>
-        <w:ind w:left="360" w:hanging="259"/>
-      </w:pPr>
-      <w:r>
-        <w:t xml:space="preserve">• </w:t>
-      </w:r>
-      <w:r>
-        <w:t>Implementar autenticación segura, recuperación de contraseña, perfiles de usuario y una vista administrativa.</w:t>
+        <w:t>Agregar una base de datos para reservas y tratamientos.</w:t>
       </w:r>
     </w:p>
     <w:p>
@@ -2261,6 +1871,7 @@
   <w:style w:type="character" w:default="1" w:styleId="Fuentedeprrafopredeter">
     <w:name w:val="Default Paragraph Font"/>
     <w:uiPriority w:val="1"/>
+    <w:semiHidden/>
     <w:unhideWhenUsed/>
   </w:style>
   <w:style w:type="table" w:default="1" w:styleId="Tablanormal">

</xml_diff>

<commit_message>
Documentacion: actualizar ERS a version 2
</commit_message>
<xml_diff>
--- a/ERS.docx
+++ b/ERS.docx
@@ -9,7 +9,7 @@
         <w:jc w:val="center"/>
       </w:pPr>
       <w:r>
-        <w:t>ERS Clínica Aura</w:t>
+        <w:t>ERS Cl?nica Aura</w:t>
       </w:r>
     </w:p>
     <w:p>
@@ -18,18 +18,15 @@
         <w:jc w:val="center"/>
       </w:pPr>
       <w:r>
-        <w:rPr>
-          <w:b/>
-        </w:rPr>
-        <w:t>Especificación de Requisitos del Software - Versión 1 actualizada</w:t>
-      </w:r>
-    </w:p>
-    <w:p>
-      <w:pPr>
-        <w:spacing w:after="80"/>
-      </w:pPr>
-      <w:r>
-        <w:t>Este documento describe el alcance del sitio web frontend de Clínica Aura de acuerdo con los requerimientos de la Evaluación Parcial 1.</w:t>
+        <w:t>Especificaci?n de Requisitos del Software - Versi?n 2</w:t>
+      </w:r>
+    </w:p>
+    <w:p>
+      <w:pPr>
+        <w:spacing w:after="80"/>
+      </w:pPr>
+      <w:r>
+        <w:t>Este documento describe los requisitos implementados en el frontend de Cl?nica Aura para la Evaluaci?n Parcial 2. El alcance se limita a las funciones disponibles en el proyecto actual.</w:t>
       </w:r>
     </w:p>
     <w:p>
@@ -38,7 +35,7 @@
         <w:spacing w:after="80"/>
       </w:pPr>
       <w:r>
-        <w:t>1 Introducción</w:t>
+        <w:t>1 Introducci?n</w:t>
       </w:r>
     </w:p>
     <w:p>
@@ -47,15 +44,15 @@
         <w:spacing w:after="80"/>
       </w:pPr>
       <w:r>
-        <w:t>1.1 Propósito</w:t>
-      </w:r>
-    </w:p>
-    <w:p>
-      <w:pPr>
-        <w:spacing w:after="80"/>
-      </w:pPr>
-      <w:r>
-        <w:t>Definir los requisitos de la primera versión del sitio web de Clínica Aura, una clínica ficticia dedicada a la salud dental y la armonización facial. El documento está dirigido al equipo de desarrollo y al docente evaluador.</w:t>
+        <w:t>1.1 Prop?sito</w:t>
+      </w:r>
+    </w:p>
+    <w:p>
+      <w:pPr>
+        <w:spacing w:after="80"/>
+      </w:pPr>
+      <w:r>
+        <w:t>Definir los requisitos funcionales y no funcionales del sitio web frontend de Cl?nica Aura, una cl?nica ficticia dedicada a la salud dental y la armonizaci?n facial. El documento sirve como referencia para el desarrollo, las pruebas y la evaluaci?n del proyecto.</w:t>
       </w:r>
     </w:p>
     <w:p>
@@ -72,7 +69,7 @@
         <w:spacing w:after="80"/>
       </w:pPr>
       <w:r>
-        <w:t>El sitio permite conocer la clínica, revisar tratamientos y precios referenciales, reproducir un video educativo y completar un formulario para solicitar una reserva.</w:t>
+        <w:t>El sitio permite navegar por la informaci?n de la cl?nica, consultar un cat?logo de tratamientos obtenido desde una API simulada, seleccionar un tratamiento y completar un formulario de solicitud de reserva con validaciones y mensajes de resultado.</w:t>
       </w:r>
     </w:p>
     <w:p>
@@ -81,15 +78,15 @@
         <w:spacing w:after="80"/>
       </w:pPr>
       <w:r>
-        <w:t>1.3 Público objetivo</w:t>
-      </w:r>
-    </w:p>
-    <w:p>
-      <w:pPr>
-        <w:spacing w:after="80"/>
-      </w:pPr>
-      <w:r>
-        <w:t>Personas interesadas en servicios dentales o faciales que desean informarse o solicitar una evaluación.</w:t>
+        <w:t>1.3 P?blico objetivo</w:t>
+      </w:r>
+    </w:p>
+    <w:p>
+      <w:pPr>
+        <w:spacing w:after="80"/>
+      </w:pPr>
+      <w:r>
+        <w:t>Personas interesadas en servicios dentales o faciales que desean informarse, revisar tratamientos o solicitar una evaluaci?n.</w:t>
       </w:r>
     </w:p>
     <w:p>
@@ -128,11 +125,7 @@
           </w:tcPr>
           <w:p>
             <w:r>
-              <w:rPr>
-                <w:b/>
-                <w:color w:val="FFFFFF"/>
-              </w:rPr>
-              <w:t>Código</w:t>
+              <w:t>C?digo</w:t>
             </w:r>
           </w:p>
         </w:tc>
@@ -152,10 +145,6 @@
           </w:tcPr>
           <w:p>
             <w:r>
-              <w:rPr>
-                <w:b/>
-                <w:color w:val="FFFFFF"/>
-              </w:rPr>
               <w:t>Requerimiento</w:t>
             </w:r>
           </w:p>
@@ -176,13 +165,7 @@
             <w:vAlign w:val="center"/>
           </w:tcPr>
           <w:p>
-            <w:pPr>
-              <w:spacing w:after="60"/>
-            </w:pPr>
-            <w:r>
-              <w:rPr>
-                <w:sz w:val="17"/>
-              </w:rPr>
+            <w:r>
               <w:t>RF-01</w:t>
             </w:r>
           </w:p>
@@ -201,14 +184,8 @@
             <w:vAlign w:val="center"/>
           </w:tcPr>
           <w:p>
-            <w:pPr>
-              <w:spacing w:after="60"/>
-            </w:pPr>
-            <w:r>
-              <w:rPr>
-                <w:sz w:val="17"/>
-              </w:rPr>
-              <w:t>El usuario podrá navegar entre Inicio, Nosotros, Tratamientos y Reserva.</w:t>
+            <w:r>
+              <w:t>El usuario podr? navegar entre Inicio, Nosotros, Tratamientos, Reserva y Contacto.</w:t>
             </w:r>
           </w:p>
         </w:tc>
@@ -229,13 +206,7 @@
             <w:vAlign w:val="center"/>
           </w:tcPr>
           <w:p>
-            <w:pPr>
-              <w:spacing w:after="60"/>
-            </w:pPr>
-            <w:r>
-              <w:rPr>
-                <w:sz w:val="17"/>
-              </w:rPr>
+            <w:r>
               <w:t>RF-02</w:t>
             </w:r>
           </w:p>
@@ -255,14 +226,8 @@
             <w:vAlign w:val="center"/>
           </w:tcPr>
           <w:p>
-            <w:pPr>
-              <w:spacing w:after="60"/>
-            </w:pPr>
-            <w:r>
-              <w:rPr>
-                <w:sz w:val="17"/>
-              </w:rPr>
-              <w:t>El usuario podrá revisar tratamientos dentales, estéticos y faciales.</w:t>
+            <w:r>
+              <w:t>El sistema consultar? los tratamientos mediante la API simulada local.</w:t>
             </w:r>
           </w:p>
         </w:tc>
@@ -282,13 +247,7 @@
             <w:vAlign w:val="center"/>
           </w:tcPr>
           <w:p>
-            <w:pPr>
-              <w:spacing w:after="60"/>
-            </w:pPr>
-            <w:r>
-              <w:rPr>
-                <w:sz w:val="17"/>
-              </w:rPr>
+            <w:r>
               <w:t>RF-03</w:t>
             </w:r>
           </w:p>
@@ -307,14 +266,8 @@
             <w:vAlign w:val="center"/>
           </w:tcPr>
           <w:p>
-            <w:pPr>
-              <w:spacing w:after="60"/>
-            </w:pPr>
-            <w:r>
-              <w:rPr>
-                <w:sz w:val="17"/>
-              </w:rPr>
-              <w:t>El sitio mostrará imágenes, descripciones y precios referenciales de los tratamientos.</w:t>
+            <w:r>
+              <w:t>El cat?logo mostrar? nombre, descripci?n, imagen y precio referencial de cada tratamiento.</w:t>
             </w:r>
           </w:p>
         </w:tc>
@@ -335,13 +288,7 @@
             <w:vAlign w:val="center"/>
           </w:tcPr>
           <w:p>
-            <w:pPr>
-              <w:spacing w:after="60"/>
-            </w:pPr>
-            <w:r>
-              <w:rPr>
-                <w:sz w:val="17"/>
-              </w:rPr>
+            <w:r>
               <w:t>RF-04</w:t>
             </w:r>
           </w:p>
@@ -361,14 +308,8 @@
             <w:vAlign w:val="center"/>
           </w:tcPr>
           <w:p>
-            <w:pPr>
-              <w:spacing w:after="60"/>
-            </w:pPr>
-            <w:r>
-              <w:rPr>
-                <w:sz w:val="17"/>
-              </w:rPr>
-              <w:t>El usuario podrá reproducir un video educativo desde la página de inicio.</w:t>
+            <w:r>
+              <w:t>El sistema informar? estados de carga, lista vac?a y error cuando corresponda.</w:t>
             </w:r>
           </w:p>
         </w:tc>
@@ -388,13 +329,7 @@
             <w:vAlign w:val="center"/>
           </w:tcPr>
           <w:p>
-            <w:pPr>
-              <w:spacing w:after="60"/>
-            </w:pPr>
-            <w:r>
-              <w:rPr>
-                <w:sz w:val="17"/>
-              </w:rPr>
+            <w:r>
               <w:t>RF-05</w:t>
             </w:r>
           </w:p>
@@ -413,14 +348,8 @@
             <w:vAlign w:val="center"/>
           </w:tcPr>
           <w:p>
-            <w:pPr>
-              <w:spacing w:after="60"/>
-            </w:pPr>
-            <w:r>
-              <w:rPr>
-                <w:sz w:val="17"/>
-              </w:rPr>
-              <w:t>El usuario podrá completar un formulario para solicitar una reserva.</w:t>
+            <w:r>
+              <w:t>El usuario podr? seleccionar un solo tratamiento y acceder a Reserva con ese tratamiento.</w:t>
             </w:r>
           </w:p>
         </w:tc>
@@ -441,13 +370,7 @@
             <w:vAlign w:val="center"/>
           </w:tcPr>
           <w:p>
-            <w:pPr>
-              <w:spacing w:after="60"/>
-            </w:pPr>
-            <w:r>
-              <w:rPr>
-                <w:sz w:val="17"/>
-              </w:rPr>
+            <w:r>
               <w:t>RF-06</w:t>
             </w:r>
           </w:p>
@@ -467,14 +390,8 @@
             <w:vAlign w:val="center"/>
           </w:tcPr>
           <w:p>
-            <w:pPr>
-              <w:spacing w:after="60"/>
-            </w:pPr>
-            <w:r>
-              <w:rPr>
-                <w:sz w:val="17"/>
-              </w:rPr>
-              <w:t>JavaScript validará nombre, RUT, correo y servicio en el formulario de reserva.</w:t>
+            <w:r>
+              <w:t>El usuario podr? completar una solicitud de reserva con nombre, RUT, correo, servicio y comentario.</w:t>
             </w:r>
           </w:p>
         </w:tc>
@@ -494,13 +411,7 @@
             <w:vAlign w:val="center"/>
           </w:tcPr>
           <w:p>
-            <w:pPr>
-              <w:spacing w:after="60"/>
-            </w:pPr>
-            <w:r>
-              <w:rPr>
-                <w:sz w:val="17"/>
-              </w:rPr>
+            <w:r>
               <w:t>RF-07</w:t>
             </w:r>
           </w:p>
@@ -519,14 +430,8 @@
             <w:vAlign w:val="center"/>
           </w:tcPr>
           <w:p>
-            <w:pPr>
-              <w:spacing w:after="60"/>
-            </w:pPr>
-            <w:r>
-              <w:rPr>
-                <w:sz w:val="17"/>
-              </w:rPr>
-              <w:t>El sistema mostrará mensajes específicos junto a los campos incorrectos y confirmará los datos válidos.</w:t>
+            <w:r>
+              <w:t>El formulario validar? nombre, RUT, correo y servicio, mostrando mensajes junto a los campos inv?lidos.</w:t>
             </w:r>
           </w:p>
         </w:tc>
@@ -547,13 +452,7 @@
             <w:vAlign w:val="center"/>
           </w:tcPr>
           <w:p>
-            <w:pPr>
-              <w:spacing w:after="60"/>
-            </w:pPr>
-            <w:r>
-              <w:rPr>
-                <w:sz w:val="17"/>
-              </w:rPr>
+            <w:r>
               <w:t>RF-08</w:t>
             </w:r>
           </w:p>
@@ -573,14 +472,52 @@
             <w:vAlign w:val="center"/>
           </w:tcPr>
           <w:p>
-            <w:pPr>
-              <w:spacing w:after="60"/>
-            </w:pPr>
-            <w:r>
-              <w:rPr>
-                <w:sz w:val="17"/>
-              </w:rPr>
-              <w:t>El botón Limpiar eliminará los datos, mensajes e indicadores visuales del formulario.</w:t>
+            <w:r>
+              <w:t>El formulario mostrar? un mensaje de ?xito cuando los datos sean v?lidos.</w:t>
+            </w:r>
+          </w:p>
+        </w:tc>
+      </w:tr>
+      <w:tr>
+        <w:tc>
+          <w:tcPr>
+            <w:tcW w:type="dxa" w:w="1224"/>
+          </w:tcPr>
+          <w:p>
+            <w:r>
+              <w:t>RF-09</w:t>
+            </w:r>
+          </w:p>
+        </w:tc>
+        <w:tc>
+          <w:tcPr>
+            <w:tcW w:type="dxa" w:w="8640"/>
+          </w:tcPr>
+          <w:p>
+            <w:r>
+              <w:t>El bot?n Limpiar eliminar? valores, errores, selecci?n y resultado del formulario.</w:t>
+            </w:r>
+          </w:p>
+        </w:tc>
+      </w:tr>
+      <w:tr>
+        <w:tc>
+          <w:tcPr>
+            <w:tcW w:type="dxa" w:w="1224"/>
+          </w:tcPr>
+          <w:p>
+            <w:r>
+              <w:t>RF-10</w:t>
+            </w:r>
+          </w:p>
+        </w:tc>
+        <w:tc>
+          <w:tcPr>
+            <w:tcW w:type="dxa" w:w="8640"/>
+          </w:tcPr>
+          <w:p>
+            <w:r>
+              <w:t>La API rechazar? configuraciones de tratamientos incompletas o con tipos inv?lidos.</w:t>
             </w:r>
           </w:p>
         </w:tc>
@@ -590,6 +527,9 @@
       <w:pPr>
         <w:spacing w:after="80"/>
       </w:pPr>
+      <w:r>
+        <w:t>3 Requerimientos no funcionales</w:t>
+      </w:r>
     </w:p>
     <w:p>
       <w:pPr>
@@ -597,7 +537,7 @@
         <w:spacing w:after="80"/>
       </w:pPr>
       <w:r>
-        <w:t>3 Requerimientos no funcionales</w:t>
+        <w:t>4 Herramientas y tecnolog?as</w:t>
       </w:r>
     </w:p>
     <w:tbl>
@@ -627,11 +567,7 @@
           </w:tcPr>
           <w:p>
             <w:r>
-              <w:rPr>
-                <w:b/>
-                <w:color w:val="FFFFFF"/>
-              </w:rPr>
-              <w:t>Código</w:t>
+              <w:t>C?digo</w:t>
             </w:r>
           </w:p>
         </w:tc>
@@ -651,10 +587,6 @@
           </w:tcPr>
           <w:p>
             <w:r>
-              <w:rPr>
-                <w:b/>
-                <w:color w:val="FFFFFF"/>
-              </w:rPr>
               <w:t>Requerimiento</w:t>
             </w:r>
           </w:p>
@@ -675,13 +607,7 @@
             <w:vAlign w:val="center"/>
           </w:tcPr>
           <w:p>
-            <w:pPr>
-              <w:spacing w:after="60"/>
-            </w:pPr>
-            <w:r>
-              <w:rPr>
-                <w:sz w:val="17"/>
-              </w:rPr>
+            <w:r>
               <w:t>RNF-01</w:t>
             </w:r>
           </w:p>
@@ -700,14 +626,8 @@
             <w:vAlign w:val="center"/>
           </w:tcPr>
           <w:p>
-            <w:pPr>
-              <w:spacing w:after="60"/>
-            </w:pPr>
-            <w:r>
-              <w:rPr>
-                <w:sz w:val="17"/>
-              </w:rPr>
-              <w:t>El sitio utilizará estructura semántica HTML5.</w:t>
+            <w:r>
+              <w:t>La interfaz utilizar? componentes React y rutas de Next.js.</w:t>
             </w:r>
           </w:p>
         </w:tc>
@@ -728,13 +648,7 @@
             <w:vAlign w:val="center"/>
           </w:tcPr>
           <w:p>
-            <w:pPr>
-              <w:spacing w:after="60"/>
-            </w:pPr>
-            <w:r>
-              <w:rPr>
-                <w:sz w:val="17"/>
-              </w:rPr>
+            <w:r>
               <w:t>RNF-02</w:t>
             </w:r>
           </w:p>
@@ -754,14 +668,8 @@
             <w:vAlign w:val="center"/>
           </w:tcPr>
           <w:p>
-            <w:pPr>
-              <w:spacing w:after="60"/>
-            </w:pPr>
-            <w:r>
-              <w:rPr>
-                <w:sz w:val="17"/>
-              </w:rPr>
-              <w:t>Los estilos estarán centralizados en una hoja CSS externa.</w:t>
+            <w:r>
+              <w:t>El c?digo de la aplicaci?n estar? escrito en TypeScript con tipado expl?cito en las estructuras principales.</w:t>
             </w:r>
           </w:p>
         </w:tc>
@@ -781,13 +689,7 @@
             <w:vAlign w:val="center"/>
           </w:tcPr>
           <w:p>
-            <w:pPr>
-              <w:spacing w:after="60"/>
-            </w:pPr>
-            <w:r>
-              <w:rPr>
-                <w:sz w:val="17"/>
-              </w:rPr>
+            <w:r>
               <w:t>RNF-03</w:t>
             </w:r>
           </w:p>
@@ -806,14 +708,8 @@
             <w:vAlign w:val="center"/>
           </w:tcPr>
           <w:p>
-            <w:pPr>
-              <w:spacing w:after="60"/>
-            </w:pPr>
-            <w:r>
-              <w:rPr>
-                <w:sz w:val="17"/>
-              </w:rPr>
-              <w:t>La interacción y las validaciones estarán en archivos JavaScript externos.</w:t>
+            <w:r>
+              <w:t>Los estilos estar?n centralizados en archivos CSS externos.</w:t>
             </w:r>
           </w:p>
         </w:tc>
@@ -834,13 +730,7 @@
             <w:vAlign w:val="center"/>
           </w:tcPr>
           <w:p>
-            <w:pPr>
-              <w:spacing w:after="60"/>
-            </w:pPr>
-            <w:r>
-              <w:rPr>
-                <w:sz w:val="17"/>
-              </w:rPr>
+            <w:r>
               <w:t>RNF-04</w:t>
             </w:r>
           </w:p>
@@ -860,14 +750,8 @@
             <w:vAlign w:val="center"/>
           </w:tcPr>
           <w:p>
-            <w:pPr>
-              <w:spacing w:after="60"/>
-            </w:pPr>
-            <w:r>
-              <w:rPr>
-                <w:sz w:val="17"/>
-              </w:rPr>
-              <w:t>El diseño se adaptará a computadores, tablets y teléfonos mediante reglas responsivas.</w:t>
+            <w:r>
+              <w:t>El dise?o se adaptar? a computadores, tablets y tel?fonos mediante reglas responsivas.</w:t>
             </w:r>
           </w:p>
         </w:tc>
@@ -887,13 +771,7 @@
             <w:vAlign w:val="center"/>
           </w:tcPr>
           <w:p>
-            <w:pPr>
-              <w:spacing w:after="60"/>
-            </w:pPr>
-            <w:r>
-              <w:rPr>
-                <w:sz w:val="17"/>
-              </w:rPr>
+            <w:r>
               <w:t>RNF-05</w:t>
             </w:r>
           </w:p>
@@ -912,14 +790,8 @@
             <w:vAlign w:val="center"/>
           </w:tcPr>
           <w:p>
-            <w:pPr>
-              <w:spacing w:after="60"/>
-            </w:pPr>
-            <w:r>
-              <w:rPr>
-                <w:sz w:val="17"/>
-              </w:rPr>
-              <w:t>Las imágenes tendrán texto alternativo y los formularios utilizarán etiquetas asociadas.</w:t>
+            <w:r>
+              <w:t>Las im?genes tendr?n texto alternativo y los controles del formulario tendr?n etiquetas asociadas.</w:t>
             </w:r>
           </w:p>
         </w:tc>
@@ -940,13 +812,7 @@
             <w:vAlign w:val="center"/>
           </w:tcPr>
           <w:p>
-            <w:pPr>
-              <w:spacing w:after="60"/>
-            </w:pPr>
-            <w:r>
-              <w:rPr>
-                <w:sz w:val="17"/>
-              </w:rPr>
+            <w:r>
               <w:t>RNF-06</w:t>
             </w:r>
           </w:p>
@@ -966,14 +832,8 @@
             <w:vAlign w:val="center"/>
           </w:tcPr>
           <w:p>
-            <w:pPr>
-              <w:spacing w:after="60"/>
-            </w:pPr>
-            <w:r>
-              <w:rPr>
-                <w:sz w:val="17"/>
-              </w:rPr>
-              <w:t>El proyecto podrá ejecutarse localmente mediante Apache en XAMPP.</w:t>
+            <w:r>
+              <w:t>Los controles interactivos tendr?n foco visible y el contenido usar? relaciones sem?nticas y estados ARIA cuando corresponde.</w:t>
             </w:r>
           </w:p>
         </w:tc>
@@ -993,13 +853,7 @@
             <w:vAlign w:val="center"/>
           </w:tcPr>
           <w:p>
-            <w:pPr>
-              <w:spacing w:after="60"/>
-            </w:pPr>
-            <w:r>
-              <w:rPr>
-                <w:sz w:val="17"/>
-              </w:rPr>
+            <w:r>
               <w:t>RNF-07</w:t>
             </w:r>
           </w:p>
@@ -1018,14 +872,8 @@
             <w:vAlign w:val="center"/>
           </w:tcPr>
           <w:p>
-            <w:pPr>
-              <w:spacing w:after="60"/>
-            </w:pPr>
-            <w:r>
-              <w:rPr>
-                <w:sz w:val="17"/>
-              </w:rPr>
-              <w:t>La navegación y los mensajes deberán ser claros y consistentes en todas las páginas.</w:t>
+            <w:r>
+              <w:t>Las pruebas automatizadas se ejecutar?n con Jasmine/Karma sin depender de la API real.</w:t>
             </w:r>
           </w:p>
         </w:tc>
@@ -1046,13 +894,7 @@
             <w:vAlign w:val="center"/>
           </w:tcPr>
           <w:p>
-            <w:pPr>
-              <w:spacing w:after="60"/>
-            </w:pPr>
-            <w:r>
-              <w:rPr>
-                <w:sz w:val="17"/>
-              </w:rPr>
+            <w:r>
               <w:t>RNF-08</w:t>
             </w:r>
           </w:p>
@@ -1072,14 +914,30 @@
             <w:vAlign w:val="center"/>
           </w:tcPr>
           <w:p>
-            <w:pPr>
-              <w:spacing w:after="60"/>
-            </w:pPr>
-            <w:r>
-              <w:rPr>
-                <w:sz w:val="17"/>
-              </w:rPr>
-              <w:t>El proyecto utilizará HTML, CSS y JavaScript sin requerir una base de datos en esta versión.</w:t>
+            <w:r>
+              <w:t>El proyecto podr? ejecutarse localmente con los scripts definidos en package.json.</w:t>
+            </w:r>
+          </w:p>
+        </w:tc>
+      </w:tr>
+      <w:tr>
+        <w:tc>
+          <w:tcPr>
+            <w:tcW w:type="dxa" w:w="1224"/>
+          </w:tcPr>
+          <w:p>
+            <w:r>
+              <w:t>RNF-09</w:t>
+            </w:r>
+          </w:p>
+        </w:tc>
+        <w:tc>
+          <w:tcPr>
+            <w:tcW w:type="dxa" w:w="8640"/>
+          </w:tcPr>
+          <w:p>
+            <w:r>
+              <w:t>La navegaci?n y los mensajes ser?n claros y consistentes en las p?ginas implementadas.</w:t>
             </w:r>
           </w:p>
         </w:tc>
@@ -1089,6 +947,9 @@
       <w:pPr>
         <w:spacing w:after="80"/>
       </w:pPr>
+      <w:r>
+        <w:t>? Next.js y React para la interfaz y las rutas del sitio.</w:t>
+      </w:r>
     </w:p>
     <w:p>
       <w:pPr>
@@ -1096,7 +957,7 @@
         <w:spacing w:after="80"/>
       </w:pPr>
       <w:r>
-        <w:t>4 Herramientas y tecnologías</w:t>
+        <w:t>? TypeScript para tipado est?tico del c?digo de la aplicaci?n.</w:t>
       </w:r>
     </w:p>
     <w:p>
@@ -1105,10 +966,7 @@
         <w:ind w:left="360" w:hanging="259"/>
       </w:pPr>
       <w:r>
-        <w:t xml:space="preserve">• </w:t>
-      </w:r>
-      <w:r>
-        <w:t>Visual Studio Code para edición del proyecto.</w:t>
+        <w:t>? CSS externo y reglas media query para dise?o responsivo.</w:t>
       </w:r>
     </w:p>
     <w:p>
@@ -1117,10 +975,7 @@
         <w:ind w:left="360" w:hanging="259"/>
       </w:pPr>
       <w:r>
-        <w:t xml:space="preserve">• </w:t>
-      </w:r>
-      <w:r>
-        <w:t>HTML5 para estructura y contenido.</w:t>
+        <w:t>? Node.js para ejecutar la API simulada y las herramientas del proyecto.</w:t>
       </w:r>
     </w:p>
     <w:p>
@@ -1129,10 +984,7 @@
         <w:ind w:left="360" w:hanging="259"/>
       </w:pPr>
       <w:r>
-        <w:t xml:space="preserve">• </w:t>
-      </w:r>
-      <w:r>
-        <w:t>CSS3 externo para diseño y adaptación a diferentes pantallas.</w:t>
+        <w:t>? Jasmine, Karma y Edge Headless para las pruebas automatizadas.</w:t>
       </w:r>
     </w:p>
     <w:p>
@@ -1141,10 +993,7 @@
         <w:ind w:left="360" w:hanging="259"/>
       </w:pPr>
       <w:r>
-        <w:t xml:space="preserve">• </w:t>
-      </w:r>
-      <w:r>
-        <w:t>JavaScript externo para validar el formulario de reserva.</w:t>
+        <w:t>? Git y GitHub para control de versiones y trabajo colaborativo.</w:t>
       </w:r>
     </w:p>
     <w:p>
@@ -1153,10 +1002,7 @@
         <w:ind w:left="360" w:hanging="259"/>
       </w:pPr>
       <w:r>
-        <w:t xml:space="preserve">• </w:t>
-      </w:r>
-      <w:r>
-        <w:t>XAMPP y Apache para ejecutar el sitio en localhost.</w:t>
+        <w:t>5 Propuesta de soluci?n</w:t>
       </w:r>
     </w:p>
     <w:p>
@@ -1165,10 +1011,7 @@
         <w:ind w:left="360" w:hanging="259"/>
       </w:pPr>
       <w:r>
-        <w:t xml:space="preserve">• </w:t>
-      </w:r>
-      <w:r>
-        <w:t>Git y GitHub para control de versiones y trabajo colaborativo.</w:t>
+        <w:t>Se propone una interfaz clara en tonos turquesa asociada a salud y confianza. La aplicaci?n organiza la informaci?n en p?ginas interconectadas, carga los tratamientos desde una API simulada, permite seleccionar un tratamiento y entrega un formulario accesible con validaciones espec?ficas. Las pruebas reemplazan window.fetch por mocks para ejecutarse sin depender de una API externa.</w:t>
       </w:r>
     </w:p>
     <w:p>
@@ -1177,15 +1020,15 @@
         <w:spacing w:after="80"/>
       </w:pPr>
       <w:r>
-        <w:t>5 Propuesta de solución</w:t>
-      </w:r>
-    </w:p>
-    <w:p>
-      <w:pPr>
-        <w:spacing w:after="80"/>
-      </w:pPr>
-      <w:r>
-        <w:t>Se propone una interfaz en tonos turquesa asociada a salud y confianza. La información se distribuye en páginas interconectadas con estructura semántica HTML5. La hoja CSS externa mantiene un diseño uniforme y responsivo, mientras que JavaScript valida el formulario de reserva y entrega mensajes claros antes de aceptar los datos.</w:t>
+        <w:t>6 Restricciones</w:t>
+      </w:r>
+    </w:p>
+    <w:p>
+      <w:pPr>
+        <w:spacing w:after="80"/>
+      </w:pPr>
+      <w:r>
+        <w:t>? El formulario simula una solicitud y no env?a correos ni confirma horas reales.</w:t>
       </w:r>
     </w:p>
     <w:p>
@@ -1194,7 +1037,7 @@
         <w:spacing w:after="80"/>
       </w:pPr>
       <w:r>
-        <w:t>6 Restricciones</w:t>
+        <w:t>? La API es local y simulada; no existe una base de datos persistente.</w:t>
       </w:r>
     </w:p>
     <w:p>
@@ -1203,10 +1046,7 @@
         <w:ind w:left="360" w:hanging="259"/>
       </w:pPr>
       <w:r>
-        <w:t xml:space="preserve">• </w:t>
-      </w:r>
-      <w:r>
-        <w:t>El formulario no envía correos ni confirma horas reales.</w:t>
+        <w:t>? Los precios son referenciales y el contenido audiovisual puede requerir conexi?n a Internet.</w:t>
       </w:r>
     </w:p>
     <w:p>
@@ -1215,10 +1055,7 @@
         <w:ind w:left="360" w:hanging="259"/>
       </w:pPr>
       <w:r>
-        <w:t xml:space="preserve">• </w:t>
-      </w:r>
-      <w:r>
-        <w:t>Los precios son referenciales y el video requiere conexión a Internet para reproducirse.</w:t>
+        <w:t>? La cobertura registrada corresponde al archivo instrumentado por la configuraci?n actual de Karma/esbuild, no a toda la aplicaci?n.</w:t>
       </w:r>
     </w:p>
     <w:p>
@@ -1227,6 +1064,15 @@
         <w:spacing w:after="80"/>
       </w:pPr>
       <w:r>
+        <w:t>? El proyecto utiliza CSS nativo; no incorpora Bootstrap.</w:t>
+      </w:r>
+    </w:p>
+    <w:p>
+      <w:pPr>
+        <w:spacing w:after="80"/>
+        <w:ind w:left="360" w:hanging="259"/>
+      </w:pPr>
+      <w:r>
         <w:t>7 Mejoras futuras</w:t>
       </w:r>
     </w:p>
@@ -1236,22 +1082,17 @@
         <w:ind w:left="360" w:hanging="259"/>
       </w:pPr>
       <w:r>
-        <w:t xml:space="preserve">• </w:t>
-      </w:r>
-      <w:r>
-        <w:t>Agregar una base de datos para reservas y tratamientos.</w:t>
-      </w:r>
-    </w:p>
-    <w:p>
-      <w:pPr>
-        <w:spacing w:after="80"/>
-        <w:ind w:left="360" w:hanging="259"/>
-      </w:pPr>
-      <w:r>
-        <w:t xml:space="preserve">• </w:t>
-      </w:r>
-      <w:r>
-        <w:t>Mostrar horas disponibles en tiempo real y enviar confirmaciones por correo.</w:t>
+        <w:t>? Agregar una base de datos para reservas y tratamientos.</w:t>
+      </w:r>
+    </w:p>
+    <w:p>
+      <w:r>
+        <w:t>? Mostrar horas disponibles en tiempo real y enviar confirmaciones por correo.</w:t>
+      </w:r>
+    </w:p>
+    <w:p>
+      <w:r>
+        <w:t>? Incorporar autenticaci?n, pagos o un panel administrativo solo si el alcance del proyecto cambia.</w:t>
       </w:r>
     </w:p>
     <w:sectPr>

</xml_diff>

<commit_message>
Corregir caracteres y revisar requisitos del ERS version 2
</commit_message>
<xml_diff>
--- a/ERS.docx
+++ b/ERS.docx
@@ -9,7 +9,7 @@
         <w:jc w:val="center"/>
       </w:pPr>
       <w:r>
-        <w:t>ERS Cl?nica Aura</w:t>
+        <w:t>ERS Clínica Aura</w:t>
       </w:r>
     </w:p>
     <w:p>
@@ -18,24 +18,29 @@
         <w:jc w:val="center"/>
       </w:pPr>
       <w:r>
-        <w:t>Especificaci?n de Requisitos del Software - Versi?n 2</w:t>
-      </w:r>
-    </w:p>
-    <w:p>
-      <w:pPr>
-        <w:spacing w:after="80"/>
-      </w:pPr>
-      <w:r>
-        <w:t>Este documento describe los requisitos implementados en el frontend de Cl?nica Aura para la Evaluaci?n Parcial 2. El alcance se limita a las funciones disponibles en el proyecto actual.</w:t>
-      </w:r>
-    </w:p>
-    <w:p>
-      <w:pPr>
-        <w:pStyle w:val="Ttulo1"/>
-        <w:spacing w:after="80"/>
-      </w:pPr>
-      <w:r>
-        <w:t>1 Introducci?n</w:t>
+        <w:t>Especificación de Requisitos del Software - Versión 2</w:t>
+      </w:r>
+    </w:p>
+    <w:p>
+      <w:pPr>
+        <w:spacing w:after="80"/>
+      </w:pPr>
+      <w:r>
+        <w:t>Este documento describe los requisitos implementados en el frontend de Clínica Aura para la Evaluación Parcial 2. El alcance se limita a las funciones disponibles en el proyecto actual.</w:t>
+      </w:r>
+    </w:p>
+    <w:p>
+      <w:pPr>
+        <w:pStyle w:val="Heading1"/>
+        <w:spacing w:after="80"/>
+        <w:keepNext/>
+      </w:pPr>
+      <w:r>
+        <w:rPr>
+          <w:b w:val="1"/>
+          <w:sz w:val="26"/>
+        </w:rPr>
+        <w:t>1 Introducción</w:t>
       </w:r>
     </w:p>
     <w:p>
@@ -44,15 +49,15 @@
         <w:spacing w:after="80"/>
       </w:pPr>
       <w:r>
-        <w:t>1.1 Prop?sito</w:t>
-      </w:r>
-    </w:p>
-    <w:p>
-      <w:pPr>
-        <w:spacing w:after="80"/>
-      </w:pPr>
-      <w:r>
-        <w:t>Definir los requisitos funcionales y no funcionales del sitio web frontend de Cl?nica Aura, una cl?nica ficticia dedicada a la salud dental y la armonizaci?n facial. El documento sirve como referencia para el desarrollo, las pruebas y la evaluaci?n del proyecto.</w:t>
+        <w:t>1.1 Propósito</w:t>
+      </w:r>
+    </w:p>
+    <w:p>
+      <w:pPr>
+        <w:spacing w:after="80"/>
+      </w:pPr>
+      <w:r>
+        <w:t>Definir los requisitos funcionales y no funcionales del sitio web frontend de Clínica Aura, una clínica ficticia dedicada a la salud dental y la armonización facial. El documento sirve como referencia para el desarrollo, las pruebas y la evaluación del proyecto.</w:t>
       </w:r>
     </w:p>
     <w:p>
@@ -69,7 +74,7 @@
         <w:spacing w:after="80"/>
       </w:pPr>
       <w:r>
-        <w:t>El sitio permite navegar por la informaci?n de la cl?nica, consultar un cat?logo de tratamientos obtenido desde una API simulada, seleccionar un tratamiento y completar un formulario de solicitud de reserva con validaciones y mensajes de resultado.</w:t>
+        <w:t>El sitio permite conocer la clínica, consultar un catálogo desde una API simulada local, seleccionar un tratamiento y validar un formulario de demostración. Inicio incluye imágenes, un carrusel manual y un video educativo. Las direcciones inexistentes muestran una página 404.</w:t>
       </w:r>
     </w:p>
     <w:p>
@@ -78,23 +83,28 @@
         <w:spacing w:after="80"/>
       </w:pPr>
       <w:r>
-        <w:t>1.3 P?blico objetivo</w:t>
-      </w:r>
-    </w:p>
-    <w:p>
-      <w:pPr>
-        <w:spacing w:after="80"/>
-      </w:pPr>
-      <w:r>
-        <w:t>Personas interesadas en servicios dentales o faciales que desean informarse, revisar tratamientos o solicitar una evaluaci?n.</w:t>
-      </w:r>
-    </w:p>
-    <w:p>
-      <w:pPr>
-        <w:pStyle w:val="Ttulo1"/>
-        <w:spacing w:after="80"/>
-      </w:pPr>
-      <w:r>
+        <w:t>1.3 Público objetivo</w:t>
+      </w:r>
+    </w:p>
+    <w:p>
+      <w:pPr>
+        <w:spacing w:after="80"/>
+      </w:pPr>
+      <w:r>
+        <w:t>Personas interesadas en servicios dentales o faciales que desean informarse, revisar tratamientos o solicitar una evaluación.</w:t>
+      </w:r>
+    </w:p>
+    <w:p>
+      <w:pPr>
+        <w:pStyle w:val="Heading1"/>
+        <w:spacing w:after="80"/>
+        <w:keepNext/>
+      </w:pPr>
+      <w:r>
+        <w:rPr>
+          <w:b w:val="1"/>
+          <w:sz w:val="26"/>
+        </w:rPr>
         <w:t>2 Requerimientos funcionales</w:t>
       </w:r>
     </w:p>
@@ -109,6 +119,10 @@
         <w:gridCol w:w="8640"/>
       </w:tblGrid>
       <w:tr>
+        <w:trPr>
+          <w:cantSplit/>
+          <w:tblHeader/>
+        </w:trPr>
         <w:tc>
           <w:tcPr>
             <w:tcW w:type="dxa" w:w="1224"/>
@@ -125,7 +139,7 @@
           </w:tcPr>
           <w:p>
             <w:r>
-              <w:t>C?digo</w:t>
+              <w:t>Código</w:t>
             </w:r>
           </w:p>
         </w:tc>
@@ -151,6 +165,9 @@
         </w:tc>
       </w:tr>
       <w:tr>
+        <w:trPr>
+          <w:cantSplit/>
+        </w:trPr>
         <w:tc>
           <w:tcPr>
             <w:tcW w:type="dxa" w:w="1224"/>
@@ -185,12 +202,15 @@
           </w:tcPr>
           <w:p>
             <w:r>
-              <w:t>El usuario podr? navegar entre Inicio, Nosotros, Tratamientos, Reserva y Contacto.</w:t>
+              <w:t>El usuario podrá navegar entre Inicio, Nosotros, Tratamientos, Reserva y Contacto.</w:t>
             </w:r>
           </w:p>
         </w:tc>
       </w:tr>
       <w:tr>
+        <w:trPr>
+          <w:cantSplit/>
+        </w:trPr>
         <w:tc>
           <w:tcPr>
             <w:tcW w:type="dxa" w:w="1224"/>
@@ -227,12 +247,15 @@
           </w:tcPr>
           <w:p>
             <w:r>
-              <w:t>El sistema consultar? los tratamientos mediante la API simulada local.</w:t>
+              <w:t>El sistema consultará los tratamientos mediante la API simulada local.</w:t>
             </w:r>
           </w:p>
         </w:tc>
       </w:tr>
       <w:tr>
+        <w:trPr>
+          <w:cantSplit/>
+        </w:trPr>
         <w:tc>
           <w:tcPr>
             <w:tcW w:type="dxa" w:w="1224"/>
@@ -267,12 +290,15 @@
           </w:tcPr>
           <w:p>
             <w:r>
-              <w:t>El cat?logo mostrar? nombre, descripci?n, imagen y precio referencial de cada tratamiento.</w:t>
+              <w:t>El catálogo mostrará nombre, descripción, imagen y precio referencial de cada tratamiento.</w:t>
             </w:r>
           </w:p>
         </w:tc>
       </w:tr>
       <w:tr>
+        <w:trPr>
+          <w:cantSplit/>
+        </w:trPr>
         <w:tc>
           <w:tcPr>
             <w:tcW w:type="dxa" w:w="1224"/>
@@ -309,12 +335,15 @@
           </w:tcPr>
           <w:p>
             <w:r>
-              <w:t>El sistema informar? estados de carga, lista vac?a y error cuando corresponda.</w:t>
+              <w:t>El sistema informará estados de carga, lista vacía y error cuando corresponda.</w:t>
             </w:r>
           </w:p>
         </w:tc>
       </w:tr>
       <w:tr>
+        <w:trPr>
+          <w:cantSplit/>
+        </w:trPr>
         <w:tc>
           <w:tcPr>
             <w:tcW w:type="dxa" w:w="1224"/>
@@ -349,12 +378,15 @@
           </w:tcPr>
           <w:p>
             <w:r>
-              <w:t>El usuario podr? seleccionar un solo tratamiento y acceder a Reserva con ese tratamiento.</w:t>
+              <w:t>El usuario podrá seleccionar un solo tratamiento y acceder a Reserva con ese tratamiento.</w:t>
             </w:r>
           </w:p>
         </w:tc>
       </w:tr>
       <w:tr>
+        <w:trPr>
+          <w:cantSplit/>
+        </w:trPr>
         <w:tc>
           <w:tcPr>
             <w:tcW w:type="dxa" w:w="1224"/>
@@ -391,12 +423,15 @@
           </w:tcPr>
           <w:p>
             <w:r>
-              <w:t>El usuario podr? completar una solicitud de reserva con nombre, RUT, correo, servicio y comentario.</w:t>
+              <w:t>El usuario podrá completar una solicitud de reserva con nombre, RUT, correo, servicio y comentario.</w:t>
             </w:r>
           </w:p>
         </w:tc>
       </w:tr>
       <w:tr>
+        <w:trPr>
+          <w:cantSplit/>
+        </w:trPr>
         <w:tc>
           <w:tcPr>
             <w:tcW w:type="dxa" w:w="1224"/>
@@ -431,12 +466,15 @@
           </w:tcPr>
           <w:p>
             <w:r>
-              <w:t>El formulario validar? nombre, RUT, correo y servicio, mostrando mensajes junto a los campos inv?lidos.</w:t>
+              <w:t>El formulario validará nombre, RUT por módulo 11, correo y servicio del catálogo. El comentario será opcional, con máximo de 500 caracteres. Los errores se asociarán a los campos y el foco irá al primero incorrecto.</w:t>
             </w:r>
           </w:p>
         </w:tc>
       </w:tr>
       <w:tr>
+        <w:trPr>
+          <w:cantSplit/>
+        </w:trPr>
         <w:tc>
           <w:tcPr>
             <w:tcW w:type="dxa" w:w="1224"/>
@@ -473,15 +511,27 @@
           </w:tcPr>
           <w:p>
             <w:r>
-              <w:t>El formulario mostrar? un mensaje de ?xito cuando los datos sean v?lidos.</w:t>
+              <w:t>Con datos válidos, el formulario indicará que es una demostración: no se envió una solicitud ni se reservó una hora real.</w:t>
             </w:r>
           </w:p>
         </w:tc>
       </w:tr>
       <w:tr>
+        <w:trPr>
+          <w:cantSplit/>
+        </w:trPr>
         <w:tc>
           <w:tcPr>
             <w:tcW w:type="dxa" w:w="1224"/>
+            <w:tcBorders>
+              <w:top w:val="single" w:sz="6" w:color="D9D9D9"/>
+              <w:left w:val="single" w:sz="6" w:color="D9D9D9"/>
+              <w:bottom w:val="single" w:sz="6" w:color="D9D9D9"/>
+              <w:right w:val="single" w:sz="6" w:color="D9D9D9"/>
+              <w:insideH w:val="single" w:sz="6" w:color="D9D9D9"/>
+              <w:insideV w:val="single" w:sz="6" w:color="D9D9D9"/>
+            </w:tcBorders>
+            <w:vAlign w:val="center"/>
           </w:tcPr>
           <w:p>
             <w:r>
@@ -492,18 +542,40 @@
         <w:tc>
           <w:tcPr>
             <w:tcW w:type="dxa" w:w="8640"/>
-          </w:tcPr>
-          <w:p>
-            <w:r>
-              <w:t>El bot?n Limpiar eliminar? valores, errores, selecci?n y resultado del formulario.</w:t>
+            <w:tcBorders>
+              <w:top w:val="single" w:sz="6" w:color="D9D9D9"/>
+              <w:left w:val="single" w:sz="6" w:color="D9D9D9"/>
+              <w:bottom w:val="single" w:sz="6" w:color="D9D9D9"/>
+              <w:right w:val="single" w:sz="6" w:color="D9D9D9"/>
+              <w:insideH w:val="single" w:sz="6" w:color="D9D9D9"/>
+              <w:insideV w:val="single" w:sz="6" w:color="D9D9D9"/>
+            </w:tcBorders>
+            <w:vAlign w:val="center"/>
+          </w:tcPr>
+          <w:p>
+            <w:r>
+              <w:t>El botón Limpiar eliminará valores, errores, selección y resultado del formulario.</w:t>
             </w:r>
           </w:p>
         </w:tc>
       </w:tr>
       <w:tr>
+        <w:trPr>
+          <w:cantSplit/>
+        </w:trPr>
         <w:tc>
           <w:tcPr>
             <w:tcW w:type="dxa" w:w="1224"/>
+            <w:shd w:fill="EAF6F6"/>
+            <w:tcBorders>
+              <w:top w:val="single" w:sz="6" w:color="D9D9D9"/>
+              <w:left w:val="single" w:sz="6" w:color="D9D9D9"/>
+              <w:bottom w:val="single" w:sz="6" w:color="D9D9D9"/>
+              <w:right w:val="single" w:sz="6" w:color="D9D9D9"/>
+              <w:insideH w:val="single" w:sz="6" w:color="D9D9D9"/>
+              <w:insideV w:val="single" w:sz="6" w:color="D9D9D9"/>
+            </w:tcBorders>
+            <w:vAlign w:val="center"/>
           </w:tcPr>
           <w:p>
             <w:r>
@@ -514,10 +586,108 @@
         <w:tc>
           <w:tcPr>
             <w:tcW w:type="dxa" w:w="8640"/>
-          </w:tcPr>
-          <w:p>
-            <w:r>
-              <w:t>La API rechazar? configuraciones de tratamientos incompletas o con tipos inv?lidos.</w:t>
+            <w:shd w:fill="EAF6F6"/>
+            <w:tcBorders>
+              <w:top w:val="single" w:sz="6" w:color="D9D9D9"/>
+              <w:left w:val="single" w:sz="6" w:color="D9D9D9"/>
+              <w:bottom w:val="single" w:sz="6" w:color="D9D9D9"/>
+              <w:right w:val="single" w:sz="6" w:color="D9D9D9"/>
+              <w:insideH w:val="single" w:sz="6" w:color="D9D9D9"/>
+              <w:insideV w:val="single" w:sz="6" w:color="D9D9D9"/>
+            </w:tcBorders>
+            <w:vAlign w:val="center"/>
+          </w:tcPr>
+          <w:p>
+            <w:r>
+              <w:t>La API rechazará configuraciones de tratamientos incompletas o con tipos inválidos.</w:t>
+            </w:r>
+          </w:p>
+        </w:tc>
+      </w:tr>
+      <w:tr>
+        <w:trPr>
+          <w:cantSplit/>
+        </w:trPr>
+        <w:tc>
+          <w:tcPr>
+            <w:tcW w:type="dxa" w:w="1224"/>
+            <w:tcBorders>
+              <w:top w:val="single" w:sz="6" w:color="D9D9D9"/>
+              <w:left w:val="single" w:sz="6" w:color="D9D9D9"/>
+              <w:bottom w:val="single" w:sz="6" w:color="D9D9D9"/>
+              <w:right w:val="single" w:sz="6" w:color="D9D9D9"/>
+              <w:insideH w:val="single" w:sz="6" w:color="D9D9D9"/>
+              <w:insideV w:val="single" w:sz="6" w:color="D9D9D9"/>
+            </w:tcBorders>
+            <w:vAlign w:val="center"/>
+          </w:tcPr>
+          <w:p>
+            <w:r>
+              <w:t>RF-11</w:t>
+            </w:r>
+          </w:p>
+        </w:tc>
+        <w:tc>
+          <w:tcPr>
+            <w:tcW w:type="dxa" w:w="8640"/>
+            <w:tcBorders>
+              <w:top w:val="single" w:sz="6" w:color="D9D9D9"/>
+              <w:left w:val="single" w:sz="6" w:color="D9D9D9"/>
+              <w:bottom w:val="single" w:sz="6" w:color="D9D9D9"/>
+              <w:right w:val="single" w:sz="6" w:color="D9D9D9"/>
+              <w:insideH w:val="single" w:sz="6" w:color="D9D9D9"/>
+              <w:insideV w:val="single" w:sz="6" w:color="D9D9D9"/>
+            </w:tcBorders>
+            <w:vAlign w:val="center"/>
+          </w:tcPr>
+          <w:p>
+            <w:r>
+              <w:t>Inicio permitirá cambiar manualmente las imágenes del carrusel y acceder al video educativo.</w:t>
+            </w:r>
+          </w:p>
+        </w:tc>
+      </w:tr>
+      <w:tr>
+        <w:trPr>
+          <w:cantSplit/>
+        </w:trPr>
+        <w:tc>
+          <w:tcPr>
+            <w:tcW w:type="dxa" w:w="1224"/>
+            <w:shd w:fill="EAF6F6"/>
+            <w:tcBorders>
+              <w:top w:val="single" w:sz="6" w:color="D9D9D9"/>
+              <w:left w:val="single" w:sz="6" w:color="D9D9D9"/>
+              <w:bottom w:val="single" w:sz="6" w:color="D9D9D9"/>
+              <w:right w:val="single" w:sz="6" w:color="D9D9D9"/>
+              <w:insideH w:val="single" w:sz="6" w:color="D9D9D9"/>
+              <w:insideV w:val="single" w:sz="6" w:color="D9D9D9"/>
+            </w:tcBorders>
+            <w:vAlign w:val="center"/>
+          </w:tcPr>
+          <w:p>
+            <w:r>
+              <w:t>RF-12</w:t>
+            </w:r>
+          </w:p>
+        </w:tc>
+        <w:tc>
+          <w:tcPr>
+            <w:tcW w:type="dxa" w:w="8640"/>
+            <w:shd w:fill="EAF6F6"/>
+            <w:tcBorders>
+              <w:top w:val="single" w:sz="6" w:color="D9D9D9"/>
+              <w:left w:val="single" w:sz="6" w:color="D9D9D9"/>
+              <w:bottom w:val="single" w:sz="6" w:color="D9D9D9"/>
+              <w:right w:val="single" w:sz="6" w:color="D9D9D9"/>
+              <w:insideH w:val="single" w:sz="6" w:color="D9D9D9"/>
+              <w:insideV w:val="single" w:sz="6" w:color="D9D9D9"/>
+            </w:tcBorders>
+            <w:vAlign w:val="center"/>
+          </w:tcPr>
+          <w:p>
+            <w:r>
+              <w:t>Una dirección inexistente mostrará la página 404 con enlaces a Inicio y Tratamientos.</w:t>
             </w:r>
           </w:p>
         </w:tc>
@@ -526,18 +696,15 @@
     <w:p>
       <w:pPr>
         <w:spacing w:after="80"/>
-      </w:pPr>
-      <w:r>
+        <w:pStyle w:val="Heading1"/>
+        <w:keepNext/>
+      </w:pPr>
+      <w:r>
+        <w:rPr>
+          <w:b w:val="1"/>
+          <w:sz w:val="26"/>
+        </w:rPr>
         <w:t>3 Requerimientos no funcionales</w:t>
-      </w:r>
-    </w:p>
-    <w:p>
-      <w:pPr>
-        <w:pStyle w:val="Ttulo1"/>
-        <w:spacing w:after="80"/>
-      </w:pPr>
-      <w:r>
-        <w:t>4 Herramientas y tecnolog?as</w:t>
       </w:r>
     </w:p>
     <w:tbl>
@@ -551,6 +718,10 @@
         <w:gridCol w:w="8640"/>
       </w:tblGrid>
       <w:tr>
+        <w:trPr>
+          <w:cantSplit/>
+          <w:tblHeader/>
+        </w:trPr>
         <w:tc>
           <w:tcPr>
             <w:tcW w:type="dxa" w:w="1224"/>
@@ -567,7 +738,7 @@
           </w:tcPr>
           <w:p>
             <w:r>
-              <w:t>C?digo</w:t>
+              <w:t>Código</w:t>
             </w:r>
           </w:p>
         </w:tc>
@@ -593,6 +764,9 @@
         </w:tc>
       </w:tr>
       <w:tr>
+        <w:trPr>
+          <w:cantSplit/>
+        </w:trPr>
         <w:tc>
           <w:tcPr>
             <w:tcW w:type="dxa" w:w="1224"/>
@@ -627,12 +801,15 @@
           </w:tcPr>
           <w:p>
             <w:r>
-              <w:t>La interfaz utilizar? componentes React y rutas de Next.js.</w:t>
+              <w:t>La interfaz utilizará componentes React y rutas de Next.js.</w:t>
             </w:r>
           </w:p>
         </w:tc>
       </w:tr>
       <w:tr>
+        <w:trPr>
+          <w:cantSplit/>
+        </w:trPr>
         <w:tc>
           <w:tcPr>
             <w:tcW w:type="dxa" w:w="1224"/>
@@ -669,12 +846,15 @@
           </w:tcPr>
           <w:p>
             <w:r>
-              <w:t>El c?digo de la aplicaci?n estar? escrito en TypeScript con tipado expl?cito en las estructuras principales.</w:t>
+              <w:t>El código de la aplicación estará escrito en TypeScript con tipado explícito en las estructuras principales.</w:t>
             </w:r>
           </w:p>
         </w:tc>
       </w:tr>
       <w:tr>
+        <w:trPr>
+          <w:cantSplit/>
+        </w:trPr>
         <w:tc>
           <w:tcPr>
             <w:tcW w:type="dxa" w:w="1224"/>
@@ -709,12 +889,15 @@
           </w:tcPr>
           <w:p>
             <w:r>
-              <w:t>Los estilos estar?n centralizados en archivos CSS externos.</w:t>
+              <w:t>Los estilos estarán centralizados en archivos CSS externos.</w:t>
             </w:r>
           </w:p>
         </w:tc>
       </w:tr>
       <w:tr>
+        <w:trPr>
+          <w:cantSplit/>
+        </w:trPr>
         <w:tc>
           <w:tcPr>
             <w:tcW w:type="dxa" w:w="1224"/>
@@ -751,12 +934,15 @@
           </w:tcPr>
           <w:p>
             <w:r>
-              <w:t>El dise?o se adaptar? a computadores, tablets y tel?fonos mediante reglas responsivas.</w:t>
+              <w:t>El diseño se adaptará a computadores, tablets y teléfonos mediante reglas responsivas.</w:t>
             </w:r>
           </w:p>
         </w:tc>
       </w:tr>
       <w:tr>
+        <w:trPr>
+          <w:cantSplit/>
+        </w:trPr>
         <w:tc>
           <w:tcPr>
             <w:tcW w:type="dxa" w:w="1224"/>
@@ -791,12 +977,15 @@
           </w:tcPr>
           <w:p>
             <w:r>
-              <w:t>Las im?genes tendr?n texto alternativo y los controles del formulario tendr?n etiquetas asociadas.</w:t>
+              <w:t>Las imágenes tendrán texto alternativo y los controles del formulario tendrán etiquetas asociadas.</w:t>
             </w:r>
           </w:p>
         </w:tc>
       </w:tr>
       <w:tr>
+        <w:trPr>
+          <w:cantSplit/>
+        </w:trPr>
         <w:tc>
           <w:tcPr>
             <w:tcW w:type="dxa" w:w="1224"/>
@@ -833,12 +1022,15 @@
           </w:tcPr>
           <w:p>
             <w:r>
-              <w:t>Los controles interactivos tendr?n foco visible y el contenido usar? relaciones sem?nticas y estados ARIA cuando corresponde.</w:t>
+              <w:t>Los controles interactivos tendrán foco visible y el contenido usará relaciones semánticas y estados ARIA cuando corresponde.</w:t>
             </w:r>
           </w:p>
         </w:tc>
       </w:tr>
       <w:tr>
+        <w:trPr>
+          <w:cantSplit/>
+        </w:trPr>
         <w:tc>
           <w:tcPr>
             <w:tcW w:type="dxa" w:w="1224"/>
@@ -873,12 +1065,15 @@
           </w:tcPr>
           <w:p>
             <w:r>
-              <w:t>Las pruebas automatizadas se ejecutar?n con Jasmine/Karma sin depender de la API real.</w:t>
+              <w:t>Las pruebas automatizadas se ejecutarán con Jasmine/Karma sin depender de la API real.</w:t>
             </w:r>
           </w:p>
         </w:tc>
       </w:tr>
       <w:tr>
+        <w:trPr>
+          <w:cantSplit/>
+        </w:trPr>
         <w:tc>
           <w:tcPr>
             <w:tcW w:type="dxa" w:w="1224"/>
@@ -915,15 +1110,27 @@
           </w:tcPr>
           <w:p>
             <w:r>
-              <w:t>El proyecto podr? ejecutarse localmente con los scripts definidos en package.json.</w:t>
+              <w:t>El proyecto podrá ejecutarse localmente con los scripts definidos en package.json.</w:t>
             </w:r>
           </w:p>
         </w:tc>
       </w:tr>
       <w:tr>
+        <w:trPr>
+          <w:cantSplit/>
+        </w:trPr>
         <w:tc>
           <w:tcPr>
             <w:tcW w:type="dxa" w:w="1224"/>
+            <w:tcBorders>
+              <w:top w:val="single" w:sz="6" w:color="D9D9D9"/>
+              <w:left w:val="single" w:sz="6" w:color="D9D9D9"/>
+              <w:bottom w:val="single" w:sz="6" w:color="D9D9D9"/>
+              <w:right w:val="single" w:sz="6" w:color="D9D9D9"/>
+              <w:insideH w:val="single" w:sz="6" w:color="D9D9D9"/>
+              <w:insideV w:val="single" w:sz="6" w:color="D9D9D9"/>
+            </w:tcBorders>
+            <w:vAlign w:val="center"/>
           </w:tcPr>
           <w:p>
             <w:r>
@@ -934,10 +1141,64 @@
         <w:tc>
           <w:tcPr>
             <w:tcW w:type="dxa" w:w="8640"/>
-          </w:tcPr>
-          <w:p>
-            <w:r>
-              <w:t>La navegaci?n y los mensajes ser?n claros y consistentes en las p?ginas implementadas.</w:t>
+            <w:tcBorders>
+              <w:top w:val="single" w:sz="6" w:color="D9D9D9"/>
+              <w:left w:val="single" w:sz="6" w:color="D9D9D9"/>
+              <w:bottom w:val="single" w:sz="6" w:color="D9D9D9"/>
+              <w:right w:val="single" w:sz="6" w:color="D9D9D9"/>
+              <w:insideH w:val="single" w:sz="6" w:color="D9D9D9"/>
+              <w:insideV w:val="single" w:sz="6" w:color="D9D9D9"/>
+            </w:tcBorders>
+            <w:vAlign w:val="center"/>
+          </w:tcPr>
+          <w:p>
+            <w:r>
+              <w:t>La navegación y los mensajes serán claros y consistentes en las páginas implementadas.</w:t>
+            </w:r>
+          </w:p>
+        </w:tc>
+      </w:tr>
+      <w:tr>
+        <w:trPr>
+          <w:cantSplit/>
+        </w:trPr>
+        <w:tc>
+          <w:tcPr>
+            <w:tcW w:type="dxa" w:w="1224"/>
+            <w:shd w:fill="EAF6F6"/>
+            <w:tcBorders>
+              <w:top w:val="single" w:sz="6" w:color="D9D9D9"/>
+              <w:left w:val="single" w:sz="6" w:color="D9D9D9"/>
+              <w:bottom w:val="single" w:sz="6" w:color="D9D9D9"/>
+              <w:right w:val="single" w:sz="6" w:color="D9D9D9"/>
+              <w:insideH w:val="single" w:sz="6" w:color="D9D9D9"/>
+              <w:insideV w:val="single" w:sz="6" w:color="D9D9D9"/>
+            </w:tcBorders>
+            <w:vAlign w:val="center"/>
+          </w:tcPr>
+          <w:p>
+            <w:r>
+              <w:t>RNF-10</w:t>
+            </w:r>
+          </w:p>
+        </w:tc>
+        <w:tc>
+          <w:tcPr>
+            <w:tcW w:type="dxa" w:w="8640"/>
+            <w:shd w:fill="EAF6F6"/>
+            <w:tcBorders>
+              <w:top w:val="single" w:sz="6" w:color="D9D9D9"/>
+              <w:left w:val="single" w:sz="6" w:color="D9D9D9"/>
+              <w:bottom w:val="single" w:sz="6" w:color="D9D9D9"/>
+              <w:right w:val="single" w:sz="6" w:color="D9D9D9"/>
+              <w:insideH w:val="single" w:sz="6" w:color="D9D9D9"/>
+              <w:insideV w:val="single" w:sz="6" w:color="D9D9D9"/>
+            </w:tcBorders>
+            <w:vAlign w:val="center"/>
+          </w:tcPr>
+          <w:p>
+            <w:r>
+              <w:t>Las diez pruebas automatizadas comprobarán validaciones, catálogo, errores HTTP, selección y limpieza. La cobertura se medirá sobre código de aplicación y se documentarán su alcance y exclusiones.</w:t>
             </w:r>
           </w:p>
         </w:tc>
@@ -945,19 +1206,33 @@
     </w:tbl>
     <w:p>
       <w:pPr>
-        <w:spacing w:after="80"/>
-      </w:pPr>
-      <w:r>
-        <w:t>? Next.js y React para la interfaz y las rutas del sitio.</w:t>
-      </w:r>
-    </w:p>
-    <w:p>
-      <w:pPr>
-        <w:pStyle w:val="Ttulo1"/>
-        <w:spacing w:after="80"/>
-      </w:pPr>
-      <w:r>
-        <w:t>? TypeScript para tipado est?tico del c?digo de la aplicaci?n.</w:t>
+        <w:pStyle w:val="Heading1"/>
+        <w:spacing w:after="80"/>
+        <w:keepNext/>
+      </w:pPr>
+      <w:r>
+        <w:rPr>
+          <w:b w:val="1"/>
+          <w:sz w:val="26"/>
+        </w:rPr>
+        <w:t>4 Herramientas y tecnologías</w:t>
+      </w:r>
+    </w:p>
+    <w:p>
+      <w:pPr>
+        <w:spacing w:after="80"/>
+      </w:pPr>
+      <w:r>
+        <w:t>• Next.js y React para la interfaz y las rutas del sitio.</w:t>
+      </w:r>
+    </w:p>
+    <w:p>
+      <w:pPr>
+        <w:pStyle w:val="Normal"/>
+        <w:spacing w:after="80"/>
+      </w:pPr>
+      <w:r>
+        <w:t>• TypeScript para tipado estático del código de la aplicación.</w:t>
       </w:r>
     </w:p>
     <w:p>
@@ -966,7 +1241,7 @@
         <w:ind w:left="360" w:hanging="259"/>
       </w:pPr>
       <w:r>
-        <w:t>? CSS externo y reglas media query para dise?o responsivo.</w:t>
+        <w:t>• CSS externo y reglas media query para diseño responsivo.</w:t>
       </w:r>
     </w:p>
     <w:p>
@@ -975,7 +1250,7 @@
         <w:ind w:left="360" w:hanging="259"/>
       </w:pPr>
       <w:r>
-        <w:t>? Node.js para ejecutar la API simulada y las herramientas del proyecto.</w:t>
+        <w:t>• Node.js para ejecutar la API simulada y las herramientas del proyecto.</w:t>
       </w:r>
     </w:p>
     <w:p>
@@ -984,7 +1259,7 @@
         <w:ind w:left="360" w:hanging="259"/>
       </w:pPr>
       <w:r>
-        <w:t>? Jasmine, Karma y Edge Headless para las pruebas automatizadas.</w:t>
+        <w:t>• Jasmine, Karma y Edge Headless para las pruebas automatizadas.</w:t>
       </w:r>
     </w:p>
     <w:p>
@@ -993,16 +1268,22 @@
         <w:ind w:left="360" w:hanging="259"/>
       </w:pPr>
       <w:r>
-        <w:t>? Git y GitHub para control de versiones y trabajo colaborativo.</w:t>
+        <w:t>• Git y GitHub para control de versiones y trabajo colaborativo.</w:t>
       </w:r>
     </w:p>
     <w:p>
       <w:pPr>
         <w:spacing w:after="80"/>
         <w:ind w:left="360" w:hanging="259"/>
-      </w:pPr>
-      <w:r>
-        <w:t>5 Propuesta de soluci?n</w:t>
+        <w:pStyle w:val="Heading1"/>
+        <w:keepNext/>
+      </w:pPr>
+      <w:r>
+        <w:rPr>
+          <w:b w:val="1"/>
+          <w:sz w:val="26"/>
+        </w:rPr>
+        <w:t>5 Propuesta de solución</w:t>
       </w:r>
     </w:p>
     <w:p>
@@ -1011,15 +1292,20 @@
         <w:ind w:left="360" w:hanging="259"/>
       </w:pPr>
       <w:r>
-        <w:t>Se propone una interfaz clara en tonos turquesa asociada a salud y confianza. La aplicaci?n organiza la informaci?n en p?ginas interconectadas, carga los tratamientos desde una API simulada, permite seleccionar un tratamiento y entrega un formulario accesible con validaciones espec?ficas. Las pruebas reemplazan window.fetch por mocks para ejecutarse sin depender de una API externa.</w:t>
-      </w:r>
-    </w:p>
-    <w:p>
-      <w:pPr>
-        <w:pStyle w:val="Ttulo1"/>
-        <w:spacing w:after="80"/>
-      </w:pPr>
-      <w:r>
+        <w:t>La interfaz utiliza tonos turquesa y componentes reutilizables con propiedades y estados de React. Next.js organiza las cinco rutas de la clínica. Los datos, componentes, hooks y validaciones tienen responsabilidades separadas. La API entrega los tratamientos; el formulario controla valores y mensajes, enfoca el primer campo incorrecto y permite limpiar. Las pruebas simulan window.fetch para funcionar sin la API real.</w:t>
+      </w:r>
+    </w:p>
+    <w:p>
+      <w:pPr>
+        <w:pStyle w:val="Heading1"/>
+        <w:spacing w:after="80"/>
+        <w:keepNext/>
+      </w:pPr>
+      <w:r>
+        <w:rPr>
+          <w:b w:val="1"/>
+          <w:sz w:val="26"/>
+        </w:rPr>
         <w:t>6 Restricciones</w:t>
       </w:r>
     </w:p>
@@ -1028,16 +1314,16 @@
         <w:spacing w:after="80"/>
       </w:pPr>
       <w:r>
-        <w:t>? El formulario simula una solicitud y no env?a correos ni confirma horas reales.</w:t>
-      </w:r>
-    </w:p>
-    <w:p>
-      <w:pPr>
-        <w:pStyle w:val="Ttulo1"/>
-        <w:spacing w:after="80"/>
-      </w:pPr>
-      <w:r>
-        <w:t>? La API es local y simulada; no existe una base de datos persistente.</w:t>
+        <w:t>• El formulario simula una solicitud y no envía correos ni confirma horas reales.</w:t>
+      </w:r>
+    </w:p>
+    <w:p>
+      <w:pPr>
+        <w:pStyle w:val="Normal"/>
+        <w:spacing w:after="80"/>
+      </w:pPr>
+      <w:r>
+        <w:t>• La API es local y simulada; no existe una base de datos persistente.</w:t>
       </w:r>
     </w:p>
     <w:p>
@@ -1046,7 +1332,7 @@
         <w:ind w:left="360" w:hanging="259"/>
       </w:pPr>
       <w:r>
-        <w:t>? Los precios son referenciales y el contenido audiovisual puede requerir conexi?n a Internet.</w:t>
+        <w:t>• Los precios son referenciales y el contenido audiovisual puede requerir conexión a Internet.</w:t>
       </w:r>
     </w:p>
     <w:p>
@@ -1055,24 +1341,30 @@
         <w:ind w:left="360" w:hanging="259"/>
       </w:pPr>
       <w:r>
-        <w:t>? La cobertura registrada corresponde al archivo instrumentado por la configuraci?n actual de Karma/esbuild, no a toda la aplicaci?n.</w:t>
-      </w:r>
-    </w:p>
-    <w:p>
-      <w:pPr>
-        <w:pStyle w:val="Ttulo1"/>
-        <w:spacing w:after="80"/>
-      </w:pPr>
-      <w:r>
-        <w:t>? El proyecto utiliza CSS nativo; no incorpora Bootstrap.</w:t>
+        <w:t>• La cobertura mide el TypeScript/TSX de app, components, hooks, data y services, incluidos módulos no ejecutados con contadores en cero. Excluye las pruebas, CSS, recursos, tipos y el servidor de la API. Los resultados están en INFORME-TESTING.md y docs/evidencia-cobertura.json.</w:t>
+      </w:r>
+    </w:p>
+    <w:p>
+      <w:pPr>
+        <w:pStyle w:val="Normal"/>
+        <w:spacing w:after="80"/>
+      </w:pPr>
+      <w:r>
+        <w:t>• Se utiliza CSS nativo. La pauta exige Bootstrap: esta diferencia permanece pendiente y no se presenta como cumplimiento de ese requisito.</w:t>
       </w:r>
     </w:p>
     <w:p>
       <w:pPr>
         <w:spacing w:after="80"/>
         <w:ind w:left="360" w:hanging="259"/>
-      </w:pPr>
-      <w:r>
+        <w:pStyle w:val="Heading1"/>
+        <w:keepNext/>
+      </w:pPr>
+      <w:r>
+        <w:rPr>
+          <w:b w:val="1"/>
+          <w:sz w:val="26"/>
+        </w:rPr>
         <w:t>7 Mejoras futuras</w:t>
       </w:r>
     </w:p>
@@ -1082,17 +1374,49 @@
         <w:ind w:left="360" w:hanging="259"/>
       </w:pPr>
       <w:r>
-        <w:t>? Agregar una base de datos para reservas y tratamientos.</w:t>
-      </w:r>
-    </w:p>
-    <w:p>
-      <w:r>
-        <w:t>? Mostrar horas disponibles en tiempo real y enviar confirmaciones por correo.</w:t>
-      </w:r>
-    </w:p>
-    <w:p>
-      <w:r>
-        <w:t>? Incorporar autenticaci?n, pagos o un panel administrativo solo si el alcance del proyecto cambia.</w:t>
+        <w:t>• Agregar una base de datos para reservas y tratamientos.</w:t>
+      </w:r>
+    </w:p>
+    <w:p>
+      <w:r>
+        <w:t>• Mostrar horas disponibles en tiempo real y enviar confirmaciones por correo.</w:t>
+      </w:r>
+    </w:p>
+    <w:p>
+      <w:r>
+        <w:t>• Incorporar autenticación, pagos o un panel administrativo solo si el alcance del proyecto cambia.</w:t>
+      </w:r>
+    </w:p>
+    <w:p>
+      <w:pPr>
+        <w:spacing w:after="80"/>
+        <w:pStyle w:val="Heading1"/>
+        <w:keepNext/>
+      </w:pPr>
+      <w:r>
+        <w:rPr>
+          <w:b w:val="1"/>
+          <w:sz w:val="26"/>
+        </w:rPr>
+        <w:t>8 Pruebas y verificación</w:t>
+      </w:r>
+    </w:p>
+    <w:p>
+      <w:pPr>
+        <w:spacing w:after="80"/>
+        <w:pStyle w:val="Normal"/>
+      </w:pPr>
+      <w:r>
+        <w:t>Se mantienen diez pruebas con Jasmine y Karma: cuatro de validaciones, cuatro de catálogo y dos de formulario. Los mocks simulan tratamientos disponibles, lista vacía y error HTTP. Estos casos no sustituyen una revisión completa de accesibilidad ni prueban el servidor real.</w:t>
+      </w:r>
+    </w:p>
+    <w:p>
+      <w:pPr>
+        <w:spacing w:after="80"/>
+        <w:pStyle w:val="Normal"/>
+      </w:pPr>
+      <w:r>
+        <w:t>La evidencia del 24 de octubre de 2026 registra diez pruebas exitosas y cero fallidas. La cobertura sobre 29 archivos de aplicación es 69,65 % de líneas, 68,42 % de sentencias, 71,69 % de ramas y 59,64 % de funciones. TypeScript y compilación también finalizaron correctamente en esa verificación. Los resultados no equivalen a cobertura total ni a una nota académica.</w:t>
       </w:r>
     </w:p>
     <w:sectPr>

</xml_diff>

<commit_message>
Actualizar ERS con el estado actual del proyecto
</commit_message>
<xml_diff>
--- a/ERS.docx
+++ b/ERS.docx
@@ -9,7 +9,11 @@
         <w:jc w:val="center"/>
       </w:pPr>
       <w:r>
-        <w:t>ERS Clínica Aura</w:t>
+        <w:rPr>
+          <w:rFonts w:ascii="Calibri" w:hAnsi="Calibri"/>
+          <w:color w:val="000000"/>
+        </w:rPr>
+        <w:t>Especificación de requisitos de Clínica Aura</w:t>
       </w:r>
     </w:p>
     <w:p>
@@ -18,7 +22,7 @@
         <w:jc w:val="center"/>
       </w:pPr>
       <w:r>
-        <w:t>Especificación de Requisitos del Software - Versión 2</w:t>
+        <w:t>Versión 3 | Actualización del 27 de octubre de 2026</w:t>
       </w:r>
     </w:p>
     <w:p>
@@ -26,19 +30,20 @@
         <w:spacing w:after="80"/>
       </w:pPr>
       <w:r>
-        <w:t>Este documento describe los requisitos implementados en el frontend de Clínica Aura para la Evaluación Parcial 2. El alcance se limita a las funciones disponibles en el proyecto actual.</w:t>
+        <w:t>Este documento define los requisitos y el alcance implementado del frontend de Clínica Aura para la Evaluación Parcial 2. La aplicación permite consultar tratamientos y validar datos de una evaluación de demostración; no registra reservas ni confirma horas. Autores: Benjamin Diaz y Bikenson Fenelus.</w:t>
       </w:r>
     </w:p>
     <w:p>
       <w:pPr>
-        <w:pStyle w:val="Heading1"/>
+        <w:pStyle w:val="Ttulo1"/>
         <w:spacing w:after="80"/>
         <w:keepNext/>
       </w:pPr>
       <w:r>
         <w:rPr>
+          <w:rFonts w:ascii="Calibri" w:hAnsi="Calibri"/>
           <w:b w:val="1"/>
-          <w:sz w:val="26"/>
+          <w:color w:val="000000"/>
         </w:rPr>
         <w:t>1 Introducción</w:t>
       </w:r>
@@ -49,7 +54,11 @@
         <w:spacing w:after="80"/>
       </w:pPr>
       <w:r>
-        <w:t>1.1 Propósito</w:t>
+        <w:rPr>
+          <w:rFonts w:ascii="Calibri" w:hAnsi="Calibri"/>
+          <w:color w:val="000000"/>
+        </w:rPr>
+        <w:t>1 1 Propósito</w:t>
       </w:r>
     </w:p>
     <w:p>
@@ -66,7 +75,11 @@
         <w:spacing w:after="80"/>
       </w:pPr>
       <w:r>
-        <w:t>1.2 Alcance</w:t>
+        <w:rPr>
+          <w:rFonts w:ascii="Calibri" w:hAnsi="Calibri"/>
+          <w:color w:val="000000"/>
+        </w:rPr>
+        <w:t>1 2 Alcance</w:t>
       </w:r>
     </w:p>
     <w:p>
@@ -83,7 +96,11 @@
         <w:spacing w:after="80"/>
       </w:pPr>
       <w:r>
-        <w:t>1.3 Público objetivo</w:t>
+        <w:rPr>
+          <w:rFonts w:ascii="Calibri" w:hAnsi="Calibri"/>
+          <w:color w:val="000000"/>
+        </w:rPr>
+        <w:t>1 3 Público objetivo</w:t>
       </w:r>
     </w:p>
     <w:p>
@@ -91,19 +108,20 @@
         <w:spacing w:after="80"/>
       </w:pPr>
       <w:r>
-        <w:t>Personas interesadas en servicios dentales o faciales que desean informarse, revisar tratamientos o solicitar una evaluación.</w:t>
+        <w:t>Personas interesadas en informarse sobre servicios dentales y faciales, revisar tratamientos y completar un formulario de evaluación de demostración.</w:t>
       </w:r>
     </w:p>
     <w:p>
       <w:pPr>
-        <w:pStyle w:val="Heading1"/>
+        <w:pStyle w:val="Ttulo1"/>
         <w:spacing w:after="80"/>
         <w:keepNext/>
       </w:pPr>
       <w:r>
         <w:rPr>
+          <w:rFonts w:ascii="Calibri" w:hAnsi="Calibri"/>
           <w:b w:val="1"/>
-          <w:sz w:val="26"/>
+          <w:color w:val="000000"/>
         </w:rPr>
         <w:t>2 Requerimientos funcionales</w:t>
       </w:r>
@@ -115,17 +133,19 @@
         <w:tblLook w:firstColumn="1" w:firstRow="1" w:lastColumn="0" w:lastRow="0" w:noHBand="0" w:noVBand="1" w:val="04A0"/>
       </w:tblPr>
       <w:tblGrid>
-        <w:gridCol w:w="1224"/>
-        <w:gridCol w:w="8640"/>
+        <w:gridCol w:w="1191"/>
+        <w:gridCol w:w="8164"/>
       </w:tblGrid>
       <w:tr>
         <w:trPr>
           <w:cantSplit/>
           <w:tblHeader/>
+          <w:tblHeader/>
+          <w:cantSplit/>
         </w:trPr>
         <w:tc>
           <w:tcPr>
-            <w:tcW w:type="dxa" w:w="1224"/>
+            <w:tcW w:type="dxa" w:w="1191"/>
             <w:shd w:fill="007C83"/>
             <w:tcBorders>
               <w:top w:val="single" w:sz="6" w:color="D9D9D9"/>
@@ -136,16 +156,38 @@
               <w:insideV w:val="single" w:sz="6" w:color="D9D9D9"/>
             </w:tcBorders>
             <w:vAlign w:val="center"/>
-          </w:tcPr>
-          <w:p>
-            <w:r>
+            <w:tcMar>
+              <w:top w:w="90" w:type="dxa"/>
+              <w:left w:w="90" w:type="dxa"/>
+              <w:bottom w:w="90" w:type="dxa"/>
+              <w:right w:w="90" w:type="dxa"/>
+            </w:tcMar>
+            <w:tcBorders>
+              <w:top w:val="single" w:sz="4" w:color="D9D9D9"/>
+              <w:left w:val="single" w:sz="4" w:color="D9D9D9"/>
+              <w:bottom w:val="single" w:sz="4" w:color="D9D9D9"/>
+              <w:right w:val="single" w:sz="4" w:color="D9D9D9"/>
+            </w:tcBorders>
+            <w:shd w:fill="E7E6E6"/>
+          </w:tcPr>
+          <w:p>
+            <w:pPr>
+              <w:keepNext/>
+              <w:spacing w:after="60" w:before="60"/>
+            </w:pPr>
+            <w:r>
+              <w:rPr>
+                <w:b/>
+                <w:color w:val="000000"/>
+                <w:sz w:val="20"/>
+              </w:rPr>
               <w:t>Código</w:t>
             </w:r>
           </w:p>
         </w:tc>
         <w:tc>
           <w:tcPr>
-            <w:tcW w:type="dxa" w:w="8640"/>
+            <w:tcW w:type="dxa" w:w="8164"/>
             <w:shd w:fill="007C83"/>
             <w:tcBorders>
               <w:top w:val="single" w:sz="6" w:color="D9D9D9"/>
@@ -156,9 +198,31 @@
               <w:insideV w:val="single" w:sz="6" w:color="D9D9D9"/>
             </w:tcBorders>
             <w:vAlign w:val="center"/>
-          </w:tcPr>
-          <w:p>
-            <w:r>
+            <w:tcMar>
+              <w:top w:w="90" w:type="dxa"/>
+              <w:left w:w="90" w:type="dxa"/>
+              <w:bottom w:w="90" w:type="dxa"/>
+              <w:right w:w="90" w:type="dxa"/>
+            </w:tcMar>
+            <w:tcBorders>
+              <w:top w:val="single" w:sz="4" w:color="D9D9D9"/>
+              <w:left w:val="single" w:sz="4" w:color="D9D9D9"/>
+              <w:bottom w:val="single" w:sz="4" w:color="D9D9D9"/>
+              <w:right w:val="single" w:sz="4" w:color="D9D9D9"/>
+            </w:tcBorders>
+            <w:shd w:fill="E7E6E6"/>
+          </w:tcPr>
+          <w:p>
+            <w:pPr>
+              <w:keepNext/>
+              <w:spacing w:after="60" w:before="60"/>
+            </w:pPr>
+            <w:r>
+              <w:rPr>
+                <w:b/>
+                <w:color w:val="000000"/>
+                <w:sz w:val="20"/>
+              </w:rPr>
               <w:t>Requerimiento</w:t>
             </w:r>
           </w:p>
@@ -167,41 +231,82 @@
       <w:tr>
         <w:trPr>
           <w:cantSplit/>
+          <w:cantSplit/>
         </w:trPr>
         <w:tc>
           <w:tcPr>
-            <w:tcW w:type="dxa" w:w="1224"/>
-            <w:tcBorders>
-              <w:top w:val="single" w:sz="6" w:color="D9D9D9"/>
-              <w:left w:val="single" w:sz="6" w:color="D9D9D9"/>
-              <w:bottom w:val="single" w:sz="6" w:color="D9D9D9"/>
-              <w:right w:val="single" w:sz="6" w:color="D9D9D9"/>
-              <w:insideH w:val="single" w:sz="6" w:color="D9D9D9"/>
-              <w:insideV w:val="single" w:sz="6" w:color="D9D9D9"/>
-            </w:tcBorders>
-            <w:vAlign w:val="center"/>
-          </w:tcPr>
-          <w:p>
-            <w:r>
+            <w:tcW w:type="dxa" w:w="1191"/>
+            <w:tcBorders>
+              <w:top w:val="single" w:sz="6" w:color="D9D9D9"/>
+              <w:left w:val="single" w:sz="6" w:color="D9D9D9"/>
+              <w:bottom w:val="single" w:sz="6" w:color="D9D9D9"/>
+              <w:right w:val="single" w:sz="6" w:color="D9D9D9"/>
+              <w:insideH w:val="single" w:sz="6" w:color="D9D9D9"/>
+              <w:insideV w:val="single" w:sz="6" w:color="D9D9D9"/>
+            </w:tcBorders>
+            <w:vAlign w:val="center"/>
+            <w:tcMar>
+              <w:top w:w="90" w:type="dxa"/>
+              <w:left w:w="90" w:type="dxa"/>
+              <w:bottom w:w="90" w:type="dxa"/>
+              <w:right w:w="90" w:type="dxa"/>
+            </w:tcMar>
+            <w:tcBorders>
+              <w:top w:val="single" w:sz="4" w:color="D9D9D9"/>
+              <w:left w:val="single" w:sz="4" w:color="D9D9D9"/>
+              <w:bottom w:val="single" w:sz="4" w:color="D9D9D9"/>
+              <w:right w:val="single" w:sz="4" w:color="D9D9D9"/>
+            </w:tcBorders>
+          </w:tcPr>
+          <w:p>
+            <w:pPr>
+              <w:spacing w:after="60" w:before="60"/>
+            </w:pPr>
+            <w:r>
+              <w:rPr>
+                <w:b w:val="0"/>
+                <w:color w:val="000000"/>
+                <w:sz w:val="20"/>
+              </w:rPr>
               <w:t>RF-01</w:t>
             </w:r>
           </w:p>
         </w:tc>
         <w:tc>
           <w:tcPr>
-            <w:tcW w:type="dxa" w:w="8640"/>
-            <w:tcBorders>
-              <w:top w:val="single" w:sz="6" w:color="D9D9D9"/>
-              <w:left w:val="single" w:sz="6" w:color="D9D9D9"/>
-              <w:bottom w:val="single" w:sz="6" w:color="D9D9D9"/>
-              <w:right w:val="single" w:sz="6" w:color="D9D9D9"/>
-              <w:insideH w:val="single" w:sz="6" w:color="D9D9D9"/>
-              <w:insideV w:val="single" w:sz="6" w:color="D9D9D9"/>
-            </w:tcBorders>
-            <w:vAlign w:val="center"/>
-          </w:tcPr>
-          <w:p>
-            <w:r>
+            <w:tcW w:type="dxa" w:w="8164"/>
+            <w:tcBorders>
+              <w:top w:val="single" w:sz="6" w:color="D9D9D9"/>
+              <w:left w:val="single" w:sz="6" w:color="D9D9D9"/>
+              <w:bottom w:val="single" w:sz="6" w:color="D9D9D9"/>
+              <w:right w:val="single" w:sz="6" w:color="D9D9D9"/>
+              <w:insideH w:val="single" w:sz="6" w:color="D9D9D9"/>
+              <w:insideV w:val="single" w:sz="6" w:color="D9D9D9"/>
+            </w:tcBorders>
+            <w:vAlign w:val="center"/>
+            <w:tcMar>
+              <w:top w:w="90" w:type="dxa"/>
+              <w:left w:w="90" w:type="dxa"/>
+              <w:bottom w:w="90" w:type="dxa"/>
+              <w:right w:w="90" w:type="dxa"/>
+            </w:tcMar>
+            <w:tcBorders>
+              <w:top w:val="single" w:sz="4" w:color="D9D9D9"/>
+              <w:left w:val="single" w:sz="4" w:color="D9D9D9"/>
+              <w:bottom w:val="single" w:sz="4" w:color="D9D9D9"/>
+              <w:right w:val="single" w:sz="4" w:color="D9D9D9"/>
+            </w:tcBorders>
+          </w:tcPr>
+          <w:p>
+            <w:pPr>
+              <w:spacing w:after="60" w:before="60"/>
+            </w:pPr>
+            <w:r>
+              <w:rPr>
+                <w:b w:val="0"/>
+                <w:color w:val="000000"/>
+                <w:sz w:val="20"/>
+              </w:rPr>
               <w:t>El usuario podrá navegar entre Inicio, Nosotros, Tratamientos, Reserva y Contacto.</w:t>
             </w:r>
           </w:p>
@@ -210,10 +315,11 @@
       <w:tr>
         <w:trPr>
           <w:cantSplit/>
+          <w:cantSplit/>
         </w:trPr>
         <w:tc>
           <w:tcPr>
-            <w:tcW w:type="dxa" w:w="1224"/>
+            <w:tcW w:type="dxa" w:w="1191"/>
             <w:shd w:fill="EAF6F6"/>
             <w:tcBorders>
               <w:top w:val="single" w:sz="6" w:color="D9D9D9"/>
@@ -224,16 +330,36 @@
               <w:insideV w:val="single" w:sz="6" w:color="D9D9D9"/>
             </w:tcBorders>
             <w:vAlign w:val="center"/>
-          </w:tcPr>
-          <w:p>
-            <w:r>
+            <w:tcMar>
+              <w:top w:w="90" w:type="dxa"/>
+              <w:left w:w="90" w:type="dxa"/>
+              <w:bottom w:w="90" w:type="dxa"/>
+              <w:right w:w="90" w:type="dxa"/>
+            </w:tcMar>
+            <w:tcBorders>
+              <w:top w:val="single" w:sz="4" w:color="D9D9D9"/>
+              <w:left w:val="single" w:sz="4" w:color="D9D9D9"/>
+              <w:bottom w:val="single" w:sz="4" w:color="D9D9D9"/>
+              <w:right w:val="single" w:sz="4" w:color="D9D9D9"/>
+            </w:tcBorders>
+          </w:tcPr>
+          <w:p>
+            <w:pPr>
+              <w:spacing w:after="60" w:before="60"/>
+            </w:pPr>
+            <w:r>
+              <w:rPr>
+                <w:b w:val="0"/>
+                <w:color w:val="000000"/>
+                <w:sz w:val="20"/>
+              </w:rPr>
               <w:t>RF-02</w:t>
             </w:r>
           </w:p>
         </w:tc>
         <w:tc>
           <w:tcPr>
-            <w:tcW w:type="dxa" w:w="8640"/>
+            <w:tcW w:type="dxa" w:w="8164"/>
             <w:shd w:fill="EAF6F6"/>
             <w:tcBorders>
               <w:top w:val="single" w:sz="6" w:color="D9D9D9"/>
@@ -244,9 +370,29 @@
               <w:insideV w:val="single" w:sz="6" w:color="D9D9D9"/>
             </w:tcBorders>
             <w:vAlign w:val="center"/>
-          </w:tcPr>
-          <w:p>
-            <w:r>
+            <w:tcMar>
+              <w:top w:w="90" w:type="dxa"/>
+              <w:left w:w="90" w:type="dxa"/>
+              <w:bottom w:w="90" w:type="dxa"/>
+              <w:right w:w="90" w:type="dxa"/>
+            </w:tcMar>
+            <w:tcBorders>
+              <w:top w:val="single" w:sz="4" w:color="D9D9D9"/>
+              <w:left w:val="single" w:sz="4" w:color="D9D9D9"/>
+              <w:bottom w:val="single" w:sz="4" w:color="D9D9D9"/>
+              <w:right w:val="single" w:sz="4" w:color="D9D9D9"/>
+            </w:tcBorders>
+          </w:tcPr>
+          <w:p>
+            <w:pPr>
+              <w:spacing w:after="60" w:before="60"/>
+            </w:pPr>
+            <w:r>
+              <w:rPr>
+                <w:b w:val="0"/>
+                <w:color w:val="000000"/>
+                <w:sz w:val="20"/>
+              </w:rPr>
               <w:t>El sistema consultará los tratamientos mediante la API simulada local.</w:t>
             </w:r>
           </w:p>
@@ -255,41 +401,82 @@
       <w:tr>
         <w:trPr>
           <w:cantSplit/>
+          <w:cantSplit/>
         </w:trPr>
         <w:tc>
           <w:tcPr>
-            <w:tcW w:type="dxa" w:w="1224"/>
-            <w:tcBorders>
-              <w:top w:val="single" w:sz="6" w:color="D9D9D9"/>
-              <w:left w:val="single" w:sz="6" w:color="D9D9D9"/>
-              <w:bottom w:val="single" w:sz="6" w:color="D9D9D9"/>
-              <w:right w:val="single" w:sz="6" w:color="D9D9D9"/>
-              <w:insideH w:val="single" w:sz="6" w:color="D9D9D9"/>
-              <w:insideV w:val="single" w:sz="6" w:color="D9D9D9"/>
-            </w:tcBorders>
-            <w:vAlign w:val="center"/>
-          </w:tcPr>
-          <w:p>
-            <w:r>
+            <w:tcW w:type="dxa" w:w="1191"/>
+            <w:tcBorders>
+              <w:top w:val="single" w:sz="6" w:color="D9D9D9"/>
+              <w:left w:val="single" w:sz="6" w:color="D9D9D9"/>
+              <w:bottom w:val="single" w:sz="6" w:color="D9D9D9"/>
+              <w:right w:val="single" w:sz="6" w:color="D9D9D9"/>
+              <w:insideH w:val="single" w:sz="6" w:color="D9D9D9"/>
+              <w:insideV w:val="single" w:sz="6" w:color="D9D9D9"/>
+            </w:tcBorders>
+            <w:vAlign w:val="center"/>
+            <w:tcMar>
+              <w:top w:w="90" w:type="dxa"/>
+              <w:left w:w="90" w:type="dxa"/>
+              <w:bottom w:w="90" w:type="dxa"/>
+              <w:right w:w="90" w:type="dxa"/>
+            </w:tcMar>
+            <w:tcBorders>
+              <w:top w:val="single" w:sz="4" w:color="D9D9D9"/>
+              <w:left w:val="single" w:sz="4" w:color="D9D9D9"/>
+              <w:bottom w:val="single" w:sz="4" w:color="D9D9D9"/>
+              <w:right w:val="single" w:sz="4" w:color="D9D9D9"/>
+            </w:tcBorders>
+          </w:tcPr>
+          <w:p>
+            <w:pPr>
+              <w:spacing w:after="60" w:before="60"/>
+            </w:pPr>
+            <w:r>
+              <w:rPr>
+                <w:b w:val="0"/>
+                <w:color w:val="000000"/>
+                <w:sz w:val="20"/>
+              </w:rPr>
               <w:t>RF-03</w:t>
             </w:r>
           </w:p>
         </w:tc>
         <w:tc>
           <w:tcPr>
-            <w:tcW w:type="dxa" w:w="8640"/>
-            <w:tcBorders>
-              <w:top w:val="single" w:sz="6" w:color="D9D9D9"/>
-              <w:left w:val="single" w:sz="6" w:color="D9D9D9"/>
-              <w:bottom w:val="single" w:sz="6" w:color="D9D9D9"/>
-              <w:right w:val="single" w:sz="6" w:color="D9D9D9"/>
-              <w:insideH w:val="single" w:sz="6" w:color="D9D9D9"/>
-              <w:insideV w:val="single" w:sz="6" w:color="D9D9D9"/>
-            </w:tcBorders>
-            <w:vAlign w:val="center"/>
-          </w:tcPr>
-          <w:p>
-            <w:r>
+            <w:tcW w:type="dxa" w:w="8164"/>
+            <w:tcBorders>
+              <w:top w:val="single" w:sz="6" w:color="D9D9D9"/>
+              <w:left w:val="single" w:sz="6" w:color="D9D9D9"/>
+              <w:bottom w:val="single" w:sz="6" w:color="D9D9D9"/>
+              <w:right w:val="single" w:sz="6" w:color="D9D9D9"/>
+              <w:insideH w:val="single" w:sz="6" w:color="D9D9D9"/>
+              <w:insideV w:val="single" w:sz="6" w:color="D9D9D9"/>
+            </w:tcBorders>
+            <w:vAlign w:val="center"/>
+            <w:tcMar>
+              <w:top w:w="90" w:type="dxa"/>
+              <w:left w:w="90" w:type="dxa"/>
+              <w:bottom w:w="90" w:type="dxa"/>
+              <w:right w:w="90" w:type="dxa"/>
+            </w:tcMar>
+            <w:tcBorders>
+              <w:top w:val="single" w:sz="4" w:color="D9D9D9"/>
+              <w:left w:val="single" w:sz="4" w:color="D9D9D9"/>
+              <w:bottom w:val="single" w:sz="4" w:color="D9D9D9"/>
+              <w:right w:val="single" w:sz="4" w:color="D9D9D9"/>
+            </w:tcBorders>
+          </w:tcPr>
+          <w:p>
+            <w:pPr>
+              <w:spacing w:after="60" w:before="60"/>
+            </w:pPr>
+            <w:r>
+              <w:rPr>
+                <w:b w:val="0"/>
+                <w:color w:val="000000"/>
+                <w:sz w:val="20"/>
+              </w:rPr>
               <w:t>El catálogo mostrará nombre, descripción, imagen y precio referencial de cada tratamiento.</w:t>
             </w:r>
           </w:p>
@@ -298,10 +485,11 @@
       <w:tr>
         <w:trPr>
           <w:cantSplit/>
+          <w:cantSplit/>
         </w:trPr>
         <w:tc>
           <w:tcPr>
-            <w:tcW w:type="dxa" w:w="1224"/>
+            <w:tcW w:type="dxa" w:w="1191"/>
             <w:shd w:fill="EAF6F6"/>
             <w:tcBorders>
               <w:top w:val="single" w:sz="6" w:color="D9D9D9"/>
@@ -312,16 +500,36 @@
               <w:insideV w:val="single" w:sz="6" w:color="D9D9D9"/>
             </w:tcBorders>
             <w:vAlign w:val="center"/>
-          </w:tcPr>
-          <w:p>
-            <w:r>
+            <w:tcMar>
+              <w:top w:w="90" w:type="dxa"/>
+              <w:left w:w="90" w:type="dxa"/>
+              <w:bottom w:w="90" w:type="dxa"/>
+              <w:right w:w="90" w:type="dxa"/>
+            </w:tcMar>
+            <w:tcBorders>
+              <w:top w:val="single" w:sz="4" w:color="D9D9D9"/>
+              <w:left w:val="single" w:sz="4" w:color="D9D9D9"/>
+              <w:bottom w:val="single" w:sz="4" w:color="D9D9D9"/>
+              <w:right w:val="single" w:sz="4" w:color="D9D9D9"/>
+            </w:tcBorders>
+          </w:tcPr>
+          <w:p>
+            <w:pPr>
+              <w:spacing w:after="60" w:before="60"/>
+            </w:pPr>
+            <w:r>
+              <w:rPr>
+                <w:b w:val="0"/>
+                <w:color w:val="000000"/>
+                <w:sz w:val="20"/>
+              </w:rPr>
               <w:t>RF-04</w:t>
             </w:r>
           </w:p>
         </w:tc>
         <w:tc>
           <w:tcPr>
-            <w:tcW w:type="dxa" w:w="8640"/>
+            <w:tcW w:type="dxa" w:w="8164"/>
             <w:shd w:fill="EAF6F6"/>
             <w:tcBorders>
               <w:top w:val="single" w:sz="6" w:color="D9D9D9"/>
@@ -332,9 +540,29 @@
               <w:insideV w:val="single" w:sz="6" w:color="D9D9D9"/>
             </w:tcBorders>
             <w:vAlign w:val="center"/>
-          </w:tcPr>
-          <w:p>
-            <w:r>
+            <w:tcMar>
+              <w:top w:w="90" w:type="dxa"/>
+              <w:left w:w="90" w:type="dxa"/>
+              <w:bottom w:w="90" w:type="dxa"/>
+              <w:right w:w="90" w:type="dxa"/>
+            </w:tcMar>
+            <w:tcBorders>
+              <w:top w:val="single" w:sz="4" w:color="D9D9D9"/>
+              <w:left w:val="single" w:sz="4" w:color="D9D9D9"/>
+              <w:bottom w:val="single" w:sz="4" w:color="D9D9D9"/>
+              <w:right w:val="single" w:sz="4" w:color="D9D9D9"/>
+            </w:tcBorders>
+          </w:tcPr>
+          <w:p>
+            <w:pPr>
+              <w:spacing w:after="60" w:before="60"/>
+            </w:pPr>
+            <w:r>
+              <w:rPr>
+                <w:b w:val="0"/>
+                <w:color w:val="000000"/>
+                <w:sz w:val="20"/>
+              </w:rPr>
               <w:t>El sistema informará estados de carga, lista vacía y error cuando corresponda.</w:t>
             </w:r>
           </w:p>
@@ -343,41 +571,82 @@
       <w:tr>
         <w:trPr>
           <w:cantSplit/>
+          <w:cantSplit/>
         </w:trPr>
         <w:tc>
           <w:tcPr>
-            <w:tcW w:type="dxa" w:w="1224"/>
-            <w:tcBorders>
-              <w:top w:val="single" w:sz="6" w:color="D9D9D9"/>
-              <w:left w:val="single" w:sz="6" w:color="D9D9D9"/>
-              <w:bottom w:val="single" w:sz="6" w:color="D9D9D9"/>
-              <w:right w:val="single" w:sz="6" w:color="D9D9D9"/>
-              <w:insideH w:val="single" w:sz="6" w:color="D9D9D9"/>
-              <w:insideV w:val="single" w:sz="6" w:color="D9D9D9"/>
-            </w:tcBorders>
-            <w:vAlign w:val="center"/>
-          </w:tcPr>
-          <w:p>
-            <w:r>
+            <w:tcW w:type="dxa" w:w="1191"/>
+            <w:tcBorders>
+              <w:top w:val="single" w:sz="6" w:color="D9D9D9"/>
+              <w:left w:val="single" w:sz="6" w:color="D9D9D9"/>
+              <w:bottom w:val="single" w:sz="6" w:color="D9D9D9"/>
+              <w:right w:val="single" w:sz="6" w:color="D9D9D9"/>
+              <w:insideH w:val="single" w:sz="6" w:color="D9D9D9"/>
+              <w:insideV w:val="single" w:sz="6" w:color="D9D9D9"/>
+            </w:tcBorders>
+            <w:vAlign w:val="center"/>
+            <w:tcMar>
+              <w:top w:w="90" w:type="dxa"/>
+              <w:left w:w="90" w:type="dxa"/>
+              <w:bottom w:w="90" w:type="dxa"/>
+              <w:right w:w="90" w:type="dxa"/>
+            </w:tcMar>
+            <w:tcBorders>
+              <w:top w:val="single" w:sz="4" w:color="D9D9D9"/>
+              <w:left w:val="single" w:sz="4" w:color="D9D9D9"/>
+              <w:bottom w:val="single" w:sz="4" w:color="D9D9D9"/>
+              <w:right w:val="single" w:sz="4" w:color="D9D9D9"/>
+            </w:tcBorders>
+          </w:tcPr>
+          <w:p>
+            <w:pPr>
+              <w:spacing w:after="60" w:before="60"/>
+            </w:pPr>
+            <w:r>
+              <w:rPr>
+                <w:b w:val="0"/>
+                <w:color w:val="000000"/>
+                <w:sz w:val="20"/>
+              </w:rPr>
               <w:t>RF-05</w:t>
             </w:r>
           </w:p>
         </w:tc>
         <w:tc>
           <w:tcPr>
-            <w:tcW w:type="dxa" w:w="8640"/>
-            <w:tcBorders>
-              <w:top w:val="single" w:sz="6" w:color="D9D9D9"/>
-              <w:left w:val="single" w:sz="6" w:color="D9D9D9"/>
-              <w:bottom w:val="single" w:sz="6" w:color="D9D9D9"/>
-              <w:right w:val="single" w:sz="6" w:color="D9D9D9"/>
-              <w:insideH w:val="single" w:sz="6" w:color="D9D9D9"/>
-              <w:insideV w:val="single" w:sz="6" w:color="D9D9D9"/>
-            </w:tcBorders>
-            <w:vAlign w:val="center"/>
-          </w:tcPr>
-          <w:p>
-            <w:r>
+            <w:tcW w:type="dxa" w:w="8164"/>
+            <w:tcBorders>
+              <w:top w:val="single" w:sz="6" w:color="D9D9D9"/>
+              <w:left w:val="single" w:sz="6" w:color="D9D9D9"/>
+              <w:bottom w:val="single" w:sz="6" w:color="D9D9D9"/>
+              <w:right w:val="single" w:sz="6" w:color="D9D9D9"/>
+              <w:insideH w:val="single" w:sz="6" w:color="D9D9D9"/>
+              <w:insideV w:val="single" w:sz="6" w:color="D9D9D9"/>
+            </w:tcBorders>
+            <w:vAlign w:val="center"/>
+            <w:tcMar>
+              <w:top w:w="90" w:type="dxa"/>
+              <w:left w:w="90" w:type="dxa"/>
+              <w:bottom w:w="90" w:type="dxa"/>
+              <w:right w:w="90" w:type="dxa"/>
+            </w:tcMar>
+            <w:tcBorders>
+              <w:top w:val="single" w:sz="4" w:color="D9D9D9"/>
+              <w:left w:val="single" w:sz="4" w:color="D9D9D9"/>
+              <w:bottom w:val="single" w:sz="4" w:color="D9D9D9"/>
+              <w:right w:val="single" w:sz="4" w:color="D9D9D9"/>
+            </w:tcBorders>
+          </w:tcPr>
+          <w:p>
+            <w:pPr>
+              <w:spacing w:after="60" w:before="60"/>
+            </w:pPr>
+            <w:r>
+              <w:rPr>
+                <w:b w:val="0"/>
+                <w:color w:val="000000"/>
+                <w:sz w:val="20"/>
+              </w:rPr>
               <w:t>El usuario podrá seleccionar un solo tratamiento y acceder a Reserva con ese tratamiento.</w:t>
             </w:r>
           </w:p>
@@ -386,10 +655,11 @@
       <w:tr>
         <w:trPr>
           <w:cantSplit/>
+          <w:cantSplit/>
         </w:trPr>
         <w:tc>
           <w:tcPr>
-            <w:tcW w:type="dxa" w:w="1224"/>
+            <w:tcW w:type="dxa" w:w="1191"/>
             <w:shd w:fill="EAF6F6"/>
             <w:tcBorders>
               <w:top w:val="single" w:sz="6" w:color="D9D9D9"/>
@@ -400,16 +670,36 @@
               <w:insideV w:val="single" w:sz="6" w:color="D9D9D9"/>
             </w:tcBorders>
             <w:vAlign w:val="center"/>
-          </w:tcPr>
-          <w:p>
-            <w:r>
+            <w:tcMar>
+              <w:top w:w="90" w:type="dxa"/>
+              <w:left w:w="90" w:type="dxa"/>
+              <w:bottom w:w="90" w:type="dxa"/>
+              <w:right w:w="90" w:type="dxa"/>
+            </w:tcMar>
+            <w:tcBorders>
+              <w:top w:val="single" w:sz="4" w:color="D9D9D9"/>
+              <w:left w:val="single" w:sz="4" w:color="D9D9D9"/>
+              <w:bottom w:val="single" w:sz="4" w:color="D9D9D9"/>
+              <w:right w:val="single" w:sz="4" w:color="D9D9D9"/>
+            </w:tcBorders>
+          </w:tcPr>
+          <w:p>
+            <w:pPr>
+              <w:spacing w:after="60" w:before="60"/>
+            </w:pPr>
+            <w:r>
+              <w:rPr>
+                <w:b w:val="0"/>
+                <w:color w:val="000000"/>
+                <w:sz w:val="20"/>
+              </w:rPr>
               <w:t>RF-06</w:t>
             </w:r>
           </w:p>
         </w:tc>
         <w:tc>
           <w:tcPr>
-            <w:tcW w:type="dxa" w:w="8640"/>
+            <w:tcW w:type="dxa" w:w="8164"/>
             <w:shd w:fill="EAF6F6"/>
             <w:tcBorders>
               <w:top w:val="single" w:sz="6" w:color="D9D9D9"/>
@@ -420,10 +710,30 @@
               <w:insideV w:val="single" w:sz="6" w:color="D9D9D9"/>
             </w:tcBorders>
             <w:vAlign w:val="center"/>
-          </w:tcPr>
-          <w:p>
-            <w:r>
-              <w:t>El usuario podrá completar una solicitud de reserva con nombre, RUT, correo, servicio y comentario.</w:t>
+            <w:tcMar>
+              <w:top w:w="90" w:type="dxa"/>
+              <w:left w:w="90" w:type="dxa"/>
+              <w:bottom w:w="90" w:type="dxa"/>
+              <w:right w:w="90" w:type="dxa"/>
+            </w:tcMar>
+            <w:tcBorders>
+              <w:top w:val="single" w:sz="4" w:color="D9D9D9"/>
+              <w:left w:val="single" w:sz="4" w:color="D9D9D9"/>
+              <w:bottom w:val="single" w:sz="4" w:color="D9D9D9"/>
+              <w:right w:val="single" w:sz="4" w:color="D9D9D9"/>
+            </w:tcBorders>
+          </w:tcPr>
+          <w:p>
+            <w:pPr>
+              <w:spacing w:after="60" w:before="60"/>
+            </w:pPr>
+            <w:r>
+              <w:rPr>
+                <w:b w:val="0"/>
+                <w:color w:val="000000"/>
+                <w:sz w:val="20"/>
+              </w:rPr>
+              <w:t>El usuario podrá completar un formulario de evaluación de demostración con nombre, RUT, correo, servicio y comentario.</w:t>
             </w:r>
           </w:p>
         </w:tc>
@@ -431,42 +741,83 @@
       <w:tr>
         <w:trPr>
           <w:cantSplit/>
+          <w:cantSplit/>
         </w:trPr>
         <w:tc>
           <w:tcPr>
-            <w:tcW w:type="dxa" w:w="1224"/>
-            <w:tcBorders>
-              <w:top w:val="single" w:sz="6" w:color="D9D9D9"/>
-              <w:left w:val="single" w:sz="6" w:color="D9D9D9"/>
-              <w:bottom w:val="single" w:sz="6" w:color="D9D9D9"/>
-              <w:right w:val="single" w:sz="6" w:color="D9D9D9"/>
-              <w:insideH w:val="single" w:sz="6" w:color="D9D9D9"/>
-              <w:insideV w:val="single" w:sz="6" w:color="D9D9D9"/>
-            </w:tcBorders>
-            <w:vAlign w:val="center"/>
-          </w:tcPr>
-          <w:p>
-            <w:r>
+            <w:tcW w:type="dxa" w:w="1191"/>
+            <w:tcBorders>
+              <w:top w:val="single" w:sz="6" w:color="D9D9D9"/>
+              <w:left w:val="single" w:sz="6" w:color="D9D9D9"/>
+              <w:bottom w:val="single" w:sz="6" w:color="D9D9D9"/>
+              <w:right w:val="single" w:sz="6" w:color="D9D9D9"/>
+              <w:insideH w:val="single" w:sz="6" w:color="D9D9D9"/>
+              <w:insideV w:val="single" w:sz="6" w:color="D9D9D9"/>
+            </w:tcBorders>
+            <w:vAlign w:val="center"/>
+            <w:tcMar>
+              <w:top w:w="90" w:type="dxa"/>
+              <w:left w:w="90" w:type="dxa"/>
+              <w:bottom w:w="90" w:type="dxa"/>
+              <w:right w:w="90" w:type="dxa"/>
+            </w:tcMar>
+            <w:tcBorders>
+              <w:top w:val="single" w:sz="4" w:color="D9D9D9"/>
+              <w:left w:val="single" w:sz="4" w:color="D9D9D9"/>
+              <w:bottom w:val="single" w:sz="4" w:color="D9D9D9"/>
+              <w:right w:val="single" w:sz="4" w:color="D9D9D9"/>
+            </w:tcBorders>
+          </w:tcPr>
+          <w:p>
+            <w:pPr>
+              <w:spacing w:after="60" w:before="60"/>
+            </w:pPr>
+            <w:r>
+              <w:rPr>
+                <w:b w:val="0"/>
+                <w:color w:val="000000"/>
+                <w:sz w:val="20"/>
+              </w:rPr>
               <w:t>RF-07</w:t>
             </w:r>
           </w:p>
         </w:tc>
         <w:tc>
           <w:tcPr>
-            <w:tcW w:type="dxa" w:w="8640"/>
-            <w:tcBorders>
-              <w:top w:val="single" w:sz="6" w:color="D9D9D9"/>
-              <w:left w:val="single" w:sz="6" w:color="D9D9D9"/>
-              <w:bottom w:val="single" w:sz="6" w:color="D9D9D9"/>
-              <w:right w:val="single" w:sz="6" w:color="D9D9D9"/>
-              <w:insideH w:val="single" w:sz="6" w:color="D9D9D9"/>
-              <w:insideV w:val="single" w:sz="6" w:color="D9D9D9"/>
-            </w:tcBorders>
-            <w:vAlign w:val="center"/>
-          </w:tcPr>
-          <w:p>
-            <w:r>
-              <w:t>El formulario validará nombre, RUT por módulo 11, correo y servicio del catálogo. El comentario será opcional, con máximo de 500 caracteres. Los errores se asociarán a los campos y el foco irá al primero incorrecto.</w:t>
+            <w:tcW w:type="dxa" w:w="8164"/>
+            <w:tcBorders>
+              <w:top w:val="single" w:sz="6" w:color="D9D9D9"/>
+              <w:left w:val="single" w:sz="6" w:color="D9D9D9"/>
+              <w:bottom w:val="single" w:sz="6" w:color="D9D9D9"/>
+              <w:right w:val="single" w:sz="6" w:color="D9D9D9"/>
+              <w:insideH w:val="single" w:sz="6" w:color="D9D9D9"/>
+              <w:insideV w:val="single" w:sz="6" w:color="D9D9D9"/>
+            </w:tcBorders>
+            <w:vAlign w:val="center"/>
+            <w:tcMar>
+              <w:top w:w="90" w:type="dxa"/>
+              <w:left w:w="90" w:type="dxa"/>
+              <w:bottom w:w="90" w:type="dxa"/>
+              <w:right w:w="90" w:type="dxa"/>
+            </w:tcMar>
+            <w:tcBorders>
+              <w:top w:val="single" w:sz="4" w:color="D9D9D9"/>
+              <w:left w:val="single" w:sz="4" w:color="D9D9D9"/>
+              <w:bottom w:val="single" w:sz="4" w:color="D9D9D9"/>
+              <w:right w:val="single" w:sz="4" w:color="D9D9D9"/>
+            </w:tcBorders>
+          </w:tcPr>
+          <w:p>
+            <w:pPr>
+              <w:spacing w:after="60" w:before="60"/>
+            </w:pPr>
+            <w:r>
+              <w:rPr>
+                <w:b w:val="0"/>
+                <w:color w:val="000000"/>
+                <w:sz w:val="20"/>
+              </w:rPr>
+              <w:t>El formulario validará nombre de 3 a 80 caracteres, letras y separadores permitidos; RUT por módulo 11; correo de hasta 254 caracteres; y servicio presente en el catálogo. El comentario será opcional, con máximo de 500 caracteres. Los errores se asociarán a los campos y el foco irá al primero incorrecto.</w:t>
             </w:r>
           </w:p>
         </w:tc>
@@ -474,10 +825,11 @@
       <w:tr>
         <w:trPr>
           <w:cantSplit/>
+          <w:cantSplit/>
         </w:trPr>
         <w:tc>
           <w:tcPr>
-            <w:tcW w:type="dxa" w:w="1224"/>
+            <w:tcW w:type="dxa" w:w="1191"/>
             <w:shd w:fill="EAF6F6"/>
             <w:tcBorders>
               <w:top w:val="single" w:sz="6" w:color="D9D9D9"/>
@@ -488,16 +840,36 @@
               <w:insideV w:val="single" w:sz="6" w:color="D9D9D9"/>
             </w:tcBorders>
             <w:vAlign w:val="center"/>
-          </w:tcPr>
-          <w:p>
-            <w:r>
+            <w:tcMar>
+              <w:top w:w="90" w:type="dxa"/>
+              <w:left w:w="90" w:type="dxa"/>
+              <w:bottom w:w="90" w:type="dxa"/>
+              <w:right w:w="90" w:type="dxa"/>
+            </w:tcMar>
+            <w:tcBorders>
+              <w:top w:val="single" w:sz="4" w:color="D9D9D9"/>
+              <w:left w:val="single" w:sz="4" w:color="D9D9D9"/>
+              <w:bottom w:val="single" w:sz="4" w:color="D9D9D9"/>
+              <w:right w:val="single" w:sz="4" w:color="D9D9D9"/>
+            </w:tcBorders>
+          </w:tcPr>
+          <w:p>
+            <w:pPr>
+              <w:spacing w:after="60" w:before="60"/>
+            </w:pPr>
+            <w:r>
+              <w:rPr>
+                <w:b w:val="0"/>
+                <w:color w:val="000000"/>
+                <w:sz w:val="20"/>
+              </w:rPr>
               <w:t>RF-08</w:t>
             </w:r>
           </w:p>
         </w:tc>
         <w:tc>
           <w:tcPr>
-            <w:tcW w:type="dxa" w:w="8640"/>
+            <w:tcW w:type="dxa" w:w="8164"/>
             <w:shd w:fill="EAF6F6"/>
             <w:tcBorders>
               <w:top w:val="single" w:sz="6" w:color="D9D9D9"/>
@@ -508,10 +880,30 @@
               <w:insideV w:val="single" w:sz="6" w:color="D9D9D9"/>
             </w:tcBorders>
             <w:vAlign w:val="center"/>
-          </w:tcPr>
-          <w:p>
-            <w:r>
-              <w:t>Con datos válidos, el formulario indicará que es una demostración: no se envió una solicitud ni se reservó una hora real.</w:t>
+            <w:tcMar>
+              <w:top w:w="90" w:type="dxa"/>
+              <w:left w:w="90" w:type="dxa"/>
+              <w:bottom w:w="90" w:type="dxa"/>
+              <w:right w:w="90" w:type="dxa"/>
+            </w:tcMar>
+            <w:tcBorders>
+              <w:top w:val="single" w:sz="4" w:color="D9D9D9"/>
+              <w:left w:val="single" w:sz="4" w:color="D9D9D9"/>
+              <w:bottom w:val="single" w:sz="4" w:color="D9D9D9"/>
+              <w:right w:val="single" w:sz="4" w:color="D9D9D9"/>
+            </w:tcBorders>
+          </w:tcPr>
+          <w:p>
+            <w:pPr>
+              <w:spacing w:after="60" w:before="60"/>
+            </w:pPr>
+            <w:r>
+              <w:rPr>
+                <w:b w:val="0"/>
+                <w:color w:val="000000"/>
+                <w:sz w:val="20"/>
+              </w:rPr>
+              <w:t>Con datos válidos, el formulario mostrará «Datos válidos. Clínica ficticia.». Ese resultado no registra una reserva ni envía una solicitud.</w:t>
             </w:r>
           </w:p>
         </w:tc>
@@ -519,41 +911,82 @@
       <w:tr>
         <w:trPr>
           <w:cantSplit/>
+          <w:cantSplit/>
         </w:trPr>
         <w:tc>
           <w:tcPr>
-            <w:tcW w:type="dxa" w:w="1224"/>
-            <w:tcBorders>
-              <w:top w:val="single" w:sz="6" w:color="D9D9D9"/>
-              <w:left w:val="single" w:sz="6" w:color="D9D9D9"/>
-              <w:bottom w:val="single" w:sz="6" w:color="D9D9D9"/>
-              <w:right w:val="single" w:sz="6" w:color="D9D9D9"/>
-              <w:insideH w:val="single" w:sz="6" w:color="D9D9D9"/>
-              <w:insideV w:val="single" w:sz="6" w:color="D9D9D9"/>
-            </w:tcBorders>
-            <w:vAlign w:val="center"/>
-          </w:tcPr>
-          <w:p>
-            <w:r>
+            <w:tcW w:type="dxa" w:w="1191"/>
+            <w:tcBorders>
+              <w:top w:val="single" w:sz="6" w:color="D9D9D9"/>
+              <w:left w:val="single" w:sz="6" w:color="D9D9D9"/>
+              <w:bottom w:val="single" w:sz="6" w:color="D9D9D9"/>
+              <w:right w:val="single" w:sz="6" w:color="D9D9D9"/>
+              <w:insideH w:val="single" w:sz="6" w:color="D9D9D9"/>
+              <w:insideV w:val="single" w:sz="6" w:color="D9D9D9"/>
+            </w:tcBorders>
+            <w:vAlign w:val="center"/>
+            <w:tcMar>
+              <w:top w:w="90" w:type="dxa"/>
+              <w:left w:w="90" w:type="dxa"/>
+              <w:bottom w:w="90" w:type="dxa"/>
+              <w:right w:w="90" w:type="dxa"/>
+            </w:tcMar>
+            <w:tcBorders>
+              <w:top w:val="single" w:sz="4" w:color="D9D9D9"/>
+              <w:left w:val="single" w:sz="4" w:color="D9D9D9"/>
+              <w:bottom w:val="single" w:sz="4" w:color="D9D9D9"/>
+              <w:right w:val="single" w:sz="4" w:color="D9D9D9"/>
+            </w:tcBorders>
+          </w:tcPr>
+          <w:p>
+            <w:pPr>
+              <w:spacing w:after="60" w:before="60"/>
+            </w:pPr>
+            <w:r>
+              <w:rPr>
+                <w:b w:val="0"/>
+                <w:color w:val="000000"/>
+                <w:sz w:val="20"/>
+              </w:rPr>
               <w:t>RF-09</w:t>
             </w:r>
           </w:p>
         </w:tc>
         <w:tc>
           <w:tcPr>
-            <w:tcW w:type="dxa" w:w="8640"/>
-            <w:tcBorders>
-              <w:top w:val="single" w:sz="6" w:color="D9D9D9"/>
-              <w:left w:val="single" w:sz="6" w:color="D9D9D9"/>
-              <w:bottom w:val="single" w:sz="6" w:color="D9D9D9"/>
-              <w:right w:val="single" w:sz="6" w:color="D9D9D9"/>
-              <w:insideH w:val="single" w:sz="6" w:color="D9D9D9"/>
-              <w:insideV w:val="single" w:sz="6" w:color="D9D9D9"/>
-            </w:tcBorders>
-            <w:vAlign w:val="center"/>
-          </w:tcPr>
-          <w:p>
-            <w:r>
+            <w:tcW w:type="dxa" w:w="8164"/>
+            <w:tcBorders>
+              <w:top w:val="single" w:sz="6" w:color="D9D9D9"/>
+              <w:left w:val="single" w:sz="6" w:color="D9D9D9"/>
+              <w:bottom w:val="single" w:sz="6" w:color="D9D9D9"/>
+              <w:right w:val="single" w:sz="6" w:color="D9D9D9"/>
+              <w:insideH w:val="single" w:sz="6" w:color="D9D9D9"/>
+              <w:insideV w:val="single" w:sz="6" w:color="D9D9D9"/>
+            </w:tcBorders>
+            <w:vAlign w:val="center"/>
+            <w:tcMar>
+              <w:top w:w="90" w:type="dxa"/>
+              <w:left w:w="90" w:type="dxa"/>
+              <w:bottom w:w="90" w:type="dxa"/>
+              <w:right w:w="90" w:type="dxa"/>
+            </w:tcMar>
+            <w:tcBorders>
+              <w:top w:val="single" w:sz="4" w:color="D9D9D9"/>
+              <w:left w:val="single" w:sz="4" w:color="D9D9D9"/>
+              <w:bottom w:val="single" w:sz="4" w:color="D9D9D9"/>
+              <w:right w:val="single" w:sz="4" w:color="D9D9D9"/>
+            </w:tcBorders>
+          </w:tcPr>
+          <w:p>
+            <w:pPr>
+              <w:spacing w:after="60" w:before="60"/>
+            </w:pPr>
+            <w:r>
+              <w:rPr>
+                <w:b w:val="0"/>
+                <w:color w:val="000000"/>
+                <w:sz w:val="20"/>
+              </w:rPr>
               <w:t>El botón Limpiar eliminará valores, errores, selección y resultado del formulario.</w:t>
             </w:r>
           </w:p>
@@ -562,10 +995,11 @@
       <w:tr>
         <w:trPr>
           <w:cantSplit/>
+          <w:cantSplit/>
         </w:trPr>
         <w:tc>
           <w:tcPr>
-            <w:tcW w:type="dxa" w:w="1224"/>
+            <w:tcW w:type="dxa" w:w="1191"/>
             <w:shd w:fill="EAF6F6"/>
             <w:tcBorders>
               <w:top w:val="single" w:sz="6" w:color="D9D9D9"/>
@@ -576,16 +1010,36 @@
               <w:insideV w:val="single" w:sz="6" w:color="D9D9D9"/>
             </w:tcBorders>
             <w:vAlign w:val="center"/>
-          </w:tcPr>
-          <w:p>
-            <w:r>
+            <w:tcMar>
+              <w:top w:w="90" w:type="dxa"/>
+              <w:left w:w="90" w:type="dxa"/>
+              <w:bottom w:w="90" w:type="dxa"/>
+              <w:right w:w="90" w:type="dxa"/>
+            </w:tcMar>
+            <w:tcBorders>
+              <w:top w:val="single" w:sz="4" w:color="D9D9D9"/>
+              <w:left w:val="single" w:sz="4" w:color="D9D9D9"/>
+              <w:bottom w:val="single" w:sz="4" w:color="D9D9D9"/>
+              <w:right w:val="single" w:sz="4" w:color="D9D9D9"/>
+            </w:tcBorders>
+          </w:tcPr>
+          <w:p>
+            <w:pPr>
+              <w:spacing w:after="60" w:before="60"/>
+            </w:pPr>
+            <w:r>
+              <w:rPr>
+                <w:b w:val="0"/>
+                <w:color w:val="000000"/>
+                <w:sz w:val="20"/>
+              </w:rPr>
               <w:t>RF-10</w:t>
             </w:r>
           </w:p>
         </w:tc>
         <w:tc>
           <w:tcPr>
-            <w:tcW w:type="dxa" w:w="8640"/>
+            <w:tcW w:type="dxa" w:w="8164"/>
             <w:shd w:fill="EAF6F6"/>
             <w:tcBorders>
               <w:top w:val="single" w:sz="6" w:color="D9D9D9"/>
@@ -596,9 +1050,29 @@
               <w:insideV w:val="single" w:sz="6" w:color="D9D9D9"/>
             </w:tcBorders>
             <w:vAlign w:val="center"/>
-          </w:tcPr>
-          <w:p>
-            <w:r>
+            <w:tcMar>
+              <w:top w:w="90" w:type="dxa"/>
+              <w:left w:w="90" w:type="dxa"/>
+              <w:bottom w:w="90" w:type="dxa"/>
+              <w:right w:w="90" w:type="dxa"/>
+            </w:tcMar>
+            <w:tcBorders>
+              <w:top w:val="single" w:sz="4" w:color="D9D9D9"/>
+              <w:left w:val="single" w:sz="4" w:color="D9D9D9"/>
+              <w:bottom w:val="single" w:sz="4" w:color="D9D9D9"/>
+              <w:right w:val="single" w:sz="4" w:color="D9D9D9"/>
+            </w:tcBorders>
+          </w:tcPr>
+          <w:p>
+            <w:pPr>
+              <w:spacing w:after="60" w:before="60"/>
+            </w:pPr>
+            <w:r>
+              <w:rPr>
+                <w:b w:val="0"/>
+                <w:color w:val="000000"/>
+                <w:sz w:val="20"/>
+              </w:rPr>
               <w:t>La API rechazará configuraciones de tratamientos incompletas o con tipos inválidos.</w:t>
             </w:r>
           </w:p>
@@ -607,41 +1081,82 @@
       <w:tr>
         <w:trPr>
           <w:cantSplit/>
+          <w:cantSplit/>
         </w:trPr>
         <w:tc>
           <w:tcPr>
-            <w:tcW w:type="dxa" w:w="1224"/>
-            <w:tcBorders>
-              <w:top w:val="single" w:sz="6" w:color="D9D9D9"/>
-              <w:left w:val="single" w:sz="6" w:color="D9D9D9"/>
-              <w:bottom w:val="single" w:sz="6" w:color="D9D9D9"/>
-              <w:right w:val="single" w:sz="6" w:color="D9D9D9"/>
-              <w:insideH w:val="single" w:sz="6" w:color="D9D9D9"/>
-              <w:insideV w:val="single" w:sz="6" w:color="D9D9D9"/>
-            </w:tcBorders>
-            <w:vAlign w:val="center"/>
-          </w:tcPr>
-          <w:p>
-            <w:r>
+            <w:tcW w:type="dxa" w:w="1191"/>
+            <w:tcBorders>
+              <w:top w:val="single" w:sz="6" w:color="D9D9D9"/>
+              <w:left w:val="single" w:sz="6" w:color="D9D9D9"/>
+              <w:bottom w:val="single" w:sz="6" w:color="D9D9D9"/>
+              <w:right w:val="single" w:sz="6" w:color="D9D9D9"/>
+              <w:insideH w:val="single" w:sz="6" w:color="D9D9D9"/>
+              <w:insideV w:val="single" w:sz="6" w:color="D9D9D9"/>
+            </w:tcBorders>
+            <w:vAlign w:val="center"/>
+            <w:tcMar>
+              <w:top w:w="90" w:type="dxa"/>
+              <w:left w:w="90" w:type="dxa"/>
+              <w:bottom w:w="90" w:type="dxa"/>
+              <w:right w:w="90" w:type="dxa"/>
+            </w:tcMar>
+            <w:tcBorders>
+              <w:top w:val="single" w:sz="4" w:color="D9D9D9"/>
+              <w:left w:val="single" w:sz="4" w:color="D9D9D9"/>
+              <w:bottom w:val="single" w:sz="4" w:color="D9D9D9"/>
+              <w:right w:val="single" w:sz="4" w:color="D9D9D9"/>
+            </w:tcBorders>
+          </w:tcPr>
+          <w:p>
+            <w:pPr>
+              <w:spacing w:after="60" w:before="60"/>
+            </w:pPr>
+            <w:r>
+              <w:rPr>
+                <w:b w:val="0"/>
+                <w:color w:val="000000"/>
+                <w:sz w:val="20"/>
+              </w:rPr>
               <w:t>RF-11</w:t>
             </w:r>
           </w:p>
         </w:tc>
         <w:tc>
           <w:tcPr>
-            <w:tcW w:type="dxa" w:w="8640"/>
-            <w:tcBorders>
-              <w:top w:val="single" w:sz="6" w:color="D9D9D9"/>
-              <w:left w:val="single" w:sz="6" w:color="D9D9D9"/>
-              <w:bottom w:val="single" w:sz="6" w:color="D9D9D9"/>
-              <w:right w:val="single" w:sz="6" w:color="D9D9D9"/>
-              <w:insideH w:val="single" w:sz="6" w:color="D9D9D9"/>
-              <w:insideV w:val="single" w:sz="6" w:color="D9D9D9"/>
-            </w:tcBorders>
-            <w:vAlign w:val="center"/>
-          </w:tcPr>
-          <w:p>
-            <w:r>
+            <w:tcW w:type="dxa" w:w="8164"/>
+            <w:tcBorders>
+              <w:top w:val="single" w:sz="6" w:color="D9D9D9"/>
+              <w:left w:val="single" w:sz="6" w:color="D9D9D9"/>
+              <w:bottom w:val="single" w:sz="6" w:color="D9D9D9"/>
+              <w:right w:val="single" w:sz="6" w:color="D9D9D9"/>
+              <w:insideH w:val="single" w:sz="6" w:color="D9D9D9"/>
+              <w:insideV w:val="single" w:sz="6" w:color="D9D9D9"/>
+            </w:tcBorders>
+            <w:vAlign w:val="center"/>
+            <w:tcMar>
+              <w:top w:w="90" w:type="dxa"/>
+              <w:left w:w="90" w:type="dxa"/>
+              <w:bottom w:w="90" w:type="dxa"/>
+              <w:right w:w="90" w:type="dxa"/>
+            </w:tcMar>
+            <w:tcBorders>
+              <w:top w:val="single" w:sz="4" w:color="D9D9D9"/>
+              <w:left w:val="single" w:sz="4" w:color="D9D9D9"/>
+              <w:bottom w:val="single" w:sz="4" w:color="D9D9D9"/>
+              <w:right w:val="single" w:sz="4" w:color="D9D9D9"/>
+            </w:tcBorders>
+          </w:tcPr>
+          <w:p>
+            <w:pPr>
+              <w:spacing w:after="60" w:before="60"/>
+            </w:pPr>
+            <w:r>
+              <w:rPr>
+                <w:b w:val="0"/>
+                <w:color w:val="000000"/>
+                <w:sz w:val="20"/>
+              </w:rPr>
               <w:t>Inicio permitirá cambiar manualmente las imágenes del carrusel y acceder al video educativo.</w:t>
             </w:r>
           </w:p>
@@ -650,10 +1165,11 @@
       <w:tr>
         <w:trPr>
           <w:cantSplit/>
+          <w:cantSplit/>
         </w:trPr>
         <w:tc>
           <w:tcPr>
-            <w:tcW w:type="dxa" w:w="1224"/>
+            <w:tcW w:type="dxa" w:w="1191"/>
             <w:shd w:fill="EAF6F6"/>
             <w:tcBorders>
               <w:top w:val="single" w:sz="6" w:color="D9D9D9"/>
@@ -664,16 +1180,36 @@
               <w:insideV w:val="single" w:sz="6" w:color="D9D9D9"/>
             </w:tcBorders>
             <w:vAlign w:val="center"/>
-          </w:tcPr>
-          <w:p>
-            <w:r>
+            <w:tcMar>
+              <w:top w:w="90" w:type="dxa"/>
+              <w:left w:w="90" w:type="dxa"/>
+              <w:bottom w:w="90" w:type="dxa"/>
+              <w:right w:w="90" w:type="dxa"/>
+            </w:tcMar>
+            <w:tcBorders>
+              <w:top w:val="single" w:sz="4" w:color="D9D9D9"/>
+              <w:left w:val="single" w:sz="4" w:color="D9D9D9"/>
+              <w:bottom w:val="single" w:sz="4" w:color="D9D9D9"/>
+              <w:right w:val="single" w:sz="4" w:color="D9D9D9"/>
+            </w:tcBorders>
+          </w:tcPr>
+          <w:p>
+            <w:pPr>
+              <w:spacing w:after="60" w:before="60"/>
+            </w:pPr>
+            <w:r>
+              <w:rPr>
+                <w:b w:val="0"/>
+                <w:color w:val="000000"/>
+                <w:sz w:val="20"/>
+              </w:rPr>
               <w:t>RF-12</w:t>
             </w:r>
           </w:p>
         </w:tc>
         <w:tc>
           <w:tcPr>
-            <w:tcW w:type="dxa" w:w="8640"/>
+            <w:tcW w:type="dxa" w:w="8164"/>
             <w:shd w:fill="EAF6F6"/>
             <w:tcBorders>
               <w:top w:val="single" w:sz="6" w:color="D9D9D9"/>
@@ -684,9 +1220,29 @@
               <w:insideV w:val="single" w:sz="6" w:color="D9D9D9"/>
             </w:tcBorders>
             <w:vAlign w:val="center"/>
-          </w:tcPr>
-          <w:p>
-            <w:r>
+            <w:tcMar>
+              <w:top w:w="90" w:type="dxa"/>
+              <w:left w:w="90" w:type="dxa"/>
+              <w:bottom w:w="90" w:type="dxa"/>
+              <w:right w:w="90" w:type="dxa"/>
+            </w:tcMar>
+            <w:tcBorders>
+              <w:top w:val="single" w:sz="4" w:color="D9D9D9"/>
+              <w:left w:val="single" w:sz="4" w:color="D9D9D9"/>
+              <w:bottom w:val="single" w:sz="4" w:color="D9D9D9"/>
+              <w:right w:val="single" w:sz="4" w:color="D9D9D9"/>
+            </w:tcBorders>
+          </w:tcPr>
+          <w:p>
+            <w:pPr>
+              <w:spacing w:after="60" w:before="60"/>
+            </w:pPr>
+            <w:r>
+              <w:rPr>
+                <w:b w:val="0"/>
+                <w:color w:val="000000"/>
+                <w:sz w:val="20"/>
+              </w:rPr>
               <w:t>Una dirección inexistente mostrará la página 404 con enlaces a Inicio y Tratamientos.</w:t>
             </w:r>
           </w:p>
@@ -696,13 +1252,14 @@
     <w:p>
       <w:pPr>
         <w:spacing w:after="80"/>
-        <w:pStyle w:val="Heading1"/>
+        <w:pStyle w:val="Ttulo1"/>
         <w:keepNext/>
       </w:pPr>
       <w:r>
         <w:rPr>
+          <w:rFonts w:ascii="Calibri" w:hAnsi="Calibri"/>
           <w:b w:val="1"/>
-          <w:sz w:val="26"/>
+          <w:color w:val="000000"/>
         </w:rPr>
         <w:t>3 Requerimientos no funcionales</w:t>
       </w:r>
@@ -714,17 +1271,19 @@
         <w:tblLook w:firstColumn="1" w:firstRow="1" w:lastColumn="0" w:lastRow="0" w:noHBand="0" w:noVBand="1" w:val="04A0"/>
       </w:tblPr>
       <w:tblGrid>
-        <w:gridCol w:w="1224"/>
-        <w:gridCol w:w="8640"/>
+        <w:gridCol w:w="1191"/>
+        <w:gridCol w:w="8164"/>
       </w:tblGrid>
       <w:tr>
         <w:trPr>
           <w:cantSplit/>
           <w:tblHeader/>
+          <w:tblHeader/>
+          <w:cantSplit/>
         </w:trPr>
         <w:tc>
           <w:tcPr>
-            <w:tcW w:type="dxa" w:w="1224"/>
+            <w:tcW w:type="dxa" w:w="1191"/>
             <w:shd w:fill="007C83"/>
             <w:tcBorders>
               <w:top w:val="single" w:sz="6" w:color="D9D9D9"/>
@@ -735,16 +1294,38 @@
               <w:insideV w:val="single" w:sz="6" w:color="D9D9D9"/>
             </w:tcBorders>
             <w:vAlign w:val="center"/>
-          </w:tcPr>
-          <w:p>
-            <w:r>
+            <w:tcMar>
+              <w:top w:w="90" w:type="dxa"/>
+              <w:left w:w="90" w:type="dxa"/>
+              <w:bottom w:w="90" w:type="dxa"/>
+              <w:right w:w="90" w:type="dxa"/>
+            </w:tcMar>
+            <w:tcBorders>
+              <w:top w:val="single" w:sz="4" w:color="D9D9D9"/>
+              <w:left w:val="single" w:sz="4" w:color="D9D9D9"/>
+              <w:bottom w:val="single" w:sz="4" w:color="D9D9D9"/>
+              <w:right w:val="single" w:sz="4" w:color="D9D9D9"/>
+            </w:tcBorders>
+            <w:shd w:fill="E7E6E6"/>
+          </w:tcPr>
+          <w:p>
+            <w:pPr>
+              <w:keepNext/>
+              <w:spacing w:after="60" w:before="60"/>
+            </w:pPr>
+            <w:r>
+              <w:rPr>
+                <w:b/>
+                <w:color w:val="000000"/>
+                <w:sz w:val="20"/>
+              </w:rPr>
               <w:t>Código</w:t>
             </w:r>
           </w:p>
         </w:tc>
         <w:tc>
           <w:tcPr>
-            <w:tcW w:type="dxa" w:w="8640"/>
+            <w:tcW w:type="dxa" w:w="8164"/>
             <w:shd w:fill="007C83"/>
             <w:tcBorders>
               <w:top w:val="single" w:sz="6" w:color="D9D9D9"/>
@@ -755,9 +1336,31 @@
               <w:insideV w:val="single" w:sz="6" w:color="D9D9D9"/>
             </w:tcBorders>
             <w:vAlign w:val="center"/>
-          </w:tcPr>
-          <w:p>
-            <w:r>
+            <w:tcMar>
+              <w:top w:w="90" w:type="dxa"/>
+              <w:left w:w="90" w:type="dxa"/>
+              <w:bottom w:w="90" w:type="dxa"/>
+              <w:right w:w="90" w:type="dxa"/>
+            </w:tcMar>
+            <w:tcBorders>
+              <w:top w:val="single" w:sz="4" w:color="D9D9D9"/>
+              <w:left w:val="single" w:sz="4" w:color="D9D9D9"/>
+              <w:bottom w:val="single" w:sz="4" w:color="D9D9D9"/>
+              <w:right w:val="single" w:sz="4" w:color="D9D9D9"/>
+            </w:tcBorders>
+            <w:shd w:fill="E7E6E6"/>
+          </w:tcPr>
+          <w:p>
+            <w:pPr>
+              <w:keepNext/>
+              <w:spacing w:after="60" w:before="60"/>
+            </w:pPr>
+            <w:r>
+              <w:rPr>
+                <w:b/>
+                <w:color w:val="000000"/>
+                <w:sz w:val="20"/>
+              </w:rPr>
               <w:t>Requerimiento</w:t>
             </w:r>
           </w:p>
@@ -766,41 +1369,82 @@
       <w:tr>
         <w:trPr>
           <w:cantSplit/>
+          <w:cantSplit/>
         </w:trPr>
         <w:tc>
           <w:tcPr>
-            <w:tcW w:type="dxa" w:w="1224"/>
-            <w:tcBorders>
-              <w:top w:val="single" w:sz="6" w:color="D9D9D9"/>
-              <w:left w:val="single" w:sz="6" w:color="D9D9D9"/>
-              <w:bottom w:val="single" w:sz="6" w:color="D9D9D9"/>
-              <w:right w:val="single" w:sz="6" w:color="D9D9D9"/>
-              <w:insideH w:val="single" w:sz="6" w:color="D9D9D9"/>
-              <w:insideV w:val="single" w:sz="6" w:color="D9D9D9"/>
-            </w:tcBorders>
-            <w:vAlign w:val="center"/>
-          </w:tcPr>
-          <w:p>
-            <w:r>
+            <w:tcW w:type="dxa" w:w="1191"/>
+            <w:tcBorders>
+              <w:top w:val="single" w:sz="6" w:color="D9D9D9"/>
+              <w:left w:val="single" w:sz="6" w:color="D9D9D9"/>
+              <w:bottom w:val="single" w:sz="6" w:color="D9D9D9"/>
+              <w:right w:val="single" w:sz="6" w:color="D9D9D9"/>
+              <w:insideH w:val="single" w:sz="6" w:color="D9D9D9"/>
+              <w:insideV w:val="single" w:sz="6" w:color="D9D9D9"/>
+            </w:tcBorders>
+            <w:vAlign w:val="center"/>
+            <w:tcMar>
+              <w:top w:w="90" w:type="dxa"/>
+              <w:left w:w="90" w:type="dxa"/>
+              <w:bottom w:w="90" w:type="dxa"/>
+              <w:right w:w="90" w:type="dxa"/>
+            </w:tcMar>
+            <w:tcBorders>
+              <w:top w:val="single" w:sz="4" w:color="D9D9D9"/>
+              <w:left w:val="single" w:sz="4" w:color="D9D9D9"/>
+              <w:bottom w:val="single" w:sz="4" w:color="D9D9D9"/>
+              <w:right w:val="single" w:sz="4" w:color="D9D9D9"/>
+            </w:tcBorders>
+          </w:tcPr>
+          <w:p>
+            <w:pPr>
+              <w:spacing w:after="60" w:before="60"/>
+            </w:pPr>
+            <w:r>
+              <w:rPr>
+                <w:b w:val="0"/>
+                <w:color w:val="000000"/>
+                <w:sz w:val="20"/>
+              </w:rPr>
               <w:t>RNF-01</w:t>
             </w:r>
           </w:p>
         </w:tc>
         <w:tc>
           <w:tcPr>
-            <w:tcW w:type="dxa" w:w="8640"/>
-            <w:tcBorders>
-              <w:top w:val="single" w:sz="6" w:color="D9D9D9"/>
-              <w:left w:val="single" w:sz="6" w:color="D9D9D9"/>
-              <w:bottom w:val="single" w:sz="6" w:color="D9D9D9"/>
-              <w:right w:val="single" w:sz="6" w:color="D9D9D9"/>
-              <w:insideH w:val="single" w:sz="6" w:color="D9D9D9"/>
-              <w:insideV w:val="single" w:sz="6" w:color="D9D9D9"/>
-            </w:tcBorders>
-            <w:vAlign w:val="center"/>
-          </w:tcPr>
-          <w:p>
-            <w:r>
+            <w:tcW w:type="dxa" w:w="8164"/>
+            <w:tcBorders>
+              <w:top w:val="single" w:sz="6" w:color="D9D9D9"/>
+              <w:left w:val="single" w:sz="6" w:color="D9D9D9"/>
+              <w:bottom w:val="single" w:sz="6" w:color="D9D9D9"/>
+              <w:right w:val="single" w:sz="6" w:color="D9D9D9"/>
+              <w:insideH w:val="single" w:sz="6" w:color="D9D9D9"/>
+              <w:insideV w:val="single" w:sz="6" w:color="D9D9D9"/>
+            </w:tcBorders>
+            <w:vAlign w:val="center"/>
+            <w:tcMar>
+              <w:top w:w="90" w:type="dxa"/>
+              <w:left w:w="90" w:type="dxa"/>
+              <w:bottom w:w="90" w:type="dxa"/>
+              <w:right w:w="90" w:type="dxa"/>
+            </w:tcMar>
+            <w:tcBorders>
+              <w:top w:val="single" w:sz="4" w:color="D9D9D9"/>
+              <w:left w:val="single" w:sz="4" w:color="D9D9D9"/>
+              <w:bottom w:val="single" w:sz="4" w:color="D9D9D9"/>
+              <w:right w:val="single" w:sz="4" w:color="D9D9D9"/>
+            </w:tcBorders>
+          </w:tcPr>
+          <w:p>
+            <w:pPr>
+              <w:spacing w:after="60" w:before="60"/>
+            </w:pPr>
+            <w:r>
+              <w:rPr>
+                <w:b w:val="0"/>
+                <w:color w:val="000000"/>
+                <w:sz w:val="20"/>
+              </w:rPr>
               <w:t>La interfaz utilizará componentes React y rutas de Next.js.</w:t>
             </w:r>
           </w:p>
@@ -809,10 +1453,11 @@
       <w:tr>
         <w:trPr>
           <w:cantSplit/>
+          <w:cantSplit/>
         </w:trPr>
         <w:tc>
           <w:tcPr>
-            <w:tcW w:type="dxa" w:w="1224"/>
+            <w:tcW w:type="dxa" w:w="1191"/>
             <w:shd w:fill="EAF6F6"/>
             <w:tcBorders>
               <w:top w:val="single" w:sz="6" w:color="D9D9D9"/>
@@ -823,16 +1468,36 @@
               <w:insideV w:val="single" w:sz="6" w:color="D9D9D9"/>
             </w:tcBorders>
             <w:vAlign w:val="center"/>
-          </w:tcPr>
-          <w:p>
-            <w:r>
+            <w:tcMar>
+              <w:top w:w="90" w:type="dxa"/>
+              <w:left w:w="90" w:type="dxa"/>
+              <w:bottom w:w="90" w:type="dxa"/>
+              <w:right w:w="90" w:type="dxa"/>
+            </w:tcMar>
+            <w:tcBorders>
+              <w:top w:val="single" w:sz="4" w:color="D9D9D9"/>
+              <w:left w:val="single" w:sz="4" w:color="D9D9D9"/>
+              <w:bottom w:val="single" w:sz="4" w:color="D9D9D9"/>
+              <w:right w:val="single" w:sz="4" w:color="D9D9D9"/>
+            </w:tcBorders>
+          </w:tcPr>
+          <w:p>
+            <w:pPr>
+              <w:spacing w:after="60" w:before="60"/>
+            </w:pPr>
+            <w:r>
+              <w:rPr>
+                <w:b w:val="0"/>
+                <w:color w:val="000000"/>
+                <w:sz w:val="20"/>
+              </w:rPr>
               <w:t>RNF-02</w:t>
             </w:r>
           </w:p>
         </w:tc>
         <w:tc>
           <w:tcPr>
-            <w:tcW w:type="dxa" w:w="8640"/>
+            <w:tcW w:type="dxa" w:w="8164"/>
             <w:shd w:fill="EAF6F6"/>
             <w:tcBorders>
               <w:top w:val="single" w:sz="6" w:color="D9D9D9"/>
@@ -843,10 +1508,30 @@
               <w:insideV w:val="single" w:sz="6" w:color="D9D9D9"/>
             </w:tcBorders>
             <w:vAlign w:val="center"/>
-          </w:tcPr>
-          <w:p>
-            <w:r>
-              <w:t>El código de la aplicación estará escrito en TypeScript con tipado explícito en las estructuras principales.</w:t>
+            <w:tcMar>
+              <w:top w:w="90" w:type="dxa"/>
+              <w:left w:w="90" w:type="dxa"/>
+              <w:bottom w:w="90" w:type="dxa"/>
+              <w:right w:w="90" w:type="dxa"/>
+            </w:tcMar>
+            <w:tcBorders>
+              <w:top w:val="single" w:sz="4" w:color="D9D9D9"/>
+              <w:left w:val="single" w:sz="4" w:color="D9D9D9"/>
+              <w:bottom w:val="single" w:sz="4" w:color="D9D9D9"/>
+              <w:right w:val="single" w:sz="4" w:color="D9D9D9"/>
+            </w:tcBorders>
+          </w:tcPr>
+          <w:p>
+            <w:pPr>
+              <w:spacing w:after="60" w:before="60"/>
+            </w:pPr>
+            <w:r>
+              <w:rPr>
+                <w:b w:val="0"/>
+                <w:color w:val="000000"/>
+                <w:sz w:val="20"/>
+              </w:rPr>
+              <w:t>Los datos y validaciones estarán escritos en JavaScript y los componentes y páginas en JSX. No se requiere TypeScript en el código propio.</w:t>
             </w:r>
           </w:p>
         </w:tc>
@@ -854,41 +1539,82 @@
       <w:tr>
         <w:trPr>
           <w:cantSplit/>
+          <w:cantSplit/>
         </w:trPr>
         <w:tc>
           <w:tcPr>
-            <w:tcW w:type="dxa" w:w="1224"/>
-            <w:tcBorders>
-              <w:top w:val="single" w:sz="6" w:color="D9D9D9"/>
-              <w:left w:val="single" w:sz="6" w:color="D9D9D9"/>
-              <w:bottom w:val="single" w:sz="6" w:color="D9D9D9"/>
-              <w:right w:val="single" w:sz="6" w:color="D9D9D9"/>
-              <w:insideH w:val="single" w:sz="6" w:color="D9D9D9"/>
-              <w:insideV w:val="single" w:sz="6" w:color="D9D9D9"/>
-            </w:tcBorders>
-            <w:vAlign w:val="center"/>
-          </w:tcPr>
-          <w:p>
-            <w:r>
+            <w:tcW w:type="dxa" w:w="1191"/>
+            <w:tcBorders>
+              <w:top w:val="single" w:sz="6" w:color="D9D9D9"/>
+              <w:left w:val="single" w:sz="6" w:color="D9D9D9"/>
+              <w:bottom w:val="single" w:sz="6" w:color="D9D9D9"/>
+              <w:right w:val="single" w:sz="6" w:color="D9D9D9"/>
+              <w:insideH w:val="single" w:sz="6" w:color="D9D9D9"/>
+              <w:insideV w:val="single" w:sz="6" w:color="D9D9D9"/>
+            </w:tcBorders>
+            <w:vAlign w:val="center"/>
+            <w:tcMar>
+              <w:top w:w="90" w:type="dxa"/>
+              <w:left w:w="90" w:type="dxa"/>
+              <w:bottom w:w="90" w:type="dxa"/>
+              <w:right w:w="90" w:type="dxa"/>
+            </w:tcMar>
+            <w:tcBorders>
+              <w:top w:val="single" w:sz="4" w:color="D9D9D9"/>
+              <w:left w:val="single" w:sz="4" w:color="D9D9D9"/>
+              <w:bottom w:val="single" w:sz="4" w:color="D9D9D9"/>
+              <w:right w:val="single" w:sz="4" w:color="D9D9D9"/>
+            </w:tcBorders>
+          </w:tcPr>
+          <w:p>
+            <w:pPr>
+              <w:spacing w:after="60" w:before="60"/>
+            </w:pPr>
+            <w:r>
+              <w:rPr>
+                <w:b w:val="0"/>
+                <w:color w:val="000000"/>
+                <w:sz w:val="20"/>
+              </w:rPr>
               <w:t>RNF-03</w:t>
             </w:r>
           </w:p>
         </w:tc>
         <w:tc>
           <w:tcPr>
-            <w:tcW w:type="dxa" w:w="8640"/>
-            <w:tcBorders>
-              <w:top w:val="single" w:sz="6" w:color="D9D9D9"/>
-              <w:left w:val="single" w:sz="6" w:color="D9D9D9"/>
-              <w:bottom w:val="single" w:sz="6" w:color="D9D9D9"/>
-              <w:right w:val="single" w:sz="6" w:color="D9D9D9"/>
-              <w:insideH w:val="single" w:sz="6" w:color="D9D9D9"/>
-              <w:insideV w:val="single" w:sz="6" w:color="D9D9D9"/>
-            </w:tcBorders>
-            <w:vAlign w:val="center"/>
-          </w:tcPr>
-          <w:p>
-            <w:r>
+            <w:tcW w:type="dxa" w:w="8164"/>
+            <w:tcBorders>
+              <w:top w:val="single" w:sz="6" w:color="D9D9D9"/>
+              <w:left w:val="single" w:sz="6" w:color="D9D9D9"/>
+              <w:bottom w:val="single" w:sz="6" w:color="D9D9D9"/>
+              <w:right w:val="single" w:sz="6" w:color="D9D9D9"/>
+              <w:insideH w:val="single" w:sz="6" w:color="D9D9D9"/>
+              <w:insideV w:val="single" w:sz="6" w:color="D9D9D9"/>
+            </w:tcBorders>
+            <w:vAlign w:val="center"/>
+            <w:tcMar>
+              <w:top w:w="90" w:type="dxa"/>
+              <w:left w:w="90" w:type="dxa"/>
+              <w:bottom w:w="90" w:type="dxa"/>
+              <w:right w:w="90" w:type="dxa"/>
+            </w:tcMar>
+            <w:tcBorders>
+              <w:top w:val="single" w:sz="4" w:color="D9D9D9"/>
+              <w:left w:val="single" w:sz="4" w:color="D9D9D9"/>
+              <w:bottom w:val="single" w:sz="4" w:color="D9D9D9"/>
+              <w:right w:val="single" w:sz="4" w:color="D9D9D9"/>
+            </w:tcBorders>
+          </w:tcPr>
+          <w:p>
+            <w:pPr>
+              <w:spacing w:after="60" w:before="60"/>
+            </w:pPr>
+            <w:r>
+              <w:rPr>
+                <w:b w:val="0"/>
+                <w:color w:val="000000"/>
+                <w:sz w:val="20"/>
+              </w:rPr>
               <w:t>Los estilos estarán centralizados en archivos CSS externos.</w:t>
             </w:r>
           </w:p>
@@ -897,10 +1623,11 @@
       <w:tr>
         <w:trPr>
           <w:cantSplit/>
+          <w:cantSplit/>
         </w:trPr>
         <w:tc>
           <w:tcPr>
-            <w:tcW w:type="dxa" w:w="1224"/>
+            <w:tcW w:type="dxa" w:w="1191"/>
             <w:shd w:fill="EAF6F6"/>
             <w:tcBorders>
               <w:top w:val="single" w:sz="6" w:color="D9D9D9"/>
@@ -911,16 +1638,36 @@
               <w:insideV w:val="single" w:sz="6" w:color="D9D9D9"/>
             </w:tcBorders>
             <w:vAlign w:val="center"/>
-          </w:tcPr>
-          <w:p>
-            <w:r>
+            <w:tcMar>
+              <w:top w:w="90" w:type="dxa"/>
+              <w:left w:w="90" w:type="dxa"/>
+              <w:bottom w:w="90" w:type="dxa"/>
+              <w:right w:w="90" w:type="dxa"/>
+            </w:tcMar>
+            <w:tcBorders>
+              <w:top w:val="single" w:sz="4" w:color="D9D9D9"/>
+              <w:left w:val="single" w:sz="4" w:color="D9D9D9"/>
+              <w:bottom w:val="single" w:sz="4" w:color="D9D9D9"/>
+              <w:right w:val="single" w:sz="4" w:color="D9D9D9"/>
+            </w:tcBorders>
+          </w:tcPr>
+          <w:p>
+            <w:pPr>
+              <w:spacing w:after="60" w:before="60"/>
+            </w:pPr>
+            <w:r>
+              <w:rPr>
+                <w:b w:val="0"/>
+                <w:color w:val="000000"/>
+                <w:sz w:val="20"/>
+              </w:rPr>
               <w:t>RNF-04</w:t>
             </w:r>
           </w:p>
         </w:tc>
         <w:tc>
           <w:tcPr>
-            <w:tcW w:type="dxa" w:w="8640"/>
+            <w:tcW w:type="dxa" w:w="8164"/>
             <w:shd w:fill="EAF6F6"/>
             <w:tcBorders>
               <w:top w:val="single" w:sz="6" w:color="D9D9D9"/>
@@ -931,9 +1678,29 @@
               <w:insideV w:val="single" w:sz="6" w:color="D9D9D9"/>
             </w:tcBorders>
             <w:vAlign w:val="center"/>
-          </w:tcPr>
-          <w:p>
-            <w:r>
+            <w:tcMar>
+              <w:top w:w="90" w:type="dxa"/>
+              <w:left w:w="90" w:type="dxa"/>
+              <w:bottom w:w="90" w:type="dxa"/>
+              <w:right w:w="90" w:type="dxa"/>
+            </w:tcMar>
+            <w:tcBorders>
+              <w:top w:val="single" w:sz="4" w:color="D9D9D9"/>
+              <w:left w:val="single" w:sz="4" w:color="D9D9D9"/>
+              <w:bottom w:val="single" w:sz="4" w:color="D9D9D9"/>
+              <w:right w:val="single" w:sz="4" w:color="D9D9D9"/>
+            </w:tcBorders>
+          </w:tcPr>
+          <w:p>
+            <w:pPr>
+              <w:spacing w:after="60" w:before="60"/>
+            </w:pPr>
+            <w:r>
+              <w:rPr>
+                <w:b w:val="0"/>
+                <w:color w:val="000000"/>
+                <w:sz w:val="20"/>
+              </w:rPr>
               <w:t>El diseño se adaptará a computadores, tablets y teléfonos mediante reglas responsivas.</w:t>
             </w:r>
           </w:p>
@@ -942,41 +1709,82 @@
       <w:tr>
         <w:trPr>
           <w:cantSplit/>
+          <w:cantSplit/>
         </w:trPr>
         <w:tc>
           <w:tcPr>
-            <w:tcW w:type="dxa" w:w="1224"/>
-            <w:tcBorders>
-              <w:top w:val="single" w:sz="6" w:color="D9D9D9"/>
-              <w:left w:val="single" w:sz="6" w:color="D9D9D9"/>
-              <w:bottom w:val="single" w:sz="6" w:color="D9D9D9"/>
-              <w:right w:val="single" w:sz="6" w:color="D9D9D9"/>
-              <w:insideH w:val="single" w:sz="6" w:color="D9D9D9"/>
-              <w:insideV w:val="single" w:sz="6" w:color="D9D9D9"/>
-            </w:tcBorders>
-            <w:vAlign w:val="center"/>
-          </w:tcPr>
-          <w:p>
-            <w:r>
+            <w:tcW w:type="dxa" w:w="1191"/>
+            <w:tcBorders>
+              <w:top w:val="single" w:sz="6" w:color="D9D9D9"/>
+              <w:left w:val="single" w:sz="6" w:color="D9D9D9"/>
+              <w:bottom w:val="single" w:sz="6" w:color="D9D9D9"/>
+              <w:right w:val="single" w:sz="6" w:color="D9D9D9"/>
+              <w:insideH w:val="single" w:sz="6" w:color="D9D9D9"/>
+              <w:insideV w:val="single" w:sz="6" w:color="D9D9D9"/>
+            </w:tcBorders>
+            <w:vAlign w:val="center"/>
+            <w:tcMar>
+              <w:top w:w="90" w:type="dxa"/>
+              <w:left w:w="90" w:type="dxa"/>
+              <w:bottom w:w="90" w:type="dxa"/>
+              <w:right w:w="90" w:type="dxa"/>
+            </w:tcMar>
+            <w:tcBorders>
+              <w:top w:val="single" w:sz="4" w:color="D9D9D9"/>
+              <w:left w:val="single" w:sz="4" w:color="D9D9D9"/>
+              <w:bottom w:val="single" w:sz="4" w:color="D9D9D9"/>
+              <w:right w:val="single" w:sz="4" w:color="D9D9D9"/>
+            </w:tcBorders>
+          </w:tcPr>
+          <w:p>
+            <w:pPr>
+              <w:spacing w:after="60" w:before="60"/>
+            </w:pPr>
+            <w:r>
+              <w:rPr>
+                <w:b w:val="0"/>
+                <w:color w:val="000000"/>
+                <w:sz w:val="20"/>
+              </w:rPr>
               <w:t>RNF-05</w:t>
             </w:r>
           </w:p>
         </w:tc>
         <w:tc>
           <w:tcPr>
-            <w:tcW w:type="dxa" w:w="8640"/>
-            <w:tcBorders>
-              <w:top w:val="single" w:sz="6" w:color="D9D9D9"/>
-              <w:left w:val="single" w:sz="6" w:color="D9D9D9"/>
-              <w:bottom w:val="single" w:sz="6" w:color="D9D9D9"/>
-              <w:right w:val="single" w:sz="6" w:color="D9D9D9"/>
-              <w:insideH w:val="single" w:sz="6" w:color="D9D9D9"/>
-              <w:insideV w:val="single" w:sz="6" w:color="D9D9D9"/>
-            </w:tcBorders>
-            <w:vAlign w:val="center"/>
-          </w:tcPr>
-          <w:p>
-            <w:r>
+            <w:tcW w:type="dxa" w:w="8164"/>
+            <w:tcBorders>
+              <w:top w:val="single" w:sz="6" w:color="D9D9D9"/>
+              <w:left w:val="single" w:sz="6" w:color="D9D9D9"/>
+              <w:bottom w:val="single" w:sz="6" w:color="D9D9D9"/>
+              <w:right w:val="single" w:sz="6" w:color="D9D9D9"/>
+              <w:insideH w:val="single" w:sz="6" w:color="D9D9D9"/>
+              <w:insideV w:val="single" w:sz="6" w:color="D9D9D9"/>
+            </w:tcBorders>
+            <w:vAlign w:val="center"/>
+            <w:tcMar>
+              <w:top w:w="90" w:type="dxa"/>
+              <w:left w:w="90" w:type="dxa"/>
+              <w:bottom w:w="90" w:type="dxa"/>
+              <w:right w:w="90" w:type="dxa"/>
+            </w:tcMar>
+            <w:tcBorders>
+              <w:top w:val="single" w:sz="4" w:color="D9D9D9"/>
+              <w:left w:val="single" w:sz="4" w:color="D9D9D9"/>
+              <w:bottom w:val="single" w:sz="4" w:color="D9D9D9"/>
+              <w:right w:val="single" w:sz="4" w:color="D9D9D9"/>
+            </w:tcBorders>
+          </w:tcPr>
+          <w:p>
+            <w:pPr>
+              <w:spacing w:after="60" w:before="60"/>
+            </w:pPr>
+            <w:r>
+              <w:rPr>
+                <w:b w:val="0"/>
+                <w:color w:val="000000"/>
+                <w:sz w:val="20"/>
+              </w:rPr>
               <w:t>Las imágenes tendrán texto alternativo y los controles del formulario tendrán etiquetas asociadas.</w:t>
             </w:r>
           </w:p>
@@ -985,10 +1793,11 @@
       <w:tr>
         <w:trPr>
           <w:cantSplit/>
+          <w:cantSplit/>
         </w:trPr>
         <w:tc>
           <w:tcPr>
-            <w:tcW w:type="dxa" w:w="1224"/>
+            <w:tcW w:type="dxa" w:w="1191"/>
             <w:shd w:fill="EAF6F6"/>
             <w:tcBorders>
               <w:top w:val="single" w:sz="6" w:color="D9D9D9"/>
@@ -999,16 +1808,36 @@
               <w:insideV w:val="single" w:sz="6" w:color="D9D9D9"/>
             </w:tcBorders>
             <w:vAlign w:val="center"/>
-          </w:tcPr>
-          <w:p>
-            <w:r>
+            <w:tcMar>
+              <w:top w:w="90" w:type="dxa"/>
+              <w:left w:w="90" w:type="dxa"/>
+              <w:bottom w:w="90" w:type="dxa"/>
+              <w:right w:w="90" w:type="dxa"/>
+            </w:tcMar>
+            <w:tcBorders>
+              <w:top w:val="single" w:sz="4" w:color="D9D9D9"/>
+              <w:left w:val="single" w:sz="4" w:color="D9D9D9"/>
+              <w:bottom w:val="single" w:sz="4" w:color="D9D9D9"/>
+              <w:right w:val="single" w:sz="4" w:color="D9D9D9"/>
+            </w:tcBorders>
+          </w:tcPr>
+          <w:p>
+            <w:pPr>
+              <w:spacing w:after="60" w:before="60"/>
+            </w:pPr>
+            <w:r>
+              <w:rPr>
+                <w:b w:val="0"/>
+                <w:color w:val="000000"/>
+                <w:sz w:val="20"/>
+              </w:rPr>
               <w:t>RNF-06</w:t>
             </w:r>
           </w:p>
         </w:tc>
         <w:tc>
           <w:tcPr>
-            <w:tcW w:type="dxa" w:w="8640"/>
+            <w:tcW w:type="dxa" w:w="8164"/>
             <w:shd w:fill="EAF6F6"/>
             <w:tcBorders>
               <w:top w:val="single" w:sz="6" w:color="D9D9D9"/>
@@ -1019,9 +1848,29 @@
               <w:insideV w:val="single" w:sz="6" w:color="D9D9D9"/>
             </w:tcBorders>
             <w:vAlign w:val="center"/>
-          </w:tcPr>
-          <w:p>
-            <w:r>
+            <w:tcMar>
+              <w:top w:w="90" w:type="dxa"/>
+              <w:left w:w="90" w:type="dxa"/>
+              <w:bottom w:w="90" w:type="dxa"/>
+              <w:right w:w="90" w:type="dxa"/>
+            </w:tcMar>
+            <w:tcBorders>
+              <w:top w:val="single" w:sz="4" w:color="D9D9D9"/>
+              <w:left w:val="single" w:sz="4" w:color="D9D9D9"/>
+              <w:bottom w:val="single" w:sz="4" w:color="D9D9D9"/>
+              <w:right w:val="single" w:sz="4" w:color="D9D9D9"/>
+            </w:tcBorders>
+          </w:tcPr>
+          <w:p>
+            <w:pPr>
+              <w:spacing w:after="60" w:before="60"/>
+            </w:pPr>
+            <w:r>
+              <w:rPr>
+                <w:b w:val="0"/>
+                <w:color w:val="000000"/>
+                <w:sz w:val="20"/>
+              </w:rPr>
               <w:t>Los controles interactivos tendrán foco visible y el contenido usará relaciones semánticas y estados ARIA cuando corresponde.</w:t>
             </w:r>
           </w:p>
@@ -1030,42 +1879,83 @@
       <w:tr>
         <w:trPr>
           <w:cantSplit/>
+          <w:cantSplit/>
         </w:trPr>
         <w:tc>
           <w:tcPr>
-            <w:tcW w:type="dxa" w:w="1224"/>
-            <w:tcBorders>
-              <w:top w:val="single" w:sz="6" w:color="D9D9D9"/>
-              <w:left w:val="single" w:sz="6" w:color="D9D9D9"/>
-              <w:bottom w:val="single" w:sz="6" w:color="D9D9D9"/>
-              <w:right w:val="single" w:sz="6" w:color="D9D9D9"/>
-              <w:insideH w:val="single" w:sz="6" w:color="D9D9D9"/>
-              <w:insideV w:val="single" w:sz="6" w:color="D9D9D9"/>
-            </w:tcBorders>
-            <w:vAlign w:val="center"/>
-          </w:tcPr>
-          <w:p>
-            <w:r>
+            <w:tcW w:type="dxa" w:w="1191"/>
+            <w:tcBorders>
+              <w:top w:val="single" w:sz="6" w:color="D9D9D9"/>
+              <w:left w:val="single" w:sz="6" w:color="D9D9D9"/>
+              <w:bottom w:val="single" w:sz="6" w:color="D9D9D9"/>
+              <w:right w:val="single" w:sz="6" w:color="D9D9D9"/>
+              <w:insideH w:val="single" w:sz="6" w:color="D9D9D9"/>
+              <w:insideV w:val="single" w:sz="6" w:color="D9D9D9"/>
+            </w:tcBorders>
+            <w:vAlign w:val="center"/>
+            <w:tcMar>
+              <w:top w:w="90" w:type="dxa"/>
+              <w:left w:w="90" w:type="dxa"/>
+              <w:bottom w:w="90" w:type="dxa"/>
+              <w:right w:w="90" w:type="dxa"/>
+            </w:tcMar>
+            <w:tcBorders>
+              <w:top w:val="single" w:sz="4" w:color="D9D9D9"/>
+              <w:left w:val="single" w:sz="4" w:color="D9D9D9"/>
+              <w:bottom w:val="single" w:sz="4" w:color="D9D9D9"/>
+              <w:right w:val="single" w:sz="4" w:color="D9D9D9"/>
+            </w:tcBorders>
+          </w:tcPr>
+          <w:p>
+            <w:pPr>
+              <w:spacing w:after="60" w:before="60"/>
+            </w:pPr>
+            <w:r>
+              <w:rPr>
+                <w:b w:val="0"/>
+                <w:color w:val="000000"/>
+                <w:sz w:val="20"/>
+              </w:rPr>
               <w:t>RNF-07</w:t>
             </w:r>
           </w:p>
         </w:tc>
         <w:tc>
           <w:tcPr>
-            <w:tcW w:type="dxa" w:w="8640"/>
-            <w:tcBorders>
-              <w:top w:val="single" w:sz="6" w:color="D9D9D9"/>
-              <w:left w:val="single" w:sz="6" w:color="D9D9D9"/>
-              <w:bottom w:val="single" w:sz="6" w:color="D9D9D9"/>
-              <w:right w:val="single" w:sz="6" w:color="D9D9D9"/>
-              <w:insideH w:val="single" w:sz="6" w:color="D9D9D9"/>
-              <w:insideV w:val="single" w:sz="6" w:color="D9D9D9"/>
-            </w:tcBorders>
-            <w:vAlign w:val="center"/>
-          </w:tcPr>
-          <w:p>
-            <w:r>
-              <w:t>Las pruebas automatizadas se ejecutarán con Jasmine/Karma sin depender de la API real.</w:t>
+            <w:tcW w:type="dxa" w:w="8164"/>
+            <w:tcBorders>
+              <w:top w:val="single" w:sz="6" w:color="D9D9D9"/>
+              <w:left w:val="single" w:sz="6" w:color="D9D9D9"/>
+              <w:bottom w:val="single" w:sz="6" w:color="D9D9D9"/>
+              <w:right w:val="single" w:sz="6" w:color="D9D9D9"/>
+              <w:insideH w:val="single" w:sz="6" w:color="D9D9D9"/>
+              <w:insideV w:val="single" w:sz="6" w:color="D9D9D9"/>
+            </w:tcBorders>
+            <w:vAlign w:val="center"/>
+            <w:tcMar>
+              <w:top w:w="90" w:type="dxa"/>
+              <w:left w:w="90" w:type="dxa"/>
+              <w:bottom w:w="90" w:type="dxa"/>
+              <w:right w:w="90" w:type="dxa"/>
+            </w:tcMar>
+            <w:tcBorders>
+              <w:top w:val="single" w:sz="4" w:color="D9D9D9"/>
+              <w:left w:val="single" w:sz="4" w:color="D9D9D9"/>
+              <w:bottom w:val="single" w:sz="4" w:color="D9D9D9"/>
+              <w:right w:val="single" w:sz="4" w:color="D9D9D9"/>
+            </w:tcBorders>
+          </w:tcPr>
+          <w:p>
+            <w:pPr>
+              <w:spacing w:after="60" w:before="60"/>
+            </w:pPr>
+            <w:r>
+              <w:rPr>
+                <w:b w:val="0"/>
+                <w:color w:val="000000"/>
+                <w:sz w:val="20"/>
+              </w:rPr>
+              <w:t>Las cinco pruebas unitarias se ejecutarán con QUnit sobre las validaciones reales, sin depender de la API y sin mocks.</w:t>
             </w:r>
           </w:p>
         </w:tc>
@@ -1073,10 +1963,11 @@
       <w:tr>
         <w:trPr>
           <w:cantSplit/>
+          <w:cantSplit/>
         </w:trPr>
         <w:tc>
           <w:tcPr>
-            <w:tcW w:type="dxa" w:w="1224"/>
+            <w:tcW w:type="dxa" w:w="1191"/>
             <w:shd w:fill="EAF6F6"/>
             <w:tcBorders>
               <w:top w:val="single" w:sz="6" w:color="D9D9D9"/>
@@ -1087,16 +1978,36 @@
               <w:insideV w:val="single" w:sz="6" w:color="D9D9D9"/>
             </w:tcBorders>
             <w:vAlign w:val="center"/>
-          </w:tcPr>
-          <w:p>
-            <w:r>
+            <w:tcMar>
+              <w:top w:w="90" w:type="dxa"/>
+              <w:left w:w="90" w:type="dxa"/>
+              <w:bottom w:w="90" w:type="dxa"/>
+              <w:right w:w="90" w:type="dxa"/>
+            </w:tcMar>
+            <w:tcBorders>
+              <w:top w:val="single" w:sz="4" w:color="D9D9D9"/>
+              <w:left w:val="single" w:sz="4" w:color="D9D9D9"/>
+              <w:bottom w:val="single" w:sz="4" w:color="D9D9D9"/>
+              <w:right w:val="single" w:sz="4" w:color="D9D9D9"/>
+            </w:tcBorders>
+          </w:tcPr>
+          <w:p>
+            <w:pPr>
+              <w:spacing w:after="60" w:before="60"/>
+            </w:pPr>
+            <w:r>
+              <w:rPr>
+                <w:b w:val="0"/>
+                <w:color w:val="000000"/>
+                <w:sz w:val="20"/>
+              </w:rPr>
               <w:t>RNF-08</w:t>
             </w:r>
           </w:p>
         </w:tc>
         <w:tc>
           <w:tcPr>
-            <w:tcW w:type="dxa" w:w="8640"/>
+            <w:tcW w:type="dxa" w:w="8164"/>
             <w:shd w:fill="EAF6F6"/>
             <w:tcBorders>
               <w:top w:val="single" w:sz="6" w:color="D9D9D9"/>
@@ -1107,9 +2018,29 @@
               <w:insideV w:val="single" w:sz="6" w:color="D9D9D9"/>
             </w:tcBorders>
             <w:vAlign w:val="center"/>
-          </w:tcPr>
-          <w:p>
-            <w:r>
+            <w:tcMar>
+              <w:top w:w="90" w:type="dxa"/>
+              <w:left w:w="90" w:type="dxa"/>
+              <w:bottom w:w="90" w:type="dxa"/>
+              <w:right w:w="90" w:type="dxa"/>
+            </w:tcMar>
+            <w:tcBorders>
+              <w:top w:val="single" w:sz="4" w:color="D9D9D9"/>
+              <w:left w:val="single" w:sz="4" w:color="D9D9D9"/>
+              <w:bottom w:val="single" w:sz="4" w:color="D9D9D9"/>
+              <w:right w:val="single" w:sz="4" w:color="D9D9D9"/>
+            </w:tcBorders>
+          </w:tcPr>
+          <w:p>
+            <w:pPr>
+              <w:spacing w:after="60" w:before="60"/>
+            </w:pPr>
+            <w:r>
+              <w:rPr>
+                <w:b w:val="0"/>
+                <w:color w:val="000000"/>
+                <w:sz w:val="20"/>
+              </w:rPr>
               <w:t>El proyecto podrá ejecutarse localmente con los scripts definidos en package.json.</w:t>
             </w:r>
           </w:p>
@@ -1118,41 +2049,82 @@
       <w:tr>
         <w:trPr>
           <w:cantSplit/>
+          <w:cantSplit/>
         </w:trPr>
         <w:tc>
           <w:tcPr>
-            <w:tcW w:type="dxa" w:w="1224"/>
-            <w:tcBorders>
-              <w:top w:val="single" w:sz="6" w:color="D9D9D9"/>
-              <w:left w:val="single" w:sz="6" w:color="D9D9D9"/>
-              <w:bottom w:val="single" w:sz="6" w:color="D9D9D9"/>
-              <w:right w:val="single" w:sz="6" w:color="D9D9D9"/>
-              <w:insideH w:val="single" w:sz="6" w:color="D9D9D9"/>
-              <w:insideV w:val="single" w:sz="6" w:color="D9D9D9"/>
-            </w:tcBorders>
-            <w:vAlign w:val="center"/>
-          </w:tcPr>
-          <w:p>
-            <w:r>
+            <w:tcW w:type="dxa" w:w="1191"/>
+            <w:tcBorders>
+              <w:top w:val="single" w:sz="6" w:color="D9D9D9"/>
+              <w:left w:val="single" w:sz="6" w:color="D9D9D9"/>
+              <w:bottom w:val="single" w:sz="6" w:color="D9D9D9"/>
+              <w:right w:val="single" w:sz="6" w:color="D9D9D9"/>
+              <w:insideH w:val="single" w:sz="6" w:color="D9D9D9"/>
+              <w:insideV w:val="single" w:sz="6" w:color="D9D9D9"/>
+            </w:tcBorders>
+            <w:vAlign w:val="center"/>
+            <w:tcMar>
+              <w:top w:w="90" w:type="dxa"/>
+              <w:left w:w="90" w:type="dxa"/>
+              <w:bottom w:w="90" w:type="dxa"/>
+              <w:right w:w="90" w:type="dxa"/>
+            </w:tcMar>
+            <w:tcBorders>
+              <w:top w:val="single" w:sz="4" w:color="D9D9D9"/>
+              <w:left w:val="single" w:sz="4" w:color="D9D9D9"/>
+              <w:bottom w:val="single" w:sz="4" w:color="D9D9D9"/>
+              <w:right w:val="single" w:sz="4" w:color="D9D9D9"/>
+            </w:tcBorders>
+          </w:tcPr>
+          <w:p>
+            <w:pPr>
+              <w:spacing w:after="60" w:before="60"/>
+            </w:pPr>
+            <w:r>
+              <w:rPr>
+                <w:b w:val="0"/>
+                <w:color w:val="000000"/>
+                <w:sz w:val="20"/>
+              </w:rPr>
               <w:t>RNF-09</w:t>
             </w:r>
           </w:p>
         </w:tc>
         <w:tc>
           <w:tcPr>
-            <w:tcW w:type="dxa" w:w="8640"/>
-            <w:tcBorders>
-              <w:top w:val="single" w:sz="6" w:color="D9D9D9"/>
-              <w:left w:val="single" w:sz="6" w:color="D9D9D9"/>
-              <w:bottom w:val="single" w:sz="6" w:color="D9D9D9"/>
-              <w:right w:val="single" w:sz="6" w:color="D9D9D9"/>
-              <w:insideH w:val="single" w:sz="6" w:color="D9D9D9"/>
-              <w:insideV w:val="single" w:sz="6" w:color="D9D9D9"/>
-            </w:tcBorders>
-            <w:vAlign w:val="center"/>
-          </w:tcPr>
-          <w:p>
-            <w:r>
+            <w:tcW w:type="dxa" w:w="8164"/>
+            <w:tcBorders>
+              <w:top w:val="single" w:sz="6" w:color="D9D9D9"/>
+              <w:left w:val="single" w:sz="6" w:color="D9D9D9"/>
+              <w:bottom w:val="single" w:sz="6" w:color="D9D9D9"/>
+              <w:right w:val="single" w:sz="6" w:color="D9D9D9"/>
+              <w:insideH w:val="single" w:sz="6" w:color="D9D9D9"/>
+              <w:insideV w:val="single" w:sz="6" w:color="D9D9D9"/>
+            </w:tcBorders>
+            <w:vAlign w:val="center"/>
+            <w:tcMar>
+              <w:top w:w="90" w:type="dxa"/>
+              <w:left w:w="90" w:type="dxa"/>
+              <w:bottom w:w="90" w:type="dxa"/>
+              <w:right w:w="90" w:type="dxa"/>
+            </w:tcMar>
+            <w:tcBorders>
+              <w:top w:val="single" w:sz="4" w:color="D9D9D9"/>
+              <w:left w:val="single" w:sz="4" w:color="D9D9D9"/>
+              <w:bottom w:val="single" w:sz="4" w:color="D9D9D9"/>
+              <w:right w:val="single" w:sz="4" w:color="D9D9D9"/>
+            </w:tcBorders>
+          </w:tcPr>
+          <w:p>
+            <w:pPr>
+              <w:spacing w:after="60" w:before="60"/>
+            </w:pPr>
+            <w:r>
+              <w:rPr>
+                <w:b w:val="0"/>
+                <w:color w:val="000000"/>
+                <w:sz w:val="20"/>
+              </w:rPr>
               <w:t>La navegación y los mensajes serán claros y consistentes en las páginas implementadas.</w:t>
             </w:r>
           </w:p>
@@ -1161,10 +2133,11 @@
       <w:tr>
         <w:trPr>
           <w:cantSplit/>
+          <w:cantSplit/>
         </w:trPr>
         <w:tc>
           <w:tcPr>
-            <w:tcW w:type="dxa" w:w="1224"/>
+            <w:tcW w:type="dxa" w:w="1191"/>
             <w:shd w:fill="EAF6F6"/>
             <w:tcBorders>
               <w:top w:val="single" w:sz="6" w:color="D9D9D9"/>
@@ -1175,16 +2148,36 @@
               <w:insideV w:val="single" w:sz="6" w:color="D9D9D9"/>
             </w:tcBorders>
             <w:vAlign w:val="center"/>
-          </w:tcPr>
-          <w:p>
-            <w:r>
+            <w:tcMar>
+              <w:top w:w="90" w:type="dxa"/>
+              <w:left w:w="90" w:type="dxa"/>
+              <w:bottom w:w="90" w:type="dxa"/>
+              <w:right w:w="90" w:type="dxa"/>
+            </w:tcMar>
+            <w:tcBorders>
+              <w:top w:val="single" w:sz="4" w:color="D9D9D9"/>
+              <w:left w:val="single" w:sz="4" w:color="D9D9D9"/>
+              <w:bottom w:val="single" w:sz="4" w:color="D9D9D9"/>
+              <w:right w:val="single" w:sz="4" w:color="D9D9D9"/>
+            </w:tcBorders>
+          </w:tcPr>
+          <w:p>
+            <w:pPr>
+              <w:spacing w:after="60" w:before="60"/>
+            </w:pPr>
+            <w:r>
+              <w:rPr>
+                <w:b w:val="0"/>
+                <w:color w:val="000000"/>
+                <w:sz w:val="20"/>
+              </w:rPr>
               <w:t>RNF-10</w:t>
             </w:r>
           </w:p>
         </w:tc>
         <w:tc>
           <w:tcPr>
-            <w:tcW w:type="dxa" w:w="8640"/>
+            <w:tcW w:type="dxa" w:w="8164"/>
             <w:shd w:fill="EAF6F6"/>
             <w:tcBorders>
               <w:top w:val="single" w:sz="6" w:color="D9D9D9"/>
@@ -1195,10 +2188,30 @@
               <w:insideV w:val="single" w:sz="6" w:color="D9D9D9"/>
             </w:tcBorders>
             <w:vAlign w:val="center"/>
-          </w:tcPr>
-          <w:p>
-            <w:r>
-              <w:t>Las diez pruebas automatizadas comprobarán validaciones, catálogo, errores HTTP, selección y limpieza. La cobertura se medirá sobre código de aplicación y se documentarán su alcance y exclusiones.</w:t>
+            <w:tcMar>
+              <w:top w:w="90" w:type="dxa"/>
+              <w:left w:w="90" w:type="dxa"/>
+              <w:bottom w:w="90" w:type="dxa"/>
+              <w:right w:w="90" w:type="dxa"/>
+            </w:tcMar>
+            <w:tcBorders>
+              <w:top w:val="single" w:sz="4" w:color="D9D9D9"/>
+              <w:left w:val="single" w:sz="4" w:color="D9D9D9"/>
+              <w:bottom w:val="single" w:sz="4" w:color="D9D9D9"/>
+              <w:right w:val="single" w:sz="4" w:color="D9D9D9"/>
+            </w:tcBorders>
+          </w:tcPr>
+          <w:p>
+            <w:pPr>
+              <w:spacing w:after="60" w:before="60"/>
+            </w:pPr>
+            <w:r>
+              <w:rPr>
+                <w:b w:val="0"/>
+                <w:color w:val="000000"/>
+                <w:sz w:val="20"/>
+              </w:rPr>
+              <w:t>La suite comprobará nombre, dígito y formatos de RUT, correo y servicio. Los resultados y los límites de las pruebas se documentarán sin afirmar cobertura total.</w:t>
             </w:r>
           </w:p>
         </w:tc>
@@ -1206,14 +2219,15 @@
     </w:tbl>
     <w:p>
       <w:pPr>
-        <w:pStyle w:val="Heading1"/>
+        <w:pStyle w:val="Ttulo1"/>
         <w:spacing w:after="80"/>
         <w:keepNext/>
       </w:pPr>
       <w:r>
         <w:rPr>
+          <w:rFonts w:ascii="Calibri" w:hAnsi="Calibri"/>
           <w:b w:val="1"/>
-          <w:sz w:val="26"/>
+          <w:color w:val="000000"/>
         </w:rPr>
         <w:t>4 Herramientas y tecnologías</w:t>
       </w:r>
@@ -1223,7 +2237,7 @@
         <w:spacing w:after="80"/>
       </w:pPr>
       <w:r>
-        <w:t>• Next.js y React para la interfaz y las rutas del sitio.</w:t>
+        <w:t>React 19.3.1 y Next.js 16.4.2 para componentes, estados, navegación y rutas.</w:t>
       </w:r>
     </w:p>
     <w:p>
@@ -1232,7 +2246,7 @@
         <w:spacing w:after="80"/>
       </w:pPr>
       <w:r>
-        <w:t>• TypeScript para tipado estático del código de la aplicación.</w:t>
+        <w:t>JavaScript para datos y validaciones, y JSX para componentes y páginas. jsconfig.json define el alias @/ hacia la raíz del proyecto.</w:t>
       </w:r>
     </w:p>
     <w:p>
@@ -1241,7 +2255,7 @@
         <w:ind w:left="360" w:hanging="259"/>
       </w:pPr>
       <w:r>
-        <w:t>• CSS externo y reglas media query para diseño responsivo.</w:t>
+        <w:t>CSS propio en archivos externos y reglas responsivas para adaptar la interfaz.</w:t>
       </w:r>
     </w:p>
     <w:p>
@@ -1250,7 +2264,7 @@
         <w:ind w:left="360" w:hanging="259"/>
       </w:pPr>
       <w:r>
-        <w:t>• Node.js para ejecutar la API simulada y las herramientas del proyecto.</w:t>
+        <w:t>Node.js para ejecutar Next.js, la API local y los tests. npm instala dependencias y ejecuta los scripts de package.json.</w:t>
       </w:r>
     </w:p>
     <w:p>
@@ -1259,7 +2273,7 @@
         <w:ind w:left="360" w:hanging="259"/>
       </w:pPr>
       <w:r>
-        <w:t>• Jasmine, Karma y Edge Headless para las pruebas automatizadas.</w:t>
+        <w:t>QUnit 3.0.0 para cinco pruebas unitarias de las validaciones, ejecutables en terminal y navegador.</w:t>
       </w:r>
     </w:p>
     <w:p>
@@ -1268,20 +2282,21 @@
         <w:ind w:left="360" w:hanging="259"/>
       </w:pPr>
       <w:r>
-        <w:t>• Git y GitHub para control de versiones y trabajo colaborativo.</w:t>
+        <w:t>Git y GitHub para control de versiones y trabajo mediante ramas e integración a main.</w:t>
       </w:r>
     </w:p>
     <w:p>
       <w:pPr>
         <w:spacing w:after="80"/>
         <w:ind w:left="360" w:hanging="259"/>
-        <w:pStyle w:val="Heading1"/>
+        <w:pStyle w:val="Ttulo1"/>
         <w:keepNext/>
       </w:pPr>
       <w:r>
         <w:rPr>
+          <w:rFonts w:ascii="Calibri" w:hAnsi="Calibri"/>
           <w:b w:val="1"/>
-          <w:sz w:val="26"/>
+          <w:color w:val="000000"/>
         </w:rPr>
         <w:t>5 Propuesta de solución</w:t>
       </w:r>
@@ -1292,19 +2307,20 @@
         <w:ind w:left="360" w:hanging="259"/>
       </w:pPr>
       <w:r>
-        <w:t>La interfaz utiliza tonos turquesa y componentes reutilizables con propiedades y estados de React. Next.js organiza las cinco rutas de la clínica. Los datos, componentes, hooks y validaciones tienen responsabilidades separadas. La API entrega los tratamientos; el formulario controla valores y mensajes, enfoca el primer campo incorrecto y permite limpiar. Las pruebas simulan window.fetch para funcionar sin la API real.</w:t>
+        <w:t>La interfaz utiliza componentes reutilizables con propiedades y estados de React. Next.js organiza las cinco rutas y una estructura común de encabezado y pie de página. La carpeta data contiene información y la consulta de tratamientos; services contiene las validaciones. useState y useEffect se utilizan dentro de los componentes, sin hooks personalizados. La API lee api_simulada/db.json y ofrece GET /tratamientos. El formulario controla valores, errores y resultado, enfoca el primer campo incorrecto y permite limpiar. Los tests llaman a las funciones reales de validación sin consultar la API.</w:t>
       </w:r>
     </w:p>
     <w:p>
       <w:pPr>
-        <w:pStyle w:val="Heading1"/>
+        <w:pStyle w:val="Ttulo1"/>
         <w:spacing w:after="80"/>
         <w:keepNext/>
       </w:pPr>
       <w:r>
         <w:rPr>
+          <w:rFonts w:ascii="Calibri" w:hAnsi="Calibri"/>
           <w:b w:val="1"/>
-          <w:sz w:val="26"/>
+          <w:color w:val="000000"/>
         </w:rPr>
         <w:t>6 Restricciones</w:t>
       </w:r>
@@ -1314,7 +2330,7 @@
         <w:spacing w:after="80"/>
       </w:pPr>
       <w:r>
-        <w:t>• El formulario simula una solicitud y no envía correos ni confirma horas reales.</w:t>
+        <w:t>El formulario valida datos y muestra «Datos válidos. Clínica ficticia.». No guarda solicitudes, envía correos, reserva horas ni modifica los datos de la API.</w:t>
       </w:r>
     </w:p>
     <w:p>
@@ -1323,7 +2339,7 @@
         <w:spacing w:after="80"/>
       </w:pPr>
       <w:r>
-        <w:t>• La API es local y simulada; no existe una base de datos persistente.</w:t>
+        <w:t>La API se ejecuta localmente en 127.0.0.1:3001. Solo permite consultar tratamientos; no existe una base de datos de reservas ni un servidor de producción configurado.</w:t>
       </w:r>
     </w:p>
     <w:p>
@@ -1332,7 +2348,7 @@
         <w:ind w:left="360" w:hanging="259"/>
       </w:pPr>
       <w:r>
-        <w:t>• Los precios son referenciales y el contenido audiovisual puede requerir conexión a Internet.</w:t>
+        <w:t>Los datos de contacto, ubicación y precios son ficticios o referenciales. El video educativo requiere conexión a Internet. La lista de tratamientos se carga desde la API y necesita que ese servidor esté encendido.</w:t>
       </w:r>
     </w:p>
     <w:p>
@@ -1341,7 +2357,7 @@
         <w:ind w:left="360" w:hanging="259"/>
       </w:pPr>
       <w:r>
-        <w:t>• La cobertura mide el TypeScript/TSX de app, components, hooks, data y services, incluidos módulos no ejecutados con contadores en cero. Excluye las pruebas, CSS, recursos, tipos y el servidor de la API. Los resultados están en INFORME-TESTING.md y docs/evidencia-cobertura.json.</w:t>
+        <w:t>No se utilizan mocks ni herramientas de cobertura. No hay porcentajes vigentes de cobertura y no se afirma que las cinco pruebas comprueben toda la aplicación. El detalle está en INFORME-TESTING.md y docs/PRUEBAS.md.</w:t>
       </w:r>
     </w:p>
     <w:p>
@@ -1350,20 +2366,21 @@
         <w:spacing w:after="80"/>
       </w:pPr>
       <w:r>
-        <w:t>• Se utiliza CSS nativo. La pauta exige Bootstrap: esta diferencia permanece pendiente y no se presenta como cumplimiento de ese requisito.</w:t>
+        <w:t>Se utiliza CSS propio y cinco pruebas con QUnit. La pauta principal solicita Bootstrap y pruebas con Jasmine/Karma, además de evidencias de mocks y cobertura; estas diferencias siguen pendientes de resolver o acordar con el docente. No se consideran aprobadas por el solo hecho de actualizar este documento.</w:t>
       </w:r>
     </w:p>
     <w:p>
       <w:pPr>
         <w:spacing w:after="80"/>
         <w:ind w:left="360" w:hanging="259"/>
-        <w:pStyle w:val="Heading1"/>
+        <w:pStyle w:val="Ttulo1"/>
         <w:keepNext/>
       </w:pPr>
       <w:r>
         <w:rPr>
+          <w:rFonts w:ascii="Calibri" w:hAnsi="Calibri"/>
           <w:b w:val="1"/>
-          <w:sz w:val="26"/>
+          <w:color w:val="000000"/>
         </w:rPr>
         <w:t>7 Mejoras futuras</w:t>
       </w:r>
@@ -1390,13 +2407,14 @@
     <w:p>
       <w:pPr>
         <w:spacing w:after="80"/>
-        <w:pStyle w:val="Heading1"/>
+        <w:pStyle w:val="Ttulo1"/>
         <w:keepNext/>
       </w:pPr>
       <w:r>
         <w:rPr>
+          <w:rFonts w:ascii="Calibri" w:hAnsi="Calibri"/>
           <w:b w:val="1"/>
-          <w:sz w:val="26"/>
+          <w:color w:val="000000"/>
         </w:rPr>
         <w:t>8 Pruebas y verificación</w:t>
       </w:r>
@@ -1407,7 +2425,7 @@
         <w:pStyle w:val="Normal"/>
       </w:pPr>
       <w:r>
-        <w:t>Se mantienen diez pruebas con Jasmine y Karma: cuatro de validaciones, cuatro de catálogo y dos de formulario. Los mocks simulan tratamientos disponibles, lista vacía y error HTTP. Estos casos no sustituyen una revisión completa de accesibilidad ni prueban el servidor real.</w:t>
+        <w:t>La suite contiene cinco pruebas de QUnit en cuatro archivos: nombre, dígito verificador de RUT, formatos de RUT, correo y servicio. Son 21 comprobaciones sobre funciones reales de services/validacionesReserva.js. npm test ejecuta la suite y termina; npm run test:watch la repite al guardar. npm run test:web inicia un servidor local de resultados en http://127.0.0.1:4000/tests/index.html, con los mismos casos y sin depender de Next.js, de la API ni de un CDN.</w:t>
       </w:r>
     </w:p>
     <w:p>
@@ -1416,12 +2434,599 @@
         <w:pStyle w:val="Normal"/>
       </w:pPr>
       <w:r>
-        <w:t>La evidencia del 24 de octubre de 2026 registra diez pruebas exitosas y cero fallidas. La cobertura sobre 29 archivos de aplicación es 73,79 % de líneas, 76,60 % de sentencias, 85,84 % de ramas y 64,91 % de funciones. TypeScript finalizó correctamente en esta medición; la compilación se verificó previamente en el paso 23. Los resultados no equivalen a cobertura total ni a una nota académica.</w:t>
+        <w:t>La verificación del 27 de octubre de 2026 registra cinco pruebas exitosas y cero fallidas en la terminal. La ejecución en navegador de esta misma suite también se verificó con cinco casos aprobados y sin errores de JavaScript. La compilación de producción con npm run build terminó correctamente. Las revisiones manuales previas de navegación, catálogo, selección, validación, limpieza y API apagada complementan la suite; no son pruebas automáticas de QUnit ni una medición de cobertura.</w:t>
+      </w:r>
+    </w:p>
+    <w:p>
+      <w:pPr>
+        <w:pStyle w:val="Ttulo1"/>
+      </w:pPr>
+      <w:r>
+        <w:rPr>
+          <w:rFonts w:ascii="Calibri" w:hAnsi="Calibri"/>
+          <w:color w:val="000000"/>
+        </w:rPr>
+        <w:t>9 Ejecución local y documentación</w:t>
+      </w:r>
+    </w:p>
+    <w:p>
+      <w:r>
+        <w:t>Los comandos se ejecutan desde la carpeta que contiene package.json. Si el proyecto descargado incluye otra carpeta con el mismo nombre, se debe entrar a esa carpeta antes de ejecutar npm.</w:t>
+      </w:r>
+    </w:p>
+    <w:tbl>
+      <w:tblPr>
+        <w:tblW w:type="auto" w:w="0"/>
+        <w:tblLayout w:type="fixed"/>
+        <w:tblLook w:firstColumn="1" w:firstRow="1" w:lastColumn="0" w:lastRow="0" w:noHBand="0" w:noVBand="1" w:val="04A0"/>
+      </w:tblPr>
+      <w:tblGrid>
+        <w:gridCol w:w="2268"/>
+        <w:gridCol w:w="7087"/>
+      </w:tblGrid>
+      <w:tr>
+        <w:trPr>
+          <w:tblHeader/>
+          <w:cantSplit/>
+        </w:trPr>
+        <w:tc>
+          <w:tcPr>
+            <w:tcW w:type="dxa" w:w="2268"/>
+            <w:vAlign w:val="center"/>
+            <w:tcMar>
+              <w:top w:w="90" w:type="dxa"/>
+              <w:left w:w="90" w:type="dxa"/>
+              <w:bottom w:w="90" w:type="dxa"/>
+              <w:right w:w="90" w:type="dxa"/>
+            </w:tcMar>
+            <w:tcBorders>
+              <w:top w:val="single" w:sz="4" w:color="D9D9D9"/>
+              <w:left w:val="single" w:sz="4" w:color="D9D9D9"/>
+              <w:bottom w:val="single" w:sz="4" w:color="D9D9D9"/>
+              <w:right w:val="single" w:sz="4" w:color="D9D9D9"/>
+            </w:tcBorders>
+            <w:shd w:fill="E7E6E6"/>
+          </w:tcPr>
+          <w:p>
+            <w:pPr>
+              <w:keepNext/>
+              <w:spacing w:after="60" w:before="60"/>
+            </w:pPr>
+            <w:r>
+              <w:rPr>
+                <w:b/>
+                <w:color w:val="000000"/>
+                <w:sz w:val="20"/>
+              </w:rPr>
+              <w:t>Comando</w:t>
+            </w:r>
+          </w:p>
+        </w:tc>
+        <w:tc>
+          <w:tcPr>
+            <w:tcW w:type="dxa" w:w="7087"/>
+            <w:vAlign w:val="center"/>
+            <w:tcMar>
+              <w:top w:w="90" w:type="dxa"/>
+              <w:left w:w="90" w:type="dxa"/>
+              <w:bottom w:w="90" w:type="dxa"/>
+              <w:right w:w="90" w:type="dxa"/>
+            </w:tcMar>
+            <w:tcBorders>
+              <w:top w:val="single" w:sz="4" w:color="D9D9D9"/>
+              <w:left w:val="single" w:sz="4" w:color="D9D9D9"/>
+              <w:bottom w:val="single" w:sz="4" w:color="D9D9D9"/>
+              <w:right w:val="single" w:sz="4" w:color="D9D9D9"/>
+            </w:tcBorders>
+            <w:shd w:fill="E7E6E6"/>
+          </w:tcPr>
+          <w:p>
+            <w:pPr>
+              <w:keepNext/>
+              <w:spacing w:after="60" w:before="60"/>
+            </w:pPr>
+            <w:r>
+              <w:rPr>
+                <w:b/>
+                <w:color w:val="000000"/>
+                <w:sz w:val="20"/>
+              </w:rPr>
+              <w:t>Función</w:t>
+            </w:r>
+          </w:p>
+        </w:tc>
+      </w:tr>
+      <w:tr>
+        <w:trPr>
+          <w:cantSplit/>
+        </w:trPr>
+        <w:tc>
+          <w:tcPr>
+            <w:tcW w:type="dxa" w:w="2268"/>
+            <w:vAlign w:val="center"/>
+            <w:tcMar>
+              <w:top w:w="90" w:type="dxa"/>
+              <w:left w:w="90" w:type="dxa"/>
+              <w:bottom w:w="90" w:type="dxa"/>
+              <w:right w:w="90" w:type="dxa"/>
+            </w:tcMar>
+            <w:tcBorders>
+              <w:top w:val="single" w:sz="4" w:color="D9D9D9"/>
+              <w:left w:val="single" w:sz="4" w:color="D9D9D9"/>
+              <w:bottom w:val="single" w:sz="4" w:color="D9D9D9"/>
+              <w:right w:val="single" w:sz="4" w:color="D9D9D9"/>
+            </w:tcBorders>
+          </w:tcPr>
+          <w:p>
+            <w:pPr>
+              <w:spacing w:after="60" w:before="60"/>
+            </w:pPr>
+            <w:r>
+              <w:rPr>
+                <w:b w:val="0"/>
+                <w:color w:val="000000"/>
+                <w:sz w:val="20"/>
+              </w:rPr>
+              <w:t>npm install</w:t>
+            </w:r>
+          </w:p>
+        </w:tc>
+        <w:tc>
+          <w:tcPr>
+            <w:tcW w:type="dxa" w:w="7087"/>
+            <w:vAlign w:val="center"/>
+            <w:tcMar>
+              <w:top w:w="90" w:type="dxa"/>
+              <w:left w:w="90" w:type="dxa"/>
+              <w:bottom w:w="90" w:type="dxa"/>
+              <w:right w:w="90" w:type="dxa"/>
+            </w:tcMar>
+            <w:tcBorders>
+              <w:top w:val="single" w:sz="4" w:color="D9D9D9"/>
+              <w:left w:val="single" w:sz="4" w:color="D9D9D9"/>
+              <w:bottom w:val="single" w:sz="4" w:color="D9D9D9"/>
+              <w:right w:val="single" w:sz="4" w:color="D9D9D9"/>
+            </w:tcBorders>
+          </w:tcPr>
+          <w:p>
+            <w:pPr>
+              <w:spacing w:after="60" w:before="60"/>
+            </w:pPr>
+            <w:r>
+              <w:rPr>
+                <w:b w:val="0"/>
+                <w:color w:val="000000"/>
+                <w:sz w:val="20"/>
+              </w:rPr>
+              <w:t>Instalar las dependencias del proyecto.</w:t>
+            </w:r>
+          </w:p>
+        </w:tc>
+      </w:tr>
+      <w:tr>
+        <w:trPr>
+          <w:cantSplit/>
+        </w:trPr>
+        <w:tc>
+          <w:tcPr>
+            <w:tcW w:type="dxa" w:w="2268"/>
+            <w:vAlign w:val="center"/>
+            <w:tcMar>
+              <w:top w:w="90" w:type="dxa"/>
+              <w:left w:w="90" w:type="dxa"/>
+              <w:bottom w:w="90" w:type="dxa"/>
+              <w:right w:w="90" w:type="dxa"/>
+            </w:tcMar>
+            <w:tcBorders>
+              <w:top w:val="single" w:sz="4" w:color="D9D9D9"/>
+              <w:left w:val="single" w:sz="4" w:color="D9D9D9"/>
+              <w:bottom w:val="single" w:sz="4" w:color="D9D9D9"/>
+              <w:right w:val="single" w:sz="4" w:color="D9D9D9"/>
+            </w:tcBorders>
+          </w:tcPr>
+          <w:p>
+            <w:pPr>
+              <w:spacing w:after="60" w:before="60"/>
+            </w:pPr>
+            <w:r>
+              <w:rPr>
+                <w:b w:val="0"/>
+                <w:color w:val="000000"/>
+                <w:sz w:val="20"/>
+              </w:rPr>
+              <w:t>npm run api</w:t>
+            </w:r>
+          </w:p>
+        </w:tc>
+        <w:tc>
+          <w:tcPr>
+            <w:tcW w:type="dxa" w:w="7087"/>
+            <w:vAlign w:val="center"/>
+            <w:tcMar>
+              <w:top w:w="90" w:type="dxa"/>
+              <w:left w:w="90" w:type="dxa"/>
+              <w:bottom w:w="90" w:type="dxa"/>
+              <w:right w:w="90" w:type="dxa"/>
+            </w:tcMar>
+            <w:tcBorders>
+              <w:top w:val="single" w:sz="4" w:color="D9D9D9"/>
+              <w:left w:val="single" w:sz="4" w:color="D9D9D9"/>
+              <w:bottom w:val="single" w:sz="4" w:color="D9D9D9"/>
+              <w:right w:val="single" w:sz="4" w:color="D9D9D9"/>
+            </w:tcBorders>
+          </w:tcPr>
+          <w:p>
+            <w:pPr>
+              <w:spacing w:after="60" w:before="60"/>
+            </w:pPr>
+            <w:r>
+              <w:rPr>
+                <w:b w:val="0"/>
+                <w:color w:val="000000"/>
+                <w:sz w:val="20"/>
+              </w:rPr>
+              <w:t>Iniciar la API en http://127.0.0.1:3001/tratamientos.</w:t>
+            </w:r>
+          </w:p>
+        </w:tc>
+      </w:tr>
+      <w:tr>
+        <w:trPr>
+          <w:cantSplit/>
+        </w:trPr>
+        <w:tc>
+          <w:tcPr>
+            <w:tcW w:type="dxa" w:w="2268"/>
+            <w:vAlign w:val="center"/>
+            <w:tcMar>
+              <w:top w:w="90" w:type="dxa"/>
+              <w:left w:w="90" w:type="dxa"/>
+              <w:bottom w:w="90" w:type="dxa"/>
+              <w:right w:w="90" w:type="dxa"/>
+            </w:tcMar>
+            <w:tcBorders>
+              <w:top w:val="single" w:sz="4" w:color="D9D9D9"/>
+              <w:left w:val="single" w:sz="4" w:color="D9D9D9"/>
+              <w:bottom w:val="single" w:sz="4" w:color="D9D9D9"/>
+              <w:right w:val="single" w:sz="4" w:color="D9D9D9"/>
+            </w:tcBorders>
+          </w:tcPr>
+          <w:p>
+            <w:pPr>
+              <w:spacing w:after="60" w:before="60"/>
+            </w:pPr>
+            <w:r>
+              <w:rPr>
+                <w:b w:val="0"/>
+                <w:color w:val="000000"/>
+                <w:sz w:val="20"/>
+              </w:rPr>
+              <w:t>npm run dev</w:t>
+            </w:r>
+          </w:p>
+        </w:tc>
+        <w:tc>
+          <w:tcPr>
+            <w:tcW w:type="dxa" w:w="7087"/>
+            <w:vAlign w:val="center"/>
+            <w:tcMar>
+              <w:top w:w="90" w:type="dxa"/>
+              <w:left w:w="90" w:type="dxa"/>
+              <w:bottom w:w="90" w:type="dxa"/>
+              <w:right w:w="90" w:type="dxa"/>
+            </w:tcMar>
+            <w:tcBorders>
+              <w:top w:val="single" w:sz="4" w:color="D9D9D9"/>
+              <w:left w:val="single" w:sz="4" w:color="D9D9D9"/>
+              <w:bottom w:val="single" w:sz="4" w:color="D9D9D9"/>
+              <w:right w:val="single" w:sz="4" w:color="D9D9D9"/>
+            </w:tcBorders>
+          </w:tcPr>
+          <w:p>
+            <w:pPr>
+              <w:spacing w:after="60" w:before="60"/>
+            </w:pPr>
+            <w:r>
+              <w:rPr>
+                <w:b w:val="0"/>
+                <w:color w:val="000000"/>
+                <w:sz w:val="20"/>
+              </w:rPr>
+              <w:t>Iniciar el sitio en http://localhost:3000, en otra terminal.</w:t>
+            </w:r>
+          </w:p>
+        </w:tc>
+      </w:tr>
+      <w:tr>
+        <w:trPr>
+          <w:cantSplit/>
+        </w:trPr>
+        <w:tc>
+          <w:tcPr>
+            <w:tcW w:type="dxa" w:w="2268"/>
+            <w:vAlign w:val="center"/>
+            <w:tcMar>
+              <w:top w:w="90" w:type="dxa"/>
+              <w:left w:w="90" w:type="dxa"/>
+              <w:bottom w:w="90" w:type="dxa"/>
+              <w:right w:w="90" w:type="dxa"/>
+            </w:tcMar>
+            <w:tcBorders>
+              <w:top w:val="single" w:sz="4" w:color="D9D9D9"/>
+              <w:left w:val="single" w:sz="4" w:color="D9D9D9"/>
+              <w:bottom w:val="single" w:sz="4" w:color="D9D9D9"/>
+              <w:right w:val="single" w:sz="4" w:color="D9D9D9"/>
+            </w:tcBorders>
+          </w:tcPr>
+          <w:p>
+            <w:pPr>
+              <w:spacing w:after="60" w:before="60"/>
+            </w:pPr>
+            <w:r>
+              <w:rPr>
+                <w:b w:val="0"/>
+                <w:color w:val="000000"/>
+                <w:sz w:val="20"/>
+              </w:rPr>
+              <w:t>npm test</w:t>
+            </w:r>
+          </w:p>
+        </w:tc>
+        <w:tc>
+          <w:tcPr>
+            <w:tcW w:type="dxa" w:w="7087"/>
+            <w:vAlign w:val="center"/>
+            <w:tcMar>
+              <w:top w:w="90" w:type="dxa"/>
+              <w:left w:w="90" w:type="dxa"/>
+              <w:bottom w:w="90" w:type="dxa"/>
+              <w:right w:w="90" w:type="dxa"/>
+            </w:tcMar>
+            <w:tcBorders>
+              <w:top w:val="single" w:sz="4" w:color="D9D9D9"/>
+              <w:left w:val="single" w:sz="4" w:color="D9D9D9"/>
+              <w:bottom w:val="single" w:sz="4" w:color="D9D9D9"/>
+              <w:right w:val="single" w:sz="4" w:color="D9D9D9"/>
+            </w:tcBorders>
+          </w:tcPr>
+          <w:p>
+            <w:pPr>
+              <w:spacing w:after="60" w:before="60"/>
+            </w:pPr>
+            <w:r>
+              <w:rPr>
+                <w:b w:val="0"/>
+                <w:color w:val="000000"/>
+                <w:sz w:val="20"/>
+              </w:rPr>
+              <w:t>Ejecutar las cinco pruebas en la terminal.</w:t>
+            </w:r>
+          </w:p>
+        </w:tc>
+      </w:tr>
+      <w:tr>
+        <w:trPr>
+          <w:cantSplit/>
+        </w:trPr>
+        <w:tc>
+          <w:tcPr>
+            <w:tcW w:type="dxa" w:w="2268"/>
+            <w:vAlign w:val="center"/>
+            <w:tcMar>
+              <w:top w:w="90" w:type="dxa"/>
+              <w:left w:w="90" w:type="dxa"/>
+              <w:bottom w:w="90" w:type="dxa"/>
+              <w:right w:w="90" w:type="dxa"/>
+            </w:tcMar>
+            <w:tcBorders>
+              <w:top w:val="single" w:sz="4" w:color="D9D9D9"/>
+              <w:left w:val="single" w:sz="4" w:color="D9D9D9"/>
+              <w:bottom w:val="single" w:sz="4" w:color="D9D9D9"/>
+              <w:right w:val="single" w:sz="4" w:color="D9D9D9"/>
+            </w:tcBorders>
+          </w:tcPr>
+          <w:p>
+            <w:pPr>
+              <w:spacing w:after="60" w:before="60"/>
+            </w:pPr>
+            <w:r>
+              <w:rPr>
+                <w:b w:val="0"/>
+                <w:color w:val="000000"/>
+                <w:sz w:val="20"/>
+              </w:rPr>
+              <w:t>npm run test:web</w:t>
+            </w:r>
+          </w:p>
+        </w:tc>
+        <w:tc>
+          <w:tcPr>
+            <w:tcW w:type="dxa" w:w="7087"/>
+            <w:vAlign w:val="center"/>
+            <w:tcMar>
+              <w:top w:w="90" w:type="dxa"/>
+              <w:left w:w="90" w:type="dxa"/>
+              <w:bottom w:w="90" w:type="dxa"/>
+              <w:right w:w="90" w:type="dxa"/>
+            </w:tcMar>
+            <w:tcBorders>
+              <w:top w:val="single" w:sz="4" w:color="D9D9D9"/>
+              <w:left w:val="single" w:sz="4" w:color="D9D9D9"/>
+              <w:bottom w:val="single" w:sz="4" w:color="D9D9D9"/>
+              <w:right w:val="single" w:sz="4" w:color="D9D9D9"/>
+            </w:tcBorders>
+          </w:tcPr>
+          <w:p>
+            <w:pPr>
+              <w:spacing w:after="60" w:before="60"/>
+            </w:pPr>
+            <w:r>
+              <w:rPr>
+                <w:b w:val="0"/>
+                <w:color w:val="000000"/>
+                <w:sz w:val="20"/>
+              </w:rPr>
+              <w:t>Abrir los resultados QUnit en http://127.0.0.1:4000/tests/index.html.</w:t>
+            </w:r>
+          </w:p>
+        </w:tc>
+      </w:tr>
+      <w:tr>
+        <w:trPr>
+          <w:cantSplit/>
+        </w:trPr>
+        <w:tc>
+          <w:tcPr>
+            <w:tcW w:type="dxa" w:w="2268"/>
+            <w:vAlign w:val="center"/>
+            <w:tcMar>
+              <w:top w:w="90" w:type="dxa"/>
+              <w:left w:w="90" w:type="dxa"/>
+              <w:bottom w:w="90" w:type="dxa"/>
+              <w:right w:w="90" w:type="dxa"/>
+            </w:tcMar>
+            <w:tcBorders>
+              <w:top w:val="single" w:sz="4" w:color="D9D9D9"/>
+              <w:left w:val="single" w:sz="4" w:color="D9D9D9"/>
+              <w:bottom w:val="single" w:sz="4" w:color="D9D9D9"/>
+              <w:right w:val="single" w:sz="4" w:color="D9D9D9"/>
+            </w:tcBorders>
+          </w:tcPr>
+          <w:p>
+            <w:pPr>
+              <w:spacing w:after="60" w:before="60"/>
+            </w:pPr>
+            <w:r>
+              <w:rPr>
+                <w:b w:val="0"/>
+                <w:color w:val="000000"/>
+                <w:sz w:val="20"/>
+              </w:rPr>
+              <w:t>npm run build</w:t>
+            </w:r>
+          </w:p>
+        </w:tc>
+        <w:tc>
+          <w:tcPr>
+            <w:tcW w:type="dxa" w:w="7087"/>
+            <w:vAlign w:val="center"/>
+            <w:tcMar>
+              <w:top w:w="90" w:type="dxa"/>
+              <w:left w:w="90" w:type="dxa"/>
+              <w:bottom w:w="90" w:type="dxa"/>
+              <w:right w:w="90" w:type="dxa"/>
+            </w:tcMar>
+            <w:tcBorders>
+              <w:top w:val="single" w:sz="4" w:color="D9D9D9"/>
+              <w:left w:val="single" w:sz="4" w:color="D9D9D9"/>
+              <w:bottom w:val="single" w:sz="4" w:color="D9D9D9"/>
+              <w:right w:val="single" w:sz="4" w:color="D9D9D9"/>
+            </w:tcBorders>
+          </w:tcPr>
+          <w:p>
+            <w:pPr>
+              <w:spacing w:after="60" w:before="60"/>
+            </w:pPr>
+            <w:r>
+              <w:rPr>
+                <w:b w:val="0"/>
+                <w:color w:val="000000"/>
+                <w:sz w:val="20"/>
+              </w:rPr>
+              <w:t>Generar la compilación de producción.</w:t>
+            </w:r>
+          </w:p>
+        </w:tc>
+      </w:tr>
+      <w:tr>
+        <w:trPr>
+          <w:cantSplit/>
+        </w:trPr>
+        <w:tc>
+          <w:tcPr>
+            <w:tcW w:type="dxa" w:w="2268"/>
+            <w:vAlign w:val="center"/>
+            <w:tcMar>
+              <w:top w:w="90" w:type="dxa"/>
+              <w:left w:w="90" w:type="dxa"/>
+              <w:bottom w:w="90" w:type="dxa"/>
+              <w:right w:w="90" w:type="dxa"/>
+            </w:tcMar>
+            <w:tcBorders>
+              <w:top w:val="single" w:sz="4" w:color="D9D9D9"/>
+              <w:left w:val="single" w:sz="4" w:color="D9D9D9"/>
+              <w:bottom w:val="single" w:sz="4" w:color="D9D9D9"/>
+              <w:right w:val="single" w:sz="4" w:color="D9D9D9"/>
+            </w:tcBorders>
+          </w:tcPr>
+          <w:p>
+            <w:pPr>
+              <w:spacing w:after="60" w:before="60"/>
+            </w:pPr>
+            <w:r>
+              <w:rPr>
+                <w:b w:val="0"/>
+                <w:color w:val="000000"/>
+                <w:sz w:val="20"/>
+              </w:rPr>
+              <w:t>npm start</w:t>
+            </w:r>
+          </w:p>
+        </w:tc>
+        <w:tc>
+          <w:tcPr>
+            <w:tcW w:type="dxa" w:w="7087"/>
+            <w:vAlign w:val="center"/>
+            <w:tcMar>
+              <w:top w:w="90" w:type="dxa"/>
+              <w:left w:w="90" w:type="dxa"/>
+              <w:bottom w:w="90" w:type="dxa"/>
+              <w:right w:w="90" w:type="dxa"/>
+            </w:tcMar>
+            <w:tcBorders>
+              <w:top w:val="single" w:sz="4" w:color="D9D9D9"/>
+              <w:left w:val="single" w:sz="4" w:color="D9D9D9"/>
+              <w:bottom w:val="single" w:sz="4" w:color="D9D9D9"/>
+              <w:right w:val="single" w:sz="4" w:color="D9D9D9"/>
+            </w:tcBorders>
+          </w:tcPr>
+          <w:p>
+            <w:pPr>
+              <w:spacing w:after="60" w:before="60"/>
+            </w:pPr>
+            <w:r>
+              <w:rPr>
+                <w:b w:val="0"/>
+                <w:color w:val="000000"/>
+                <w:sz w:val="20"/>
+              </w:rPr>
+              <w:t>Servir la compilación ya generada; detener antes npm run dev si ocupa el puerto 3000.</w:t>
+            </w:r>
+          </w:p>
+        </w:tc>
+      </w:tr>
+    </w:tbl>
+    <w:p>
+      <w:pPr>
+        <w:spacing w:before="160"/>
+      </w:pPr>
+      <w:r>
+        <w:t>Mantener abiertas las terminales de los servidores y detenerlas con Ctrl+C. Si el puerto 4000 ya está ocupado por el servidor de pruebas, utilizar la instancia abierta o detenerla antes de iniciarlo otra vez.</w:t>
+      </w:r>
+    </w:p>
+    <w:p>
+      <w:r>
+        <w:t>README.md contiene la instalación y los comandos. INFORME-TESTING.md y docs/PRUEBAS.md detallan las pruebas. Los HTML originales y js/script.js se conservan como referencia de la versión anterior; la aplicación actual utiliza las páginas JSX y las validaciones de services.</w:t>
+      </w:r>
+    </w:p>
+    <w:p>
+      <w:r>
+        <w:t>Repositorio público: https://github.com/benjadiaz112/frontend-clinica-dental-facial</w:t>
       </w:r>
     </w:p>
     <w:sectPr>
       <w:pgSz w:w="12240" w:h="15840"/>
-      <w:pgMar w:top="792" w:right="1008" w:bottom="792" w:left="1008" w:header="708" w:footer="708" w:gutter="0"/>
+      <w:pgMar w:top="1134" w:right="1247" w:bottom="1134" w:left="1247" w:header="708" w:footer="708" w:gutter="0"/>
       <w:cols w:space="708"/>
       <w:docGrid w:linePitch="360"/>
     </w:sectPr>
@@ -1829,9 +3434,13 @@
   <w:style w:type="paragraph" w:default="1" w:styleId="Normal">
     <w:name w:val="Normal"/>
     <w:qFormat/>
+    <w:pPr>
+      <w:spacing w:after="120" w:line="259" w:lineRule="auto"/>
+    </w:pPr>
     <w:rPr>
-      <w:rFonts w:ascii="Arial" w:hAnsi="Arial"/>
-      <w:sz w:val="20"/>
+      <w:rFonts w:ascii="Calibri" w:hAnsi="Calibri"/>
+      <w:color w:val="000000"/>
+      <w:sz w:val="22"/>
     </w:rPr>
   </w:style>
   <w:style w:type="paragraph" w:styleId="Ttulo1">
@@ -1845,13 +3454,13 @@
     <w:pPr>
       <w:keepNext/>
       <w:keepLines/>
-      <w:spacing w:before="360" w:after="80"/>
+      <w:spacing w:before="240" w:after="120"/>
       <w:outlineLvl w:val="0"/>
     </w:pPr>
     <w:rPr>
-      <w:rFonts w:asciiTheme="majorHAnsi" w:eastAsiaTheme="majorEastAsia" w:hAnsiTheme="majorHAnsi" w:cstheme="majorBidi" w:ascii="Arial" w:hAnsi="Arial"/>
+      <w:rFonts w:asciiTheme="majorHAnsi" w:eastAsiaTheme="majorEastAsia" w:hAnsiTheme="majorHAnsi" w:cstheme="majorBidi" w:ascii="Calibri" w:hAnsi="Calibri"/>
       <w:color w:val="000000"/>
-      <w:sz w:val="40"/>
+      <w:sz w:val="30"/>
       <w:szCs w:val="40"/>
     </w:rPr>
   </w:style>
@@ -1868,13 +3477,13 @@
     <w:pPr>
       <w:keepNext/>
       <w:keepLines/>
-      <w:spacing w:before="160" w:after="80"/>
+      <w:spacing w:before="240" w:after="120"/>
       <w:outlineLvl w:val="1"/>
     </w:pPr>
     <w:rPr>
-      <w:rFonts w:asciiTheme="majorHAnsi" w:eastAsiaTheme="majorEastAsia" w:hAnsiTheme="majorHAnsi" w:cstheme="majorBidi" w:ascii="Arial" w:hAnsi="Arial"/>
+      <w:rFonts w:asciiTheme="majorHAnsi" w:eastAsiaTheme="majorEastAsia" w:hAnsiTheme="majorHAnsi" w:cstheme="majorBidi" w:ascii="Calibri" w:hAnsi="Calibri"/>
       <w:color w:val="000000"/>
-      <w:sz w:val="32"/>
+      <w:sz w:val="24"/>
       <w:szCs w:val="32"/>
     </w:rPr>
   </w:style>
@@ -2192,11 +3801,11 @@
       <w:contextualSpacing/>
     </w:pPr>
     <w:rPr>
-      <w:rFonts w:asciiTheme="majorHAnsi" w:eastAsiaTheme="majorEastAsia" w:hAnsiTheme="majorHAnsi" w:cstheme="majorBidi" w:ascii="Arial" w:hAnsi="Arial"/>
+      <w:rFonts w:asciiTheme="majorHAnsi" w:eastAsiaTheme="majorEastAsia" w:hAnsiTheme="majorHAnsi" w:cstheme="majorBidi" w:ascii="Calibri" w:hAnsi="Calibri"/>
       <w:color w:val="000000"/>
       <w:spacing w:val="-10"/>
       <w:kern w:val="28"/>
-      <w:sz w:val="56"/>
+      <w:sz w:val="48"/>
       <w:szCs w:val="56"/>
     </w:rPr>
   </w:style>
@@ -2228,8 +3837,8 @@
       </w:numPr>
     </w:pPr>
     <w:rPr>
-      <w:rFonts w:eastAsiaTheme="majorEastAsia" w:cstheme="majorBidi"/>
-      <w:color w:val="595959" w:themeColor="text1" w:themeTint="A6"/>
+      <w:rFonts w:eastAsiaTheme="majorEastAsia" w:cstheme="majorBidi" w:ascii="Calibri" w:hAnsi="Calibri"/>
+      <w:color w:val="000000"/>
       <w:spacing w:val="15"/>
       <w:sz w:val="28"/>
       <w:szCs w:val="28"/>

</xml_diff>